<commit_message>
v1.9.1: figures that explain themselves - "X of Y", the month's promises as one whole, attempts vs reached
Command Center:
- Rates say what they are out of where they are read (1,234 of 1,886;
  8,563 of 18,074; 604 of 879; 610 of 1,198). Counts come from the certified
  views; the two not stored are derived exactly and reconcile.
- Issue 1 tells the story of this month's 3,945 promises in words, with one
  bar of five parts (kept, broken, this week likely kept / at risk, later).
- The outlook under the banner is a plain sum with the real figures; "Data
  refreshed on" sits on its own line.
- "Contact attempts" and "reached" named separately; the over-contact issue
  headlines "4.5+ attempts" and describes groups averaging 4.5+.
- Observability panels show "Loading..." until their data arrives.

Docs: figures reference, client demo playbook, Word guide (new screenshots),
implementation and setup guides, README version.

Co-Authored-By: Claude Opus 5.5 <noreply@anthropic.com>
</commit_message>
<xml_diff>
--- a/docs/LensS_Collections_Product_and_Demo_Guide.docx
+++ b/docs/LensS_Collections_Product_and_Demo_Guide.docx
@@ -214,7 +214,7 @@
                 <w:sz w:val="20"/>
                 <w:szCs w:val="20"/>
               </w:rPr>
-              <w:t>v1.9.0 · October 2026</w:t>
+              <w:t>v1.9.1 · October 2026</w:t>
             </w:r>
           </w:p>
         </w:tc>
@@ -511,7 +511,7 @@
     <w:sdt>
       <w:sdtPr>
         <w:alias w:val="Contents"/>
-        <w:id w:val="48122014"/>
+        <w:id w:val="-1077440831"/>
       </w:sdtPr>
       <w:sdtEndPr/>
       <w:sdtContent>
@@ -538,7 +538,7 @@
           <w:r>
             <w:fldChar w:fldCharType="separate"/>
           </w:r>
-          <w:hyperlink w:anchor="_Toc242175352" w:history="1">
+          <w:hyperlink w:anchor="_Toc242180323" w:history="1">
             <w:r>
               <w:rPr>
                 <w:rStyle w:val="Hyperlink"/>
@@ -562,7 +562,7 @@
               <w:rPr>
                 <w:noProof/>
               </w:rPr>
-              <w:instrText xml:space="preserve"> PAGEREF _Toc242175352 \h </w:instrText>
+              <w:instrText xml:space="preserve"> PAGEREF _Toc242180323 \h </w:instrText>
             </w:r>
             <w:r>
               <w:rPr>
@@ -603,7 +603,7 @@
               <w:szCs w:val="22"/>
             </w:rPr>
           </w:pPr>
-          <w:hyperlink w:anchor="_Toc242175353" w:history="1">
+          <w:hyperlink w:anchor="_Toc242180324" w:history="1">
             <w:r>
               <w:rPr>
                 <w:rStyle w:val="Hyperlink"/>
@@ -627,7 +627,7 @@
               <w:rPr>
                 <w:noProof/>
               </w:rPr>
-              <w:instrText xml:space="preserve"> PAGEREF _Toc242175353 \h </w:instrText>
+              <w:instrText xml:space="preserve"> PAGEREF _Toc242180324 \h </w:instrText>
             </w:r>
             <w:r>
               <w:rPr>
@@ -668,7 +668,7 @@
               <w:szCs w:val="22"/>
             </w:rPr>
           </w:pPr>
-          <w:hyperlink w:anchor="_Toc242175354" w:history="1">
+          <w:hyperlink w:anchor="_Toc242180325" w:history="1">
             <w:r>
               <w:rPr>
                 <w:rStyle w:val="Hyperlink"/>
@@ -692,7 +692,7 @@
               <w:rPr>
                 <w:noProof/>
               </w:rPr>
-              <w:instrText xml:space="preserve"> PAGEREF _Toc242175354 \h </w:instrText>
+              <w:instrText xml:space="preserve"> PAGEREF _Toc242180325 \h </w:instrText>
             </w:r>
             <w:r>
               <w:rPr>
@@ -733,7 +733,7 @@
               <w:szCs w:val="22"/>
             </w:rPr>
           </w:pPr>
-          <w:hyperlink w:anchor="_Toc242175355" w:history="1">
+          <w:hyperlink w:anchor="_Toc242180326" w:history="1">
             <w:r>
               <w:rPr>
                 <w:rStyle w:val="Hyperlink"/>
@@ -757,7 +757,7 @@
               <w:rPr>
                 <w:noProof/>
               </w:rPr>
-              <w:instrText xml:space="preserve"> PAGEREF _Toc242175355 \h </w:instrText>
+              <w:instrText xml:space="preserve"> PAGEREF _Toc242180326 \h </w:instrText>
             </w:r>
             <w:r>
               <w:rPr>
@@ -798,7 +798,7 @@
               <w:szCs w:val="22"/>
             </w:rPr>
           </w:pPr>
-          <w:hyperlink w:anchor="_Toc242175356" w:history="1">
+          <w:hyperlink w:anchor="_Toc242180327" w:history="1">
             <w:r>
               <w:rPr>
                 <w:rStyle w:val="Hyperlink"/>
@@ -822,7 +822,7 @@
               <w:rPr>
                 <w:noProof/>
               </w:rPr>
-              <w:instrText xml:space="preserve"> PAGEREF _Toc242175356 \h </w:instrText>
+              <w:instrText xml:space="preserve"> PAGEREF _Toc242180327 \h </w:instrText>
             </w:r>
             <w:r>
               <w:rPr>
@@ -863,7 +863,7 @@
               <w:szCs w:val="22"/>
             </w:rPr>
           </w:pPr>
-          <w:hyperlink w:anchor="_Toc242175357" w:history="1">
+          <w:hyperlink w:anchor="_Toc242180328" w:history="1">
             <w:r>
               <w:rPr>
                 <w:rStyle w:val="Hyperlink"/>
@@ -887,7 +887,7 @@
               <w:rPr>
                 <w:noProof/>
               </w:rPr>
-              <w:instrText xml:space="preserve"> PAGEREF _Toc242175357 \h </w:instrText>
+              <w:instrText xml:space="preserve"> PAGEREF _Toc242180328 \h </w:instrText>
             </w:r>
             <w:r>
               <w:rPr>
@@ -928,7 +928,7 @@
               <w:szCs w:val="22"/>
             </w:rPr>
           </w:pPr>
-          <w:hyperlink w:anchor="_Toc242175358" w:history="1">
+          <w:hyperlink w:anchor="_Toc242180329" w:history="1">
             <w:r>
               <w:rPr>
                 <w:rStyle w:val="Hyperlink"/>
@@ -952,7 +952,7 @@
               <w:rPr>
                 <w:noProof/>
               </w:rPr>
-              <w:instrText xml:space="preserve"> PAGEREF _Toc242175358 \h </w:instrText>
+              <w:instrText xml:space="preserve"> PAGEREF _Toc242180329 \h </w:instrText>
             </w:r>
             <w:r>
               <w:rPr>
@@ -993,7 +993,7 @@
               <w:szCs w:val="22"/>
             </w:rPr>
           </w:pPr>
-          <w:hyperlink w:anchor="_Toc242175359" w:history="1">
+          <w:hyperlink w:anchor="_Toc242180330" w:history="1">
             <w:r>
               <w:rPr>
                 <w:rStyle w:val="Hyperlink"/>
@@ -1017,7 +1017,7 @@
               <w:rPr>
                 <w:noProof/>
               </w:rPr>
-              <w:instrText xml:space="preserve"> PAGEREF _Toc242175359 \h </w:instrText>
+              <w:instrText xml:space="preserve"> PAGEREF _Toc242180330 \h </w:instrText>
             </w:r>
             <w:r>
               <w:rPr>
@@ -1058,7 +1058,7 @@
               <w:szCs w:val="22"/>
             </w:rPr>
           </w:pPr>
-          <w:hyperlink w:anchor="_Toc242175360" w:history="1">
+          <w:hyperlink w:anchor="_Toc242180331" w:history="1">
             <w:r>
               <w:rPr>
                 <w:rStyle w:val="Hyperlink"/>
@@ -1082,7 +1082,7 @@
               <w:rPr>
                 <w:noProof/>
               </w:rPr>
-              <w:instrText xml:space="preserve"> PAGEREF _Toc242175360 \h </w:instrText>
+              <w:instrText xml:space="preserve"> PAGEREF _Toc242180331 \h </w:instrText>
             </w:r>
             <w:r>
               <w:rPr>
@@ -1123,7 +1123,7 @@
               <w:szCs w:val="22"/>
             </w:rPr>
           </w:pPr>
-          <w:hyperlink w:anchor="_Toc242175361" w:history="1">
+          <w:hyperlink w:anchor="_Toc242180332" w:history="1">
             <w:r>
               <w:rPr>
                 <w:rStyle w:val="Hyperlink"/>
@@ -1147,7 +1147,7 @@
               <w:rPr>
                 <w:noProof/>
               </w:rPr>
-              <w:instrText xml:space="preserve"> PAGEREF _Toc242175361 \h </w:instrText>
+              <w:instrText xml:space="preserve"> PAGEREF _Toc242180332 \h </w:instrText>
             </w:r>
             <w:r>
               <w:rPr>
@@ -1188,7 +1188,7 @@
               <w:szCs w:val="22"/>
             </w:rPr>
           </w:pPr>
-          <w:hyperlink w:anchor="_Toc242175362" w:history="1">
+          <w:hyperlink w:anchor="_Toc242180333" w:history="1">
             <w:r>
               <w:rPr>
                 <w:rStyle w:val="Hyperlink"/>
@@ -1212,7 +1212,7 @@
               <w:rPr>
                 <w:noProof/>
               </w:rPr>
-              <w:instrText xml:space="preserve"> PAGEREF _Toc242175362 \h </w:instrText>
+              <w:instrText xml:space="preserve"> PAGEREF _Toc242180333 \h </w:instrText>
             </w:r>
             <w:r>
               <w:rPr>
@@ -1253,7 +1253,7 @@
               <w:szCs w:val="22"/>
             </w:rPr>
           </w:pPr>
-          <w:hyperlink w:anchor="_Toc242175363" w:history="1">
+          <w:hyperlink w:anchor="_Toc242180334" w:history="1">
             <w:r>
               <w:rPr>
                 <w:rStyle w:val="Hyperlink"/>
@@ -1277,7 +1277,7 @@
               <w:rPr>
                 <w:noProof/>
               </w:rPr>
-              <w:instrText xml:space="preserve"> PAGEREF _Toc242175363 \h </w:instrText>
+              <w:instrText xml:space="preserve"> PAGEREF _Toc242180334 \h </w:instrText>
             </w:r>
             <w:r>
               <w:rPr>
@@ -1318,7 +1318,7 @@
               <w:szCs w:val="22"/>
             </w:rPr>
           </w:pPr>
-          <w:hyperlink w:anchor="_Toc242175364" w:history="1">
+          <w:hyperlink w:anchor="_Toc242180335" w:history="1">
             <w:r>
               <w:rPr>
                 <w:rStyle w:val="Hyperlink"/>
@@ -1342,7 +1342,7 @@
               <w:rPr>
                 <w:noProof/>
               </w:rPr>
-              <w:instrText xml:space="preserve"> PAGEREF _Toc242175364 \h </w:instrText>
+              <w:instrText xml:space="preserve"> PAGEREF _Toc242180335 \h </w:instrText>
             </w:r>
             <w:r>
               <w:rPr>
@@ -1383,7 +1383,7 @@
               <w:szCs w:val="22"/>
             </w:rPr>
           </w:pPr>
-          <w:hyperlink w:anchor="_Toc242175365" w:history="1">
+          <w:hyperlink w:anchor="_Toc242180336" w:history="1">
             <w:r>
               <w:rPr>
                 <w:rStyle w:val="Hyperlink"/>
@@ -1407,7 +1407,7 @@
               <w:rPr>
                 <w:noProof/>
               </w:rPr>
-              <w:instrText xml:space="preserve"> PAGEREF _Toc242175365 \h </w:instrText>
+              <w:instrText xml:space="preserve"> PAGEREF _Toc242180336 \h </w:instrText>
             </w:r>
             <w:r>
               <w:rPr>
@@ -1448,7 +1448,7 @@
               <w:szCs w:val="22"/>
             </w:rPr>
           </w:pPr>
-          <w:hyperlink w:anchor="_Toc242175366" w:history="1">
+          <w:hyperlink w:anchor="_Toc242180337" w:history="1">
             <w:r>
               <w:rPr>
                 <w:rStyle w:val="Hyperlink"/>
@@ -1472,7 +1472,7 @@
               <w:rPr>
                 <w:noProof/>
               </w:rPr>
-              <w:instrText xml:space="preserve"> PAGEREF _Toc242175366 \h </w:instrText>
+              <w:instrText xml:space="preserve"> PAGEREF _Toc242180337 \h </w:instrText>
             </w:r>
             <w:r>
               <w:rPr>
@@ -1513,7 +1513,7 @@
               <w:szCs w:val="22"/>
             </w:rPr>
           </w:pPr>
-          <w:hyperlink w:anchor="_Toc242175367" w:history="1">
+          <w:hyperlink w:anchor="_Toc242180338" w:history="1">
             <w:r>
               <w:rPr>
                 <w:rStyle w:val="Hyperlink"/>
@@ -1537,7 +1537,7 @@
               <w:rPr>
                 <w:noProof/>
               </w:rPr>
-              <w:instrText xml:space="preserve"> PAGEREF _Toc242175367 \h </w:instrText>
+              <w:instrText xml:space="preserve"> PAGEREF _Toc242180338 \h </w:instrText>
             </w:r>
             <w:r>
               <w:rPr>
@@ -1578,7 +1578,7 @@
               <w:szCs w:val="22"/>
             </w:rPr>
           </w:pPr>
-          <w:hyperlink w:anchor="_Toc242175368" w:history="1">
+          <w:hyperlink w:anchor="_Toc242180339" w:history="1">
             <w:r>
               <w:rPr>
                 <w:rStyle w:val="Hyperlink"/>
@@ -1602,7 +1602,7 @@
               <w:rPr>
                 <w:noProof/>
               </w:rPr>
-              <w:instrText xml:space="preserve"> PAGEREF _Toc242175368 \h </w:instrText>
+              <w:instrText xml:space="preserve"> PAGEREF _Toc242180339 \h </w:instrText>
             </w:r>
             <w:r>
               <w:rPr>
@@ -1643,7 +1643,7 @@
               <w:szCs w:val="22"/>
             </w:rPr>
           </w:pPr>
-          <w:hyperlink w:anchor="_Toc242175369" w:history="1">
+          <w:hyperlink w:anchor="_Toc242180340" w:history="1">
             <w:r>
               <w:rPr>
                 <w:rStyle w:val="Hyperlink"/>
@@ -1667,7 +1667,7 @@
               <w:rPr>
                 <w:noProof/>
               </w:rPr>
-              <w:instrText xml:space="preserve"> PAGEREF _Toc242175369 \h </w:instrText>
+              <w:instrText xml:space="preserve"> PAGEREF _Toc242180340 \h </w:instrText>
             </w:r>
             <w:r>
               <w:rPr>
@@ -1708,7 +1708,7 @@
               <w:szCs w:val="22"/>
             </w:rPr>
           </w:pPr>
-          <w:hyperlink w:anchor="_Toc242175370" w:history="1">
+          <w:hyperlink w:anchor="_Toc242180341" w:history="1">
             <w:r>
               <w:rPr>
                 <w:rStyle w:val="Hyperlink"/>
@@ -1732,7 +1732,7 @@
               <w:rPr>
                 <w:noProof/>
               </w:rPr>
-              <w:instrText xml:space="preserve"> PAGEREF _Toc242175370 \h </w:instrText>
+              <w:instrText xml:space="preserve"> PAGEREF _Toc242180341 \h </w:instrText>
             </w:r>
             <w:r>
               <w:rPr>
@@ -1773,7 +1773,7 @@
               <w:szCs w:val="22"/>
             </w:rPr>
           </w:pPr>
-          <w:hyperlink w:anchor="_Toc242175371" w:history="1">
+          <w:hyperlink w:anchor="_Toc242180342" w:history="1">
             <w:r>
               <w:rPr>
                 <w:rStyle w:val="Hyperlink"/>
@@ -1797,7 +1797,7 @@
               <w:rPr>
                 <w:noProof/>
               </w:rPr>
-              <w:instrText xml:space="preserve"> PAGEREF _Toc242175371 \h </w:instrText>
+              <w:instrText xml:space="preserve"> PAGEREF _Toc242180342 \h </w:instrText>
             </w:r>
             <w:r>
               <w:rPr>
@@ -1838,7 +1838,7 @@
               <w:szCs w:val="22"/>
             </w:rPr>
           </w:pPr>
-          <w:hyperlink w:anchor="_Toc242175372" w:history="1">
+          <w:hyperlink w:anchor="_Toc242180343" w:history="1">
             <w:r>
               <w:rPr>
                 <w:rStyle w:val="Hyperlink"/>
@@ -1862,7 +1862,7 @@
               <w:rPr>
                 <w:noProof/>
               </w:rPr>
-              <w:instrText xml:space="preserve"> PAGEREF _Toc242175372 \h </w:instrText>
+              <w:instrText xml:space="preserve"> PAGEREF _Toc242180343 \h </w:instrText>
             </w:r>
             <w:r>
               <w:rPr>
@@ -1903,7 +1903,7 @@
               <w:szCs w:val="22"/>
             </w:rPr>
           </w:pPr>
-          <w:hyperlink w:anchor="_Toc242175373" w:history="1">
+          <w:hyperlink w:anchor="_Toc242180344" w:history="1">
             <w:r>
               <w:rPr>
                 <w:rStyle w:val="Hyperlink"/>
@@ -1927,7 +1927,7 @@
               <w:rPr>
                 <w:noProof/>
               </w:rPr>
-              <w:instrText xml:space="preserve"> PAGEREF _Toc242175373 \h </w:instrText>
+              <w:instrText xml:space="preserve"> PAGEREF _Toc242180344 \h </w:instrText>
             </w:r>
             <w:r>
               <w:rPr>
@@ -1968,7 +1968,7 @@
               <w:szCs w:val="22"/>
             </w:rPr>
           </w:pPr>
-          <w:hyperlink w:anchor="_Toc242175374" w:history="1">
+          <w:hyperlink w:anchor="_Toc242180345" w:history="1">
             <w:r>
               <w:rPr>
                 <w:rStyle w:val="Hyperlink"/>
@@ -1992,7 +1992,7 @@
               <w:rPr>
                 <w:noProof/>
               </w:rPr>
-              <w:instrText xml:space="preserve"> PAGEREF _Toc242175374 \h </w:instrText>
+              <w:instrText xml:space="preserve"> PAGEREF _Toc242180345 \h </w:instrText>
             </w:r>
             <w:r>
               <w:rPr>
@@ -2033,7 +2033,7 @@
               <w:szCs w:val="22"/>
             </w:rPr>
           </w:pPr>
-          <w:hyperlink w:anchor="_Toc242175375" w:history="1">
+          <w:hyperlink w:anchor="_Toc242180346" w:history="1">
             <w:r>
               <w:rPr>
                 <w:rStyle w:val="Hyperlink"/>
@@ -2057,7 +2057,7 @@
               <w:rPr>
                 <w:noProof/>
               </w:rPr>
-              <w:instrText xml:space="preserve"> PAGEREF _Toc242175375 \h </w:instrText>
+              <w:instrText xml:space="preserve"> PAGEREF _Toc242180346 \h </w:instrText>
             </w:r>
             <w:r>
               <w:rPr>
@@ -2098,7 +2098,7 @@
               <w:szCs w:val="22"/>
             </w:rPr>
           </w:pPr>
-          <w:hyperlink w:anchor="_Toc242175376" w:history="1">
+          <w:hyperlink w:anchor="_Toc242180347" w:history="1">
             <w:r>
               <w:rPr>
                 <w:rStyle w:val="Hyperlink"/>
@@ -2122,7 +2122,7 @@
               <w:rPr>
                 <w:noProof/>
               </w:rPr>
-              <w:instrText xml:space="preserve"> PAGEREF _Toc242175376 \h </w:instrText>
+              <w:instrText xml:space="preserve"> PAGEREF _Toc242180347 \h </w:instrText>
             </w:r>
             <w:r>
               <w:rPr>
@@ -2163,7 +2163,7 @@
               <w:szCs w:val="22"/>
             </w:rPr>
           </w:pPr>
-          <w:hyperlink w:anchor="_Toc242175377" w:history="1">
+          <w:hyperlink w:anchor="_Toc242180348" w:history="1">
             <w:r>
               <w:rPr>
                 <w:rStyle w:val="Hyperlink"/>
@@ -2187,7 +2187,7 @@
               <w:rPr>
                 <w:noProof/>
               </w:rPr>
-              <w:instrText xml:space="preserve"> PAGEREF _Toc242175377 \h </w:instrText>
+              <w:instrText xml:space="preserve"> PAGEREF _Toc242180348 \h </w:instrText>
             </w:r>
             <w:r>
               <w:rPr>
@@ -2228,7 +2228,7 @@
               <w:szCs w:val="22"/>
             </w:rPr>
           </w:pPr>
-          <w:hyperlink w:anchor="_Toc242175378" w:history="1">
+          <w:hyperlink w:anchor="_Toc242180349" w:history="1">
             <w:r>
               <w:rPr>
                 <w:rStyle w:val="Hyperlink"/>
@@ -2252,7 +2252,7 @@
               <w:rPr>
                 <w:noProof/>
               </w:rPr>
-              <w:instrText xml:space="preserve"> PAGEREF _Toc242175378 \h </w:instrText>
+              <w:instrText xml:space="preserve"> PAGEREF _Toc242180349 \h </w:instrText>
             </w:r>
             <w:r>
               <w:rPr>
@@ -2293,7 +2293,7 @@
               <w:szCs w:val="22"/>
             </w:rPr>
           </w:pPr>
-          <w:hyperlink w:anchor="_Toc242175379" w:history="1">
+          <w:hyperlink w:anchor="_Toc242180350" w:history="1">
             <w:r>
               <w:rPr>
                 <w:rStyle w:val="Hyperlink"/>
@@ -2317,7 +2317,7 @@
               <w:rPr>
                 <w:noProof/>
               </w:rPr>
-              <w:instrText xml:space="preserve"> PAGEREF _Toc242175379 \h </w:instrText>
+              <w:instrText xml:space="preserve"> PAGEREF _Toc242180350 \h </w:instrText>
             </w:r>
             <w:r>
               <w:rPr>
@@ -2358,7 +2358,7 @@
               <w:szCs w:val="22"/>
             </w:rPr>
           </w:pPr>
-          <w:hyperlink w:anchor="_Toc242175380" w:history="1">
+          <w:hyperlink w:anchor="_Toc242180351" w:history="1">
             <w:r>
               <w:rPr>
                 <w:rStyle w:val="Hyperlink"/>
@@ -2382,7 +2382,7 @@
               <w:rPr>
                 <w:noProof/>
               </w:rPr>
-              <w:instrText xml:space="preserve"> PAGEREF _Toc242175380 \h </w:instrText>
+              <w:instrText xml:space="preserve"> PAGEREF _Toc242180351 \h </w:instrText>
             </w:r>
             <w:r>
               <w:rPr>
@@ -2423,7 +2423,7 @@
               <w:szCs w:val="22"/>
             </w:rPr>
           </w:pPr>
-          <w:hyperlink w:anchor="_Toc242175381" w:history="1">
+          <w:hyperlink w:anchor="_Toc242180352" w:history="1">
             <w:r>
               <w:rPr>
                 <w:rStyle w:val="Hyperlink"/>
@@ -2447,7 +2447,7 @@
               <w:rPr>
                 <w:noProof/>
               </w:rPr>
-              <w:instrText xml:space="preserve"> PAGEREF _Toc242175381 \h </w:instrText>
+              <w:instrText xml:space="preserve"> PAGEREF _Toc242180352 \h </w:instrText>
             </w:r>
             <w:r>
               <w:rPr>
@@ -2488,7 +2488,7 @@
               <w:szCs w:val="22"/>
             </w:rPr>
           </w:pPr>
-          <w:hyperlink w:anchor="_Toc242175382" w:history="1">
+          <w:hyperlink w:anchor="_Toc242180353" w:history="1">
             <w:r>
               <w:rPr>
                 <w:rStyle w:val="Hyperlink"/>
@@ -2512,7 +2512,7 @@
               <w:rPr>
                 <w:noProof/>
               </w:rPr>
-              <w:instrText xml:space="preserve"> PAGEREF _Toc242175382 \h </w:instrText>
+              <w:instrText xml:space="preserve"> PAGEREF _Toc242180353 \h </w:instrText>
             </w:r>
             <w:r>
               <w:rPr>
@@ -2553,7 +2553,7 @@
               <w:szCs w:val="22"/>
             </w:rPr>
           </w:pPr>
-          <w:hyperlink w:anchor="_Toc242175383" w:history="1">
+          <w:hyperlink w:anchor="_Toc242180354" w:history="1">
             <w:r>
               <w:rPr>
                 <w:rStyle w:val="Hyperlink"/>
@@ -2577,7 +2577,7 @@
               <w:rPr>
                 <w:noProof/>
               </w:rPr>
-              <w:instrText xml:space="preserve"> PAGEREF _Toc242175383 \h </w:instrText>
+              <w:instrText xml:space="preserve"> PAGEREF _Toc242180354 \h </w:instrText>
             </w:r>
             <w:r>
               <w:rPr>
@@ -2618,7 +2618,7 @@
               <w:szCs w:val="22"/>
             </w:rPr>
           </w:pPr>
-          <w:hyperlink w:anchor="_Toc242175384" w:history="1">
+          <w:hyperlink w:anchor="_Toc242180355" w:history="1">
             <w:r>
               <w:rPr>
                 <w:rStyle w:val="Hyperlink"/>
@@ -2642,7 +2642,7 @@
               <w:rPr>
                 <w:noProof/>
               </w:rPr>
-              <w:instrText xml:space="preserve"> PAGEREF _Toc242175384 \h </w:instrText>
+              <w:instrText xml:space="preserve"> PAGEREF _Toc242180355 \h </w:instrText>
             </w:r>
             <w:r>
               <w:rPr>
@@ -2683,7 +2683,7 @@
               <w:szCs w:val="22"/>
             </w:rPr>
           </w:pPr>
-          <w:hyperlink w:anchor="_Toc242175385" w:history="1">
+          <w:hyperlink w:anchor="_Toc242180356" w:history="1">
             <w:r>
               <w:rPr>
                 <w:rStyle w:val="Hyperlink"/>
@@ -2707,7 +2707,7 @@
               <w:rPr>
                 <w:noProof/>
               </w:rPr>
-              <w:instrText xml:space="preserve"> PAGEREF _Toc242175385 \h </w:instrText>
+              <w:instrText xml:space="preserve"> PAGEREF _Toc242180356 \h </w:instrText>
             </w:r>
             <w:r>
               <w:rPr>
@@ -2748,7 +2748,7 @@
               <w:szCs w:val="22"/>
             </w:rPr>
           </w:pPr>
-          <w:hyperlink w:anchor="_Toc242175386" w:history="1">
+          <w:hyperlink w:anchor="_Toc242180357" w:history="1">
             <w:r>
               <w:rPr>
                 <w:rStyle w:val="Hyperlink"/>
@@ -2772,7 +2772,7 @@
               <w:rPr>
                 <w:noProof/>
               </w:rPr>
-              <w:instrText xml:space="preserve"> PAGEREF _Toc242175386 \h </w:instrText>
+              <w:instrText xml:space="preserve"> PAGEREF _Toc242180357 \h </w:instrText>
             </w:r>
             <w:r>
               <w:rPr>
@@ -2813,7 +2813,7 @@
               <w:szCs w:val="22"/>
             </w:rPr>
           </w:pPr>
-          <w:hyperlink w:anchor="_Toc242175387" w:history="1">
+          <w:hyperlink w:anchor="_Toc242180358" w:history="1">
             <w:r>
               <w:rPr>
                 <w:rStyle w:val="Hyperlink"/>
@@ -2837,7 +2837,7 @@
               <w:rPr>
                 <w:noProof/>
               </w:rPr>
-              <w:instrText xml:space="preserve"> PAGEREF _Toc242175387 \h </w:instrText>
+              <w:instrText xml:space="preserve"> PAGEREF _Toc242180358 \h </w:instrText>
             </w:r>
             <w:r>
               <w:rPr>
@@ -2878,7 +2878,7 @@
               <w:szCs w:val="22"/>
             </w:rPr>
           </w:pPr>
-          <w:hyperlink w:anchor="_Toc242175388" w:history="1">
+          <w:hyperlink w:anchor="_Toc242180359" w:history="1">
             <w:r>
               <w:rPr>
                 <w:rStyle w:val="Hyperlink"/>
@@ -2902,7 +2902,7 @@
               <w:rPr>
                 <w:noProof/>
               </w:rPr>
-              <w:instrText xml:space="preserve"> PAGEREF _Toc242175388 \h </w:instrText>
+              <w:instrText xml:space="preserve"> PAGEREF _Toc242180359 \h </w:instrText>
             </w:r>
             <w:r>
               <w:rPr>
@@ -2943,7 +2943,7 @@
               <w:szCs w:val="22"/>
             </w:rPr>
           </w:pPr>
-          <w:hyperlink w:anchor="_Toc242175389" w:history="1">
+          <w:hyperlink w:anchor="_Toc242180360" w:history="1">
             <w:r>
               <w:rPr>
                 <w:rStyle w:val="Hyperlink"/>
@@ -2967,7 +2967,7 @@
               <w:rPr>
                 <w:noProof/>
               </w:rPr>
-              <w:instrText xml:space="preserve"> PAGEREF _Toc242175389 \h </w:instrText>
+              <w:instrText xml:space="preserve"> PAGEREF _Toc242180360 \h </w:instrText>
             </w:r>
             <w:r>
               <w:rPr>
@@ -3006,7 +3006,7 @@
         <w:pStyle w:val="Heading1"/>
         <w:pageBreakBefore/>
       </w:pPr>
-      <w:bookmarkStart w:id="0" w:name="_Toc242175352"/>
+      <w:bookmarkStart w:id="0" w:name="_Toc242180323"/>
       <w:r>
         <w:lastRenderedPageBreak/>
         <w:t>1. About this guide</w:t>
@@ -3021,14 +3021,14 @@
         <w:t>This guide explains what LensS Collections Intelligence is, how it is built and why, what every part of the application shows, and how to demonstrate it to clients: a timed script, safe questions, prepared answers and the boundaries to respect. It describe</w:t>
       </w:r>
       <w:r>
-        <w:t>s version 1.9.</w:t>
+        <w:t>s version 1.9.1.</w:t>
       </w:r>
     </w:p>
     <w:p>
       <w:pPr>
         <w:pStyle w:val="Heading2"/>
       </w:pPr>
-      <w:bookmarkStart w:id="1" w:name="_Toc242175353"/>
+      <w:bookmarkStart w:id="1" w:name="_Toc242180324"/>
       <w:r>
         <w:t>How to use it</w:t>
       </w:r>
@@ -3763,7 +3763,7 @@
         <w:pStyle w:val="Heading1"/>
         <w:pageBreakBefore/>
       </w:pPr>
-      <w:bookmarkStart w:id="2" w:name="_Toc242175354"/>
+      <w:bookmarkStart w:id="2" w:name="_Toc242180325"/>
       <w:r>
         <w:lastRenderedPageBreak/>
         <w:t>2. Solution overview</w:t>
@@ -3774,7 +3774,7 @@
       <w:pPr>
         <w:pStyle w:val="Heading2"/>
       </w:pPr>
-      <w:bookmarkStart w:id="3" w:name="_Toc242175355"/>
+      <w:bookmarkStart w:id="3" w:name="_Toc242180326"/>
       <w:r>
         <w:t>The business problem</w:t>
       </w:r>
@@ -3795,7 +3795,7 @@
       <w:pPr>
         <w:pStyle w:val="Heading2"/>
       </w:pPr>
-      <w:bookmarkStart w:id="4" w:name="_Toc242175356"/>
+      <w:bookmarkStart w:id="4" w:name="_Toc242180327"/>
       <w:r>
         <w:t>What LensS does</w:t>
       </w:r>
@@ -4201,7 +4201,7 @@
       <w:pPr>
         <w:pStyle w:val="Heading2"/>
       </w:pPr>
-      <w:bookmarkStart w:id="5" w:name="_Toc242175357"/>
+      <w:bookmarkStart w:id="5" w:name="_Toc242180328"/>
       <w:r>
         <w:t>Use cases in scope</w:t>
       </w:r>
@@ -4643,7 +4643,7 @@
       <w:pPr>
         <w:pStyle w:val="Heading2"/>
       </w:pPr>
-      <w:bookmarkStart w:id="6" w:name="_Toc242175358"/>
+      <w:bookmarkStart w:id="6" w:name="_Toc242180329"/>
       <w:r>
         <w:t>Why it is different</w:t>
       </w:r>
@@ -4761,7 +4761,7 @@
         <w:pStyle w:val="Heading1"/>
         <w:pageBreakBefore/>
       </w:pPr>
-      <w:bookmarkStart w:id="7" w:name="_Toc242175359"/>
+      <w:bookmarkStart w:id="7" w:name="_Toc242180330"/>
       <w:r>
         <w:lastRenderedPageBreak/>
         <w:t>3. Architecture</w:t>
@@ -4792,7 +4792,7 @@
           <w:noProof/>
         </w:rPr>
         <w:drawing>
-          <wp:inline distT="0" distB="0" distL="0" distR="0" wp14:anchorId="0B0E74A6" wp14:editId="449DC2A5">
+          <wp:inline distT="0" distB="0" distL="0" distR="0" wp14:anchorId="4F699A53" wp14:editId="2152455C">
             <wp:extent cx="6096000" cy="2809875"/>
             <wp:effectExtent l="0" t="0" r="0" b="0"/>
             <wp:docPr id="1" name="diagram-arch.png" descr="Figure 1. Solution architecture" title="Figure 1. Solution architecture"/>
@@ -4851,7 +4851,7 @@
       <w:pPr>
         <w:pStyle w:val="Heading2"/>
       </w:pPr>
-      <w:bookmarkStart w:id="8" w:name="_Toc242175360"/>
+      <w:bookmarkStart w:id="8" w:name="_Toc242180331"/>
       <w:r>
         <w:t>Components and why they were chosen</w:t>
       </w:r>
@@ -6310,7 +6310,7 @@
       <w:pPr>
         <w:pStyle w:val="Heading2"/>
       </w:pPr>
-      <w:bookmarkStart w:id="9" w:name="_Toc242175361"/>
+      <w:bookmarkStart w:id="9" w:name="_Toc242180332"/>
       <w:r>
         <w:t>Security and access model</w:t>
       </w:r>
@@ -6417,7 +6417,7 @@
         <w:pStyle w:val="Heading1"/>
         <w:pageBreakBefore/>
       </w:pPr>
-      <w:bookmarkStart w:id="10" w:name="_Toc242175362"/>
+      <w:bookmarkStart w:id="10" w:name="_Toc242180333"/>
       <w:r>
         <w:lastRenderedPageBreak/>
         <w:t>4. Data foundation</w:t>
@@ -6428,7 +6428,7 @@
       <w:pPr>
         <w:pStyle w:val="Heading2"/>
       </w:pPr>
-      <w:bookmarkStart w:id="11" w:name="_Toc242175363"/>
+      <w:bookmarkStart w:id="11" w:name="_Toc242180334"/>
       <w:r>
         <w:t>The demo dataset</w:t>
       </w:r>
@@ -7132,7 +7132,7 @@
       <w:pPr>
         <w:pStyle w:val="Heading2"/>
       </w:pPr>
-      <w:bookmarkStart w:id="12" w:name="_Toc242175364"/>
+      <w:bookmarkStart w:id="12" w:name="_Toc242180335"/>
       <w:r>
         <w:t>Layered data design (medallion architecture)</w:t>
       </w:r>
@@ -7822,7 +7822,7 @@
       <w:pPr>
         <w:pStyle w:val="Heading2"/>
       </w:pPr>
-      <w:bookmarkStart w:id="13" w:name="_Toc242175365"/>
+      <w:bookmarkStart w:id="13" w:name="_Toc242180336"/>
       <w:r>
         <w:lastRenderedPageBreak/>
         <w:t>Metric views</w:t>
@@ -8181,7 +8181,7 @@
       <w:pPr>
         <w:pStyle w:val="Heading2"/>
       </w:pPr>
-      <w:bookmarkStart w:id="14" w:name="_Toc242175366"/>
+      <w:bookmarkStart w:id="14" w:name="_Toc242180337"/>
       <w:r>
         <w:t>Certified and Command Center views</w:t>
       </w:r>
@@ -8205,7 +8205,7 @@
       <w:pPr>
         <w:pStyle w:val="Heading2"/>
       </w:pPr>
-      <w:bookmarkStart w:id="15" w:name="_Toc242175367"/>
+      <w:bookmarkStart w:id="15" w:name="_Toc242180338"/>
       <w:r>
         <w:t>Business rules captured as data</w:t>
       </w:r>
@@ -8784,7 +8784,7 @@
         <w:pStyle w:val="Heading1"/>
         <w:pageBreakBefore/>
       </w:pPr>
-      <w:bookmarkStart w:id="16" w:name="_Toc242175368"/>
+      <w:bookmarkStart w:id="16" w:name="_Toc242180339"/>
       <w:r>
         <w:lastRenderedPageBreak/>
         <w:t>5. The AI and its safeguards</w:t>
@@ -8795,7 +8795,7 @@
       <w:pPr>
         <w:pStyle w:val="Heading2"/>
       </w:pPr>
-      <w:bookmarkStart w:id="17" w:name="_Toc242175369"/>
+      <w:bookmarkStart w:id="17" w:name="_Toc242180340"/>
       <w:r>
         <w:t>The LensS query engine (Genie)</w:t>
       </w:r>
@@ -9739,7 +9739,7 @@
       <w:pPr>
         <w:pStyle w:val="Heading2"/>
       </w:pPr>
-      <w:bookmarkStart w:id="18" w:name="_Toc242175370"/>
+      <w:bookmarkStart w:id="18" w:name="_Toc242180341"/>
       <w:r>
         <w:t>How a question is answered</w:t>
       </w:r>
@@ -9755,7 +9755,7 @@
           <w:noProof/>
         </w:rPr>
         <w:drawing>
-          <wp:inline distT="0" distB="0" distL="0" distR="0" wp14:anchorId="73411293" wp14:editId="22727B0E">
+          <wp:inline distT="0" distB="0" distL="0" distR="0" wp14:anchorId="6C3BA0C7" wp14:editId="4693E1A3">
             <wp:extent cx="6096000" cy="1543050"/>
             <wp:effectExtent l="0" t="0" r="0" b="0"/>
             <wp:docPr id="2" name="diagram-flow.png" descr="Figure 2. How a question is answered" title="Figure 2. How a question is answered"/>
@@ -9814,7 +9814,7 @@
       <w:pPr>
         <w:pStyle w:val="Heading2"/>
       </w:pPr>
-      <w:bookmarkStart w:id="19" w:name="_Toc242175371"/>
+      <w:bookmarkStart w:id="19" w:name="_Toc242180342"/>
       <w:r>
         <w:t>One assistant, wh</w:t>
       </w:r>
@@ -9913,7 +9913,7 @@
       <w:pPr>
         <w:pStyle w:val="Heading2"/>
       </w:pPr>
-      <w:bookmarkStart w:id="20" w:name="_Toc242175372"/>
+      <w:bookmarkStart w:id="20" w:name="_Toc242180343"/>
       <w:r>
         <w:lastRenderedPageBreak/>
         <w:t>Safeguards</w:t>
@@ -10462,7 +10462,7 @@
         <w:pStyle w:val="Heading1"/>
         <w:pageBreakBefore/>
       </w:pPr>
-      <w:bookmarkStart w:id="21" w:name="_Toc242175373"/>
+      <w:bookmarkStart w:id="21" w:name="_Toc242180344"/>
       <w:r>
         <w:lastRenderedPageBreak/>
         <w:t>6. The LensS application</w:t>
@@ -10481,7 +10481,7 @@
       <w:pPr>
         <w:pStyle w:val="Heading2"/>
       </w:pPr>
-      <w:bookmarkStart w:id="22" w:name="_Toc242175374"/>
+      <w:bookmarkStart w:id="22" w:name="_Toc242180345"/>
       <w:r>
         <w:t>6.1 Command Center: one story in five chapters</w:t>
       </w:r>
@@ -10529,7 +10529,7 @@
           <w:noProof/>
         </w:rPr>
         <w:drawing>
-          <wp:inline distT="0" distB="0" distL="0" distR="0" wp14:anchorId="1CE7800F" wp14:editId="78288D39">
+          <wp:inline distT="0" distB="0" distL="0" distR="0" wp14:anchorId="3244010F" wp14:editId="75E963EE">
             <wp:extent cx="5905500" cy="3695700"/>
             <wp:effectExtent l="0" t="0" r="0" b="0"/>
             <wp:docPr id="3" name="cc-1-on-track.png" descr="Figure 3. Chapter 1: the verdict, progress and month-end outlook" title="Figure 3. Chapter 1: the verdict, progress and month-end outlook"/>
@@ -10601,10 +10601,10 @@
         <w:t>Verdict:</w:t>
       </w:r>
       <w:r>
-        <w:t xml:space="preserve"> "We're on track to hit this month's target, but only if customers keep their promises: 65% of the promises already due were broken." It reads </w:t>
-      </w:r>
-      <w:r>
-        <w:t>"within reach" or "at risk" when the outlook is weaker.</w:t>
+        <w:t xml:space="preserve"> "We're on track to hit this month's target, but only if customers keep their promises: 65% of the promises already due were broken (1,234 of 1</w:t>
+      </w:r>
+      <w:r>
+        <w:t>,886)." It reads "within reach" or "at risk" when the outlook is weaker.</w:t>
       </w:r>
     </w:p>
     <w:p>
@@ -10644,10 +10644,10 @@
         <w:t>Tiles:</w:t>
       </w:r>
       <w:r>
-        <w:t xml:space="preserve"> still to collect ₹5.8M; expected from promises ₹30.3M (5.2× what we still need); month-end outlook ₹83.7M (141% of target); likelihoo</w:t>
-      </w:r>
-      <w:r>
-        <w:t>d High.</w:t>
+        <w:t xml:space="preserve"> still to collect ₹5.8M; expected from promises ₹30.3M (5.2× what we still need); month-end outlook ₹83.7M (141% of t</w:t>
+      </w:r>
+      <w:r>
+        <w:t>arget); likelihood High.</w:t>
       </w:r>
     </w:p>
     <w:p>
@@ -10664,10 +10664,13 @@
           <w:b/>
           <w:bCs/>
         </w:rPr>
-        <w:t>How the outlook is worked out:</w:t>
-      </w:r>
-      <w:r>
-        <w:t xml:space="preserve"> collected so far + promises due by month-end × the share of due promises kept so far. A pipeline view, not a forecast. Likelihood is High at ≥ 1.5× coverage, Medium at 1–1.5×, Low below 1×. </w:t>
+        <w:t>How the outlook is worked out</w:t>
+      </w:r>
+      <w:r>
+        <w:t xml:space="preserve"> (shown under the tiles): "₹53.4M collected so far + ₹30.3M expected from promises = ₹83.7M. The 2,059 promises still due this month (of 3,945 made) are worth ₹87.5M; so far 35% of the promises that fel</w:t>
+      </w:r>
+      <w:r>
+        <w:t xml:space="preserve">l due were kept, so we count 35% of that." Likelihood is High at ≥ 1.5× coverage, Medium at 1–1.5×, Low below 1×. </w:t>
       </w:r>
       <w:r>
         <w:rPr>
@@ -10677,10 +10680,7 @@
         <w:t>Data refreshed on</w:t>
       </w:r>
       <w:r>
-        <w:t xml:space="preserve"> shows whe</w:t>
-      </w:r>
-      <w:r>
-        <w:t>n the data was last loaded.</w:t>
+        <w:t xml:space="preserve"> shows when the data was last loaded.</w:t>
       </w:r>
     </w:p>
     <w:p>
@@ -10702,8 +10702,8 @@
           <w:noProof/>
         </w:rPr>
         <w:drawing>
-          <wp:inline distT="0" distB="0" distL="0" distR="0" wp14:anchorId="46BEB260" wp14:editId="1CCDF1A8">
-            <wp:extent cx="5905500" cy="3162300"/>
+          <wp:inline distT="0" distB="0" distL="0" distR="0" wp14:anchorId="15AB863E" wp14:editId="7049B7D6">
+            <wp:extent cx="5905500" cy="3228975"/>
             <wp:effectExtent l="0" t="0" r="0" b="0"/>
             <wp:docPr id="4" name="cc-2-book-health.png" descr="Figure 4. Chapter 2: vital signs and the arrears-stage snapshot" title="Figure 4. Chapter 2: vital signs and the arrears-stage snapshot"/>
             <wp:cNvGraphicFramePr>
@@ -10728,7 +10728,7 @@
                   <pic:spPr bwMode="auto">
                     <a:xfrm>
                       <a:off x="0" y="0"/>
-                      <a:ext cx="5905500" cy="3162300"/>
+                      <a:ext cx="5905500" cy="3228975"/>
                     </a:xfrm>
                     <a:prstGeom prst="rect">
                       <a:avLst/>
@@ -10754,7 +10754,17 @@
           <w:sz w:val="18"/>
           <w:szCs w:val="18"/>
         </w:rPr>
-        <w:t>Figure 4. Chapter 2: vital signs and the arrears-stage snapshot</w:t>
+        <w:t>Figure 4. Chapter 2: vital signs and the arrears</w:t>
+      </w:r>
+      <w:r>
+        <w:rPr>
+          <w:i/>
+          <w:iCs/>
+          <w:color w:val="5B6472"/>
+          <w:sz w:val="18"/>
+          <w:szCs w:val="18"/>
+        </w:rPr>
+        <w:t>-stage snapshot</w:t>
       </w:r>
     </w:p>
     <w:p>
@@ -10767,10 +10777,10 @@
         <w:spacing w:after="60" w:line="264" w:lineRule="auto"/>
       </w:pPr>
       <w:r>
-        <w:t>Overdue balance ₹1.93B across 19,035 accounts; recovery rate 2.77%; 879 high-risk accounts (604 still likely to pay); 33.4% o</w:t>
-      </w:r>
-      <w:r>
-        <w:t>f accounts worsened this month (6.4% improved); cost to collect ₹0.016 per ₹1.</w:t>
+        <w:t xml:space="preserve">Overdue balance ₹1.93B across 19,035 accounts; recovery rate 2.77% (₹53.4M collected of ₹1.93B); 879 high-risk accounts (4.6% of 19,035; 604 still likely to pay); 33.4% of accounts worsened this month (6,351 of 19,035; 6.4% improved); cost </w:t>
+      </w:r>
+      <w:r>
+        <w:t>to collect ₹0.016 per ₹1 (₹838K spent ÷ ₹53.4M collected).</w:t>
       </w:r>
     </w:p>
     <w:p>
@@ -10783,14 +10793,7 @@
         <w:spacing w:after="60" w:line="264" w:lineRule="auto"/>
       </w:pPr>
       <w:r>
-        <w:rPr>
-          <w:b/>
-          <w:bCs/>
-        </w:rPr>
-        <w:t>Show 5 more metrics:</w:t>
-      </w:r>
-      <w:r>
-        <w:t xml:space="preserve"> customers reached 47.4%, agreed to pay 46.1%, promises honoured 34.6%, amount promised, contacts per customer 4.5.</w:t>
+        <w:t>Every rate says what it is out of ("X of Y"), so nobody has to look elsewhere for the base.</w:t>
       </w:r>
     </w:p>
     <w:p>
@@ -10807,13 +10810,36 @@
           <w:b/>
           <w:bCs/>
         </w:rPr>
+        <w:t>Show 5 more metrics:</w:t>
+      </w:r>
+      <w:r>
+        <w:t xml:space="preserve"> customers reached 47.4% (8,563 of 18,074 we tried), agreed to pay 46.1% (3,945 of 8,</w:t>
+      </w:r>
+      <w:r>
+        <w:t>563), promises honoured 34.6% (652 of 1,886), amount promised, contact attempts per customer 4.5 (calls, SMS, WhatsApp and email, answered or not).</w:t>
+      </w:r>
+    </w:p>
+    <w:p>
+      <w:pPr>
+        <w:pStyle w:val="ListParagraph"/>
+        <w:numPr>
+          <w:ilvl w:val="0"/>
+          <w:numId w:val="2"/>
+        </w:numPr>
+        <w:spacing w:after="60" w:line="264" w:lineRule="auto"/>
+      </w:pPr>
+      <w:r>
+        <w:rPr>
+          <w:b/>
+          <w:bCs/>
+        </w:rPr>
         <w:t>Risk snapshot:</w:t>
       </w:r>
       <w:r>
-        <w:t xml:space="preserve"> accounts, balance and reco</w:t>
-      </w:r>
-      <w:r>
-        <w:t>very by arrears stage; recovery falls from 4.1% at 1–30 days to 0.3% at 180+.</w:t>
+        <w:t xml:space="preserve"> accounts, balance and recovery by arrears stage; recovery falls from 4.1% at 1–30 days to 0.3</w:t>
+      </w:r>
+      <w:r>
+        <w:t>% at 180+.</w:t>
       </w:r>
     </w:p>
     <w:p>
@@ -10834,8 +10860,8 @@
           <w:noProof/>
         </w:rPr>
         <w:drawing>
-          <wp:inline distT="0" distB="0" distL="0" distR="0" wp14:anchorId="23BC7946" wp14:editId="10853199">
-            <wp:extent cx="5905500" cy="2790825"/>
+          <wp:inline distT="0" distB="0" distL="0" distR="0" wp14:anchorId="571E793D" wp14:editId="471DF399">
+            <wp:extent cx="5905500" cy="3143250"/>
             <wp:effectExtent l="0" t="0" r="0" b="0"/>
             <wp:docPr id="5" name="cc-3-holding-back.png" descr="Figure 5. Chapter 3: five issues ranked by risk and money" title="Figure 5. Chapter 3: five issues ranked by risk and money"/>
             <wp:cNvGraphicFramePr>
@@ -10860,7 +10886,7 @@
                   <pic:spPr bwMode="auto">
                     <a:xfrm>
                       <a:off x="0" y="0"/>
-                      <a:ext cx="5905500" cy="2790825"/>
+                      <a:ext cx="5905500" cy="3143250"/>
                     </a:xfrm>
                     <a:prstGeom prst="rect">
                       <a:avLst/>
@@ -10951,6 +10977,7 @@
                 <w:sz w:val="20"/>
                 <w:szCs w:val="20"/>
               </w:rPr>
+              <w:lastRenderedPageBreak/>
               <w:t>#</w:t>
             </w:r>
           </w:p>
@@ -11174,7 +11201,7 @@
                 <w:sz w:val="20"/>
                 <w:szCs w:val="20"/>
               </w:rPr>
-              <w:t>65% of due promises broken; 1,234 broken; 610 more (₹27.2M) due this week likely to break</w:t>
+              <w:t>3,945 customers promised to pay this month. Of the 1,886 already due, 1,234 were broken and 652 kept. Of the 2,059 still to come, 1,198 fall due this week and 610 look likely to break (₹27.2M). A bar shows the five parts</w:t>
             </w:r>
           </w:p>
         </w:tc>
@@ -11211,7 +11238,6 @@
                 <w:sz w:val="20"/>
                 <w:szCs w:val="20"/>
               </w:rPr>
-              <w:lastRenderedPageBreak/>
               <w:t>2</w:t>
             </w:r>
           </w:p>
@@ -11518,7 +11544,14 @@
                 <w:sz w:val="20"/>
                 <w:szCs w:val="20"/>
               </w:rPr>
-              <w:t>Too few customers are reached</w:t>
+              <w:t xml:space="preserve">Too few customers are </w:t>
+            </w:r>
+            <w:r>
+              <w:rPr>
+                <w:sz w:val="20"/>
+                <w:szCs w:val="20"/>
+              </w:rPr>
+              <w:t>reached</w:t>
             </w:r>
           </w:p>
         </w:tc>
@@ -11547,14 +11580,7 @@
                 <w:sz w:val="20"/>
                 <w:szCs w:val="20"/>
               </w:rPr>
-              <w:t>47.4% reached; 46.1% of those ag</w:t>
-            </w:r>
-            <w:r>
-              <w:rPr>
-                <w:sz w:val="20"/>
-                <w:szCs w:val="20"/>
-              </w:rPr>
-              <w:t>ree to pay</w:t>
+              <w:t>We tried to contact 18,074 of 19,035 customers but spoke to only 8,563 (47.4%); 3,945 of those agreed to pay (46.1%)</w:t>
             </w:r>
           </w:p>
         </w:tc>
@@ -11649,7 +11675,7 @@
                 <w:sz w:val="20"/>
                 <w:szCs w:val="20"/>
               </w:rPr>
-              <w:t>Some customers are over-contacted</w:t>
+              <w:t>Some customers are over-contacted (headline "4.5+ attempts")</w:t>
             </w:r>
           </w:p>
         </w:tc>
@@ -11678,7 +11704,7 @@
                 <w:sz w:val="20"/>
                 <w:szCs w:val="20"/>
               </w:rPr>
-              <w:t>9,393 customers in 83 groups at 4.5+ contacts a month</w:t>
+              <w:t>9,393 of 19,035 customers (49%) are in 83 groups averaging 4.5+ contact attempts a month; the whole book averages 4.5</w:t>
             </w:r>
           </w:p>
         </w:tc>
@@ -11709,7 +11735,13 @@
         <w:t>Ask LensS why</w:t>
       </w:r>
       <w:r>
-        <w:t xml:space="preserve"> (a deep analysis).</w:t>
+        <w:t xml:space="preserve"> (a deep analysis). Issues 4 and 5 do not contradict each other: issue 5</w:t>
+      </w:r>
+      <w:r>
+        <w:t xml:space="preserve"> counts contact attempts (answered or not), issue 4 counts customers actually spoken to. We try about 4.5 times per customer but reach fewer than half, so the answer is the right channel at the right time, not more calls. The 4.5 cut-off was set during the</w:t>
+      </w:r>
+      <w:r>
+        <w:t xml:space="preserve"> build, because the data pack's sample rule (6+) finds nothing in this data.</w:t>
       </w:r>
     </w:p>
     <w:p>
@@ -11730,7 +11762,7 @@
           <w:noProof/>
         </w:rPr>
         <w:drawing>
-          <wp:inline distT="0" distB="0" distL="0" distR="0" wp14:anchorId="60CC72C7" wp14:editId="1E5C1EFA">
+          <wp:inline distT="0" distB="0" distL="0" distR="0" wp14:anchorId="631717A3" wp14:editId="07F2A701">
             <wp:extent cx="5905500" cy="2686050"/>
             <wp:effectExtent l="0" t="0" r="0" b="0"/>
             <wp:docPr id="6" name="cc-4-money.png" descr="Figure 6. Chapter 4: recoverable now, and the priority accounts worth the most" title="Figure 6. Chapter 4: recoverable now, and the priority accounts worth the most"/>
@@ -11798,7 +11830,10 @@
         <w:t>₹</w:t>
       </w:r>
       <w:r>
-        <w:t>6.4M can be recovered now from 604 priority accounts: high-risk customers still likely to pay. Credit Card holds the most (₹2.0M).</w:t>
+        <w:t>6.4M can be recovered now from 604 priority accounts: high-risk c</w:t>
+      </w:r>
+      <w:r>
+        <w:t>ustomers still likely to pay. Credit Card holds the most (₹2.0M).</w:t>
       </w:r>
     </w:p>
     <w:p>
@@ -11843,8 +11878,8 @@
           <w:noProof/>
         </w:rPr>
         <w:drawing>
-          <wp:inline distT="0" distB="0" distL="0" distR="0" wp14:anchorId="4F1D18C3" wp14:editId="2A4BD6AB">
-            <wp:extent cx="5905500" cy="3524250"/>
+          <wp:inline distT="0" distB="0" distL="0" distR="0" wp14:anchorId="02FD7C3A" wp14:editId="51936CA6">
+            <wp:extent cx="5905500" cy="3609975"/>
             <wp:effectExtent l="0" t="0" r="0" b="0"/>
             <wp:docPr id="7" name="cc-5-this-week.png" descr="Figure 7. Chapter 5: the work queues and how to handle each priority customer" title="Figure 7. Chapter 5: the work queues and how to handle each priority customer"/>
             <wp:cNvGraphicFramePr>
@@ -11869,7 +11904,7 @@
                   <pic:spPr bwMode="auto">
                     <a:xfrm>
                       <a:off x="0" y="0"/>
-                      <a:ext cx="5905500" cy="3524250"/>
+                      <a:ext cx="5905500" cy="3609975"/>
                     </a:xfrm>
                     <a:prstGeom prst="rect">
                       <a:avLst/>
@@ -12748,7 +12783,7 @@
           <w:noProof/>
         </w:rPr>
         <w:drawing>
-          <wp:inline distT="0" distB="0" distL="0" distR="0" wp14:anchorId="3A773231" wp14:editId="09CD5400">
+          <wp:inline distT="0" distB="0" distL="0" distR="0" wp14:anchorId="1FBC0343" wp14:editId="0AD5DB7D">
             <wp:extent cx="5905500" cy="3695700"/>
             <wp:effectExtent l="0" t="0" r="0" b="0"/>
             <wp:docPr id="8" name="cc-6-view-accounts.png" descr="Figure 8. Every figure opens its accounts: here, the 610 promises likely to break" title="Figure 8. Every figure opens its accounts: here, the 610 promises likely to break"/>
@@ -12838,7 +12873,7 @@
       <w:pPr>
         <w:pStyle w:val="Heading2"/>
       </w:pPr>
-      <w:bookmarkStart w:id="23" w:name="_Toc242175375"/>
+      <w:bookmarkStart w:id="23" w:name="_Toc242180346"/>
       <w:r>
         <w:t>6.2 Explorer</w:t>
       </w:r>
@@ -12854,7 +12889,7 @@
           <w:noProof/>
         </w:rPr>
         <w:drawing>
-          <wp:inline distT="0" distB="0" distL="0" distR="0" wp14:anchorId="251C4171" wp14:editId="480763CB">
+          <wp:inline distT="0" distB="0" distL="0" distR="0" wp14:anchorId="4951FC16" wp14:editId="6940C23D">
             <wp:extent cx="5905500" cy="3695700"/>
             <wp:effectExtent l="0" t="0" r="0" b="0"/>
             <wp:docPr id="9" name="xp-1-filtered.png" descr="Figure 9. Explorer filtered to Personal Loan: each KPI compared with the portfolio" title="Figure 9. Explorer filtered to Personal Loan: each KPI compared with the portfolio"/>
@@ -13019,7 +13054,7 @@
           <w:noProof/>
         </w:rPr>
         <w:drawing>
-          <wp:inline distT="0" distB="0" distL="0" distR="0" wp14:anchorId="5E8C311F" wp14:editId="43454BF3">
+          <wp:inline distT="0" distB="0" distL="0" distR="0" wp14:anchorId="74688DBA" wp14:editId="6A12042A">
             <wp:extent cx="5905500" cy="2162175"/>
             <wp:effectExtent l="0" t="0" r="0" b="0"/>
             <wp:docPr id="10" name="xp-2-heatmap.png" descr="Figure 10. Target achievement by product and arrears stage; click a cell to see its accounts" title="Figure 10. Target achievement by product and arrears stage; click a cell to see its accounts"/>
@@ -13084,7 +13119,7 @@
           <w:noProof/>
         </w:rPr>
         <w:drawing>
-          <wp:inline distT="0" distB="0" distL="0" distR="0" wp14:anchorId="547F9360" wp14:editId="3D45AB82">
+          <wp:inline distT="0" distB="0" distL="0" distR="0" wp14:anchorId="5036B92A" wp14:editId="5E6A6E67">
             <wp:extent cx="3619500" cy="3105150"/>
             <wp:effectExtent l="0" t="0" r="0" b="0"/>
             <wp:docPr id="11" name="xp-3-funnel.png" descr="Figure 11. From arrears to payment, with the accounts at each step" title="Figure 11. From arrears to payment, with the accounts at each step"/>
@@ -13166,7 +13201,7 @@
       <w:pPr>
         <w:pStyle w:val="Heading2"/>
       </w:pPr>
-      <w:bookmarkStart w:id="24" w:name="_Toc242175376"/>
+      <w:bookmarkStart w:id="24" w:name="_Toc242180347"/>
       <w:r>
         <w:lastRenderedPageBreak/>
         <w:t>6.3 Assistant</w:t>
@@ -13183,7 +13218,7 @@
           <w:noProof/>
         </w:rPr>
         <w:drawing>
-          <wp:inline distT="0" distB="0" distL="0" distR="0" wp14:anchorId="34D167B4" wp14:editId="6084372F">
+          <wp:inline distT="0" distB="0" distL="0" distR="0" wp14:anchorId="341A3FB5" wp14:editId="6E0AD7DF">
             <wp:extent cx="5905500" cy="3695700"/>
             <wp:effectExtent l="0" t="0" r="0" b="0"/>
             <wp:docPr id="12" name="as-2-answer.png" descr="Figure 12. A quick answer with its chart (Chart / Table / SQL), actions and suggested follow-ups" title="Figure 12. A quick answer with its chart (Chart / Table / SQL), actions and suggested follow-ups"/>
@@ -13353,7 +13388,7 @@
       <w:pPr>
         <w:pStyle w:val="Heading2"/>
       </w:pPr>
-      <w:bookmarkStart w:id="25" w:name="_Toc242175377"/>
+      <w:bookmarkStart w:id="25" w:name="_Toc242180348"/>
       <w:r>
         <w:lastRenderedPageBreak/>
         <w:t>6.4 Observability</w:t>
@@ -13370,7 +13405,7 @@
           <w:noProof/>
         </w:rPr>
         <w:drawing>
-          <wp:inline distT="0" distB="0" distL="0" distR="0" wp14:anchorId="4B45FB43" wp14:editId="56C5167A">
+          <wp:inline distT="0" distB="0" distL="0" distR="0" wp14:anchorId="31086D0A" wp14:editId="2B4BE92F">
             <wp:extent cx="5905500" cy="3695700"/>
             <wp:effectExtent l="0" t="0" r="0" b="0"/>
             <wp:docPr id="13" name="ob-1-overview.png" descr="Figure 13. Observability: health, headline measures and a governed decision trace" title="Figure 13. Observability: health, headline measures and a governed decision trace"/>
@@ -13435,7 +13470,7 @@
           <w:noProof/>
         </w:rPr>
         <w:drawing>
-          <wp:inline distT="0" distB="0" distL="0" distR="0" wp14:anchorId="61FC17B1" wp14:editId="1F25C52F">
+          <wp:inline distT="0" distB="0" distL="0" distR="0" wp14:anchorId="1A3D6DAB" wp14:editId="41A4F870">
             <wp:extent cx="5905500" cy="3695700"/>
             <wp:effectExtent l="0" t="0" r="0" b="0"/>
             <wp:docPr id="14" name="ob-2-quality.png" descr="Figure 14. Answer quality and faithfulness" title="Figure 14. Answer quality and faithfulness"/>
@@ -14071,7 +14106,7 @@
         <w:pStyle w:val="Heading1"/>
         <w:pageBreakBefore/>
       </w:pPr>
-      <w:bookmarkStart w:id="26" w:name="_Toc242175378"/>
+      <w:bookmarkStart w:id="26" w:name="_Toc242180349"/>
       <w:r>
         <w:lastRenderedPageBreak/>
         <w:t>7. Deployment and operations</w:t>
@@ -15302,7 +15337,7 @@
         <w:pStyle w:val="Heading1"/>
         <w:pageBreakBefore/>
       </w:pPr>
-      <w:bookmarkStart w:id="27" w:name="_Toc242175379"/>
+      <w:bookmarkStart w:id="27" w:name="_Toc242180350"/>
       <w:r>
         <w:lastRenderedPageBreak/>
         <w:t>8. Before the demo</w:t>
@@ -15313,7 +15348,7 @@
       <w:pPr>
         <w:pStyle w:val="Heading2"/>
       </w:pPr>
-      <w:bookmarkStart w:id="28" w:name="_Toc242175380"/>
+      <w:bookmarkStart w:id="28" w:name="_Toc242180351"/>
       <w:r>
         <w:t>Checklist</w:t>
       </w:r>
@@ -15470,7 +15505,7 @@
       <w:pPr>
         <w:pStyle w:val="Heading2"/>
       </w:pPr>
-      <w:bookmarkStart w:id="29" w:name="_Toc242175381"/>
+      <w:bookmarkStart w:id="29" w:name="_Toc242180352"/>
       <w:r>
         <w:t>Presenter tips</w:t>
       </w:r>
@@ -15523,7 +15558,7 @@
         <w:pStyle w:val="Heading1"/>
         <w:pageBreakBefore/>
       </w:pPr>
-      <w:bookmarkStart w:id="30" w:name="_Toc242175382"/>
+      <w:bookmarkStart w:id="30" w:name="_Toc242180353"/>
       <w:r>
         <w:lastRenderedPageBreak/>
         <w:t>9. Demo script (20 minutes)</w:t>
@@ -16254,7 +16289,7 @@
       <w:pPr>
         <w:pStyle w:val="Heading2"/>
       </w:pPr>
-      <w:bookmarkStart w:id="31" w:name="_Toc242175383"/>
+      <w:bookmarkStart w:id="31" w:name="_Toc242180354"/>
       <w:r>
         <w:t>Scene by scene</w:t>
       </w:r>
@@ -17369,7 +17404,7 @@
       <w:pPr>
         <w:pStyle w:val="Heading2"/>
       </w:pPr>
-      <w:bookmarkStart w:id="32" w:name="_Toc242175384"/>
+      <w:bookmarkStart w:id="32" w:name="_Toc242180355"/>
       <w:r>
         <w:t>Tailor to the room</w:t>
       </w:r>
@@ -17995,7 +18030,7 @@
         <w:pStyle w:val="Heading1"/>
         <w:pageBreakBefore/>
       </w:pPr>
-      <w:bookmarkStart w:id="33" w:name="_Toc242175385"/>
+      <w:bookmarkStart w:id="33" w:name="_Toc242180356"/>
       <w:r>
         <w:lastRenderedPageBreak/>
         <w:t>10. Safe questions</w:t>
@@ -18792,7 +18827,7 @@
         <w:pStyle w:val="Heading1"/>
         <w:pageBreakBefore/>
       </w:pPr>
-      <w:bookmarkStart w:id="34" w:name="_Toc242175386"/>
+      <w:bookmarkStart w:id="34" w:name="_Toc242180357"/>
       <w:r>
         <w:lastRenderedPageBreak/>
         <w:t>11. Demo boundaries</w:t>
@@ -18874,7 +18909,7 @@
                 <w:sz w:val="20"/>
                 <w:szCs w:val="20"/>
               </w:rPr>
-              <w:t xml:space="preserve"> the outlook is a pipeline view for this month (collected + promises due × keep rate). With one snapshot there is no history to forecast from, and LensS says so.</w:t>
+              <w:t xml:space="preserve"> the outlook is this month's sum (collected so far + the promises still due × the share being kept). With one snapshot there is no history to forecast from, and LensS says so if asked.</w:t>
             </w:r>
           </w:p>
           <w:p>
@@ -18895,14 +18930,14 @@
                 <w:sz w:val="20"/>
                 <w:szCs w:val="20"/>
               </w:rPr>
-              <w:t xml:space="preserve"> comparisons are like-for-like but observational. Proving causal uplift needs </w:t>
-            </w:r>
-            <w:r>
-              <w:rPr>
-                <w:sz w:val="20"/>
-                <w:szCs w:val="20"/>
-              </w:rPr>
-              <w:t>a randomised champion/challenger test.</w:t>
+              <w:t xml:space="preserve"> comparisons are like-for-like but observational. Provi</w:t>
+            </w:r>
+            <w:r>
+              <w:rPr>
+                <w:sz w:val="20"/>
+                <w:szCs w:val="20"/>
+              </w:rPr>
+              <w:t>ng causal uplift needs a randomised champion/challenger test.</w:t>
             </w:r>
           </w:p>
           <w:p>
@@ -18944,14 +18979,14 @@
                 <w:sz w:val="20"/>
                 <w:szCs w:val="20"/>
               </w:rPr>
-              <w:t xml:space="preserve"> no prices, timelines or na</w:t>
-            </w:r>
-            <w:r>
-              <w:rPr>
-                <w:sz w:val="20"/>
-                <w:szCs w:val="20"/>
-              </w:rPr>
-              <w:t>med reference clients in the room; take them offline with the account lead.</w:t>
+              <w:t xml:space="preserve"> no </w:t>
+            </w:r>
+            <w:r>
+              <w:rPr>
+                <w:sz w:val="20"/>
+                <w:szCs w:val="20"/>
+              </w:rPr>
+              <w:t>prices, timelines or named reference clients in the room; take them offline with the account lead.</w:t>
             </w:r>
           </w:p>
           <w:p>
@@ -18983,7 +19018,7 @@
         <w:pStyle w:val="Heading1"/>
         <w:pageBreakBefore/>
       </w:pPr>
-      <w:bookmarkStart w:id="35" w:name="_Toc242175387"/>
+      <w:bookmarkStart w:id="35" w:name="_Toc242180358"/>
       <w:r>
         <w:lastRenderedPageBreak/>
         <w:t>12. Questions and answers</w:t>
@@ -19003,10 +19038,10 @@
         <w:spacing w:after="120" w:line="276" w:lineRule="auto"/>
       </w:pPr>
       <w:r>
-        <w:t>No. The Command Center and Explor</w:t>
-      </w:r>
-      <w:r>
-        <w:t>er are SQL on certified views. In the Assistant, each answer shows its SQL, and a faithfulness judge checks its figures against the query results (Observability → Answer quality).</w:t>
+        <w:t>No. The Co</w:t>
+      </w:r>
+      <w:r>
+        <w:t>mmand Center and Explorer are SQL on certified views. In the Assistant, each answer shows its SQL, and a faithfulness judge checks its figures against the query results (Observability → Answer quality).</w:t>
       </w:r>
     </w:p>
     <w:p>
@@ -19022,13 +19057,13 @@
         <w:spacing w:after="120" w:line="276" w:lineRule="auto"/>
       </w:pPr>
       <w:r>
-        <w:t>LensS is built on Databricks and design</w:t>
-      </w:r>
-      <w:r>
-        <w:t>ed to be deployed in the client's own workspace: Unity Catalog for data, Genie for questions, Databricks-served models for the checks, Lakebase for chat history and Databricks Apps for the interface. Confirm specific security or residency requirements with</w:t>
-      </w:r>
-      <w:r>
-        <w:t xml:space="preserve"> the solution architect.</w:t>
+        <w:t>LensS is built o</w:t>
+      </w:r>
+      <w:r>
+        <w:t>n Databricks and designed to be deployed in the client's own workspace: Unity Catalog for data, Genie for questions, Databricks-served models for the checks, Lakebase for chat history and Databricks Apps for the interface. Confirm specific security or resi</w:t>
+      </w:r>
+      <w:r>
+        <w:t>dency requirements with the solution architect.</w:t>
       </w:r>
     </w:p>
     <w:p>
@@ -19044,7 +19079,10 @@
         <w:spacing w:after="120" w:line="276" w:lineRule="auto"/>
       </w:pPr>
       <w:r>
-        <w:t>The data holds account and customer tokens only. Guardrails mask personal data in questions and answers, and a request for names or phone numbers is refused (this is part of the automated test suite).</w:t>
+        <w:t>The data holds account and customer tokens only. Guardrails mask personal data in questions and answers, and a request for names or phone numbers is refused (this is part of the auto</w:t>
+      </w:r>
+      <w:r>
+        <w:t>mated test suite).</w:t>
       </w:r>
     </w:p>
     <w:p>
@@ -19052,10 +19090,7 @@
         <w:pStyle w:val="Heading3"/>
       </w:pPr>
       <w:r>
-        <w:t xml:space="preserve">Why </w:t>
-      </w:r>
-      <w:r>
-        <w:t>879 high-risk but only 604 priority accounts?</w:t>
+        <w:t>Why 879 high-risk but only 604 priority accounts?</w:t>
       </w:r>
     </w:p>
     <w:p>
@@ -19207,7 +19242,7 @@
         <w:pStyle w:val="Heading1"/>
         <w:pageBreakBefore/>
       </w:pPr>
-      <w:bookmarkStart w:id="36" w:name="_Toc242175388"/>
+      <w:bookmarkStart w:id="36" w:name="_Toc242180359"/>
       <w:r>
         <w:lastRenderedPageBreak/>
         <w:t>Appendix A. Key figures (sample data, 15 September 2026)</w:t>
@@ -19804,7 +19839,7 @@
                 <w:sz w:val="20"/>
                 <w:szCs w:val="20"/>
               </w:rPr>
-              <w:t>18,074 tried → 8,563 reached (47.4%) → 3,945 promised (46.1%) → 652 kept</w:t>
+              <w:t>18,074 tried → 8,563 reached (47.4%) → 3,945 promised (46.1%) → 652 kept · 4.5 contact attempts per customer on average</w:t>
             </w:r>
           </w:p>
         </w:tc>
@@ -19841,7 +19876,7 @@
                 <w:sz w:val="20"/>
                 <w:szCs w:val="20"/>
               </w:rPr>
-              <w:t>Promises</w:t>
+              <w:t>Promises this month</w:t>
             </w:r>
           </w:p>
         </w:tc>
@@ -19870,7 +19905,14 @@
                 <w:sz w:val="20"/>
                 <w:szCs w:val="20"/>
               </w:rPr>
-              <w:t>65% of due promises broken (1,234); 1,198 due in the next 7 days (₹52.6M), 610 likely to break (₹27.2M)</w:t>
+              <w:t>3,945 made · 1,886 already due (652 kept, 1,234 broken, 65%) · 2,059 still to come (₹87.5M): 1,198 due this week (₹</w:t>
+            </w:r>
+            <w:r>
+              <w:rPr>
+                <w:sz w:val="20"/>
+                <w:szCs w:val="20"/>
+              </w:rPr>
+              <w:t>52.6M; 610 likely to break, ₹27.2M; 588 likely kept), 861 later</w:t>
             </w:r>
           </w:p>
         </w:tc>
@@ -20009,14 +20051,7 @@
                 <w:sz w:val="20"/>
                 <w:szCs w:val="20"/>
               </w:rPr>
-              <w:t xml:space="preserve">1–30 ₹28.2M · 31–60 ₹14.3M · 61–90 ₹11.2M · 91–180 ₹5.0M · </w:t>
-            </w:r>
-            <w:r>
-              <w:rPr>
-                <w:sz w:val="20"/>
-                <w:szCs w:val="20"/>
-              </w:rPr>
-              <w:t>180+ ₹0.6M</w:t>
+              <w:t>1–30 ₹28.2M · 31–60 ₹14.3M · 61–90 ₹11.2M · 91–180 ₹5.0M · 180+ ₹0.6M</w:t>
             </w:r>
           </w:p>
         </w:tc>
@@ -20082,7 +20117,14 @@
                 <w:sz w:val="20"/>
                 <w:szCs w:val="20"/>
               </w:rPr>
-              <w:t>Personal Loan 87.6% (₹2.1M behind) … Mortgage 94.3%; largest single gap Personal Loan 1–30 days (₹996K)</w:t>
+              <w:t>Personal Loan 8</w:t>
+            </w:r>
+            <w:r>
+              <w:rPr>
+                <w:sz w:val="20"/>
+                <w:szCs w:val="20"/>
+              </w:rPr>
+              <w:t>7.6% (₹2.1M behind) … Mortgage 94.3%; largest single gap Personal Loan 1–30 days (₹996K)</w:t>
             </w:r>
           </w:p>
         </w:tc>
@@ -20430,7 +20472,7 @@
         <w:pStyle w:val="Heading1"/>
         <w:pageBreakBefore/>
       </w:pPr>
-      <w:bookmarkStart w:id="37" w:name="_Toc242175389"/>
+      <w:bookmarkStart w:id="37" w:name="_Toc242180360"/>
       <w:r>
         <w:lastRenderedPageBreak/>
         <w:t>Appendix B. Glossary</w:t>
@@ -21711,7 +21753,7 @@
         <w:sz w:val="16"/>
         <w:szCs w:val="16"/>
       </w:rPr>
-      <w:t>LensS Collections Intelligence · Product and Demo Guide · v1.9</w:t>
+      <w:t>LensS Collections Intelligence · Product and Demo Guide · v1.9.1</w:t>
     </w:r>
   </w:p>
 </w:hdr>
@@ -21720,10 +21762,230 @@
 <file path=word/numbering.xml><?xml version="1.0" encoding="utf-8"?>
 <w:numbering xmlns:wpc="http://schemas.microsoft.com/office/word/2010/wordprocessingCanvas" xmlns:cx="http://schemas.microsoft.com/office/drawing/2014/chartex" xmlns:cx1="http://schemas.microsoft.com/office/drawing/2015/9/8/chartex" xmlns:cx2="http://schemas.microsoft.com/office/drawing/2015/10/21/chartex" xmlns:cx3="http://schemas.microsoft.com/office/drawing/2016/5/9/chartex" xmlns:cx4="http://schemas.microsoft.com/office/drawing/2016/5/10/chartex" xmlns:cx5="http://schemas.microsoft.com/office/drawing/2016/5/11/chartex" xmlns:cx6="http://schemas.microsoft.com/office/drawing/2016/5/12/chartex" xmlns:cx7="http://schemas.microsoft.com/office/drawing/2016/5/13/chartex" xmlns:cx8="http://schemas.microsoft.com/office/drawing/2016/5/14/chartex" xmlns:mc="http://schemas.openxmlformats.org/markup-compatibility/2006" xmlns:aink="http://schemas.microsoft.com/office/drawing/2016/ink" xmlns:am3d="http://schemas.microsoft.com/office/drawing/2017/model3d" xmlns:o="urn:schemas-microsoft-com:office:office" xmlns:r="http://schemas.openxmlformats.org/officeDocument/2006/relationships" xmlns:m="http://schemas.openxmlformats.org/officeDocument/2006/math" xmlns:v="urn:schemas-microsoft-com:vml" xmlns:wp14="http://schemas.microsoft.com/office/word/2010/wordprocessingDrawing" xmlns:wp="http://schemas.openxmlformats.org/drawingml/2006/wordprocessingDrawing" xmlns:w10="urn:schemas-microsoft-com:office:word" xmlns:w="http://schemas.openxmlformats.org/wordprocessingml/2006/main" xmlns:w14="http://schemas.microsoft.com/office/word/2010/wordml" xmlns:w15="http://schemas.microsoft.com/office/word/2012/wordml" xmlns:w16cex="http://schemas.microsoft.com/office/word/2018/wordml/cex" xmlns:w16cid="http://schemas.microsoft.com/office/word/2016/wordml/cid" xmlns:w16="http://schemas.microsoft.com/office/word/2018/wordml" xmlns:w16sdtdh="http://schemas.microsoft.com/office/word/2020/wordml/sdtdatahash" xmlns:w16se="http://schemas.microsoft.com/office/word/2015/wordml/symex" xmlns:wpg="http://schemas.microsoft.com/office/word/2010/wordprocessingGroup" xmlns:wpi="http://schemas.microsoft.com/office/word/2010/wordprocessingInk" xmlns:wne="http://schemas.microsoft.com/office/word/2006/wordml" xmlns:wps="http://schemas.microsoft.com/office/word/2010/wordprocessingShape" mc:Ignorable="w14 w15 w16se w16cid w16 w16cex w16sdtdh wp14">
   <w:abstractNum w:abstractNumId="0" w15:restartNumberingAfterBreak="0">
-    <w:nsid w:val="19EF0DE0"/>
+    <w:nsid w:val="217F3889"/>
     <w:multiLevelType w:val="hybridMultilevel"/>
-    <w:tmpl w:val="EBEA0684"/>
-    <w:lvl w:ilvl="0" w:tplc="381864F6" w:tentative="1">
+    <w:tmpl w:val="52D8B5D2"/>
+    <w:lvl w:ilvl="0" w:tplc="B480469A" w:tentative="1">
+      <w:start w:val="1"/>
+      <w:numFmt w:val="decimal"/>
+      <w:lvlText w:val="%1."/>
+      <w:lvlJc w:val="left"/>
+      <w:pPr>
+        <w:ind w:left="540" w:hanging="320"/>
+      </w:pPr>
+    </w:lvl>
+    <w:lvl w:ilvl="1" w:tplc="F17CDBF6">
+      <w:numFmt w:val="decimal"/>
+      <w:lvlText w:val=""/>
+      <w:lvlJc w:val="left"/>
+    </w:lvl>
+    <w:lvl w:ilvl="2" w:tplc="EF902E16">
+      <w:numFmt w:val="decimal"/>
+      <w:lvlText w:val=""/>
+      <w:lvlJc w:val="left"/>
+    </w:lvl>
+    <w:lvl w:ilvl="3" w:tplc="709EFBDA">
+      <w:numFmt w:val="decimal"/>
+      <w:lvlText w:val=""/>
+      <w:lvlJc w:val="left"/>
+    </w:lvl>
+    <w:lvl w:ilvl="4" w:tplc="6B88A1EE">
+      <w:numFmt w:val="decimal"/>
+      <w:lvlText w:val=""/>
+      <w:lvlJc w:val="left"/>
+    </w:lvl>
+    <w:lvl w:ilvl="5" w:tplc="94422EAA">
+      <w:numFmt w:val="decimal"/>
+      <w:lvlText w:val=""/>
+      <w:lvlJc w:val="left"/>
+    </w:lvl>
+    <w:lvl w:ilvl="6" w:tplc="8AD20176">
+      <w:numFmt w:val="decimal"/>
+      <w:lvlText w:val=""/>
+      <w:lvlJc w:val="left"/>
+    </w:lvl>
+    <w:lvl w:ilvl="7" w:tplc="8ADA62F0">
+      <w:numFmt w:val="decimal"/>
+      <w:lvlText w:val=""/>
+      <w:lvlJc w:val="left"/>
+    </w:lvl>
+    <w:lvl w:ilvl="8" w:tplc="EFA4F23A">
+      <w:numFmt w:val="decimal"/>
+      <w:lvlText w:val=""/>
+      <w:lvlJc w:val="left"/>
+    </w:lvl>
+  </w:abstractNum>
+  <w:abstractNum w:abstractNumId="1" w15:restartNumberingAfterBreak="0">
+    <w:nsid w:val="2B7B5511"/>
+    <w:multiLevelType w:val="hybridMultilevel"/>
+    <w:tmpl w:val="66B6CB8A"/>
+    <w:lvl w:ilvl="0" w:tplc="1A76613E" w:tentative="1">
+      <w:start w:val="1"/>
+      <w:numFmt w:val="decimal"/>
+      <w:lvlText w:val="%1."/>
+      <w:lvlJc w:val="left"/>
+      <w:pPr>
+        <w:ind w:left="540" w:hanging="320"/>
+      </w:pPr>
+    </w:lvl>
+    <w:lvl w:ilvl="1" w:tplc="FE3A9E60">
+      <w:numFmt w:val="decimal"/>
+      <w:lvlText w:val=""/>
+      <w:lvlJc w:val="left"/>
+    </w:lvl>
+    <w:lvl w:ilvl="2" w:tplc="6D224480">
+      <w:numFmt w:val="decimal"/>
+      <w:lvlText w:val=""/>
+      <w:lvlJc w:val="left"/>
+    </w:lvl>
+    <w:lvl w:ilvl="3" w:tplc="7766F3C6">
+      <w:numFmt w:val="decimal"/>
+      <w:lvlText w:val=""/>
+      <w:lvlJc w:val="left"/>
+    </w:lvl>
+    <w:lvl w:ilvl="4" w:tplc="7C9CFA64">
+      <w:numFmt w:val="decimal"/>
+      <w:lvlText w:val=""/>
+      <w:lvlJc w:val="left"/>
+    </w:lvl>
+    <w:lvl w:ilvl="5" w:tplc="86667252">
+      <w:numFmt w:val="decimal"/>
+      <w:lvlText w:val=""/>
+      <w:lvlJc w:val="left"/>
+    </w:lvl>
+    <w:lvl w:ilvl="6" w:tplc="4B9C3026">
+      <w:numFmt w:val="decimal"/>
+      <w:lvlText w:val=""/>
+      <w:lvlJc w:val="left"/>
+    </w:lvl>
+    <w:lvl w:ilvl="7" w:tplc="7AD6FABE">
+      <w:numFmt w:val="decimal"/>
+      <w:lvlText w:val=""/>
+      <w:lvlJc w:val="left"/>
+    </w:lvl>
+    <w:lvl w:ilvl="8" w:tplc="1194AB34">
+      <w:numFmt w:val="decimal"/>
+      <w:lvlText w:val=""/>
+      <w:lvlJc w:val="left"/>
+    </w:lvl>
+  </w:abstractNum>
+  <w:abstractNum w:abstractNumId="2" w15:restartNumberingAfterBreak="0">
+    <w:nsid w:val="41C26BB1"/>
+    <w:multiLevelType w:val="hybridMultilevel"/>
+    <w:tmpl w:val="431875EA"/>
+    <w:lvl w:ilvl="0" w:tplc="18E8BD38">
+      <w:start w:val="1"/>
+      <w:numFmt w:val="bullet"/>
+      <w:lvlText w:val="•"/>
+      <w:lvlJc w:val="left"/>
+      <w:pPr>
+        <w:ind w:left="540" w:hanging="270"/>
+      </w:pPr>
+    </w:lvl>
+    <w:lvl w:ilvl="1" w:tplc="90324BAC" w:tentative="1">
+      <w:start w:val="1"/>
+      <w:numFmt w:val="bullet"/>
+      <w:lvlText w:val="–"/>
+      <w:lvlJc w:val="left"/>
+      <w:pPr>
+        <w:ind w:left="1080" w:hanging="270"/>
+      </w:pPr>
+    </w:lvl>
+    <w:lvl w:ilvl="2" w:tplc="5E600A64">
+      <w:numFmt w:val="decimal"/>
+      <w:lvlText w:val=""/>
+      <w:lvlJc w:val="left"/>
+    </w:lvl>
+    <w:lvl w:ilvl="3" w:tplc="F5BCC97C">
+      <w:numFmt w:val="decimal"/>
+      <w:lvlText w:val=""/>
+      <w:lvlJc w:val="left"/>
+    </w:lvl>
+    <w:lvl w:ilvl="4" w:tplc="4502C5F6">
+      <w:numFmt w:val="decimal"/>
+      <w:lvlText w:val=""/>
+      <w:lvlJc w:val="left"/>
+    </w:lvl>
+    <w:lvl w:ilvl="5" w:tplc="E19EE590">
+      <w:numFmt w:val="decimal"/>
+      <w:lvlText w:val=""/>
+      <w:lvlJc w:val="left"/>
+    </w:lvl>
+    <w:lvl w:ilvl="6" w:tplc="57001494">
+      <w:numFmt w:val="decimal"/>
+      <w:lvlText w:val=""/>
+      <w:lvlJc w:val="left"/>
+    </w:lvl>
+    <w:lvl w:ilvl="7" w:tplc="BB34505E">
+      <w:numFmt w:val="decimal"/>
+      <w:lvlText w:val=""/>
+      <w:lvlJc w:val="left"/>
+    </w:lvl>
+    <w:lvl w:ilvl="8" w:tplc="945CFAF0">
+      <w:numFmt w:val="decimal"/>
+      <w:lvlText w:val=""/>
+      <w:lvlJc w:val="left"/>
+    </w:lvl>
+  </w:abstractNum>
+  <w:abstractNum w:abstractNumId="3" w15:restartNumberingAfterBreak="0">
+    <w:nsid w:val="493F2C0D"/>
+    <w:multiLevelType w:val="hybridMultilevel"/>
+    <w:tmpl w:val="5344CADC"/>
+    <w:lvl w:ilvl="0" w:tplc="FB28B422">
+      <w:start w:val="1"/>
+      <w:numFmt w:val="decimal"/>
+      <w:lvlText w:val="%1."/>
+      <w:lvlJc w:val="left"/>
+      <w:pPr>
+        <w:ind w:left="540" w:hanging="320"/>
+      </w:pPr>
+    </w:lvl>
+    <w:lvl w:ilvl="1" w:tplc="1A42CEFC">
+      <w:numFmt w:val="decimal"/>
+      <w:lvlText w:val=""/>
+      <w:lvlJc w:val="left"/>
+    </w:lvl>
+    <w:lvl w:ilvl="2" w:tplc="472A8F82">
+      <w:numFmt w:val="decimal"/>
+      <w:lvlText w:val=""/>
+      <w:lvlJc w:val="left"/>
+    </w:lvl>
+    <w:lvl w:ilvl="3" w:tplc="0A0CCC56">
+      <w:numFmt w:val="decimal"/>
+      <w:lvlText w:val=""/>
+      <w:lvlJc w:val="left"/>
+    </w:lvl>
+    <w:lvl w:ilvl="4" w:tplc="A8EE548A">
+      <w:numFmt w:val="decimal"/>
+      <w:lvlText w:val=""/>
+      <w:lvlJc w:val="left"/>
+    </w:lvl>
+    <w:lvl w:ilvl="5" w:tplc="BB52D954">
+      <w:numFmt w:val="decimal"/>
+      <w:lvlText w:val=""/>
+      <w:lvlJc w:val="left"/>
+    </w:lvl>
+    <w:lvl w:ilvl="6" w:tplc="EEF6EC40">
+      <w:numFmt w:val="decimal"/>
+      <w:lvlText w:val=""/>
+      <w:lvlJc w:val="left"/>
+    </w:lvl>
+    <w:lvl w:ilvl="7" w:tplc="FF481472">
+      <w:numFmt w:val="decimal"/>
+      <w:lvlText w:val=""/>
+      <w:lvlJc w:val="left"/>
+    </w:lvl>
+    <w:lvl w:ilvl="8" w:tplc="C2BAEEDE">
+      <w:numFmt w:val="decimal"/>
+      <w:lvlText w:val=""/>
+      <w:lvlJc w:val="left"/>
+    </w:lvl>
+  </w:abstractNum>
+  <w:abstractNum w:abstractNumId="4" w15:restartNumberingAfterBreak="0">
+    <w:nsid w:val="7F361213"/>
+    <w:multiLevelType w:val="hybridMultilevel"/>
+    <w:tmpl w:val="47F030CA"/>
+    <w:lvl w:ilvl="0" w:tplc="0E6CA5D0" w:tentative="1">
       <w:start w:val="1"/>
       <w:numFmt w:val="bullet"/>
       <w:lvlText w:val="●"/>
@@ -21732,7 +21994,7 @@
         <w:ind w:left="720" w:hanging="360"/>
       </w:pPr>
     </w:lvl>
-    <w:lvl w:ilvl="1" w:tplc="C3FE8B0A" w:tentative="1">
+    <w:lvl w:ilvl="1" w:tplc="B308C31E" w:tentative="1">
       <w:start w:val="1"/>
       <w:numFmt w:val="bullet"/>
       <w:lvlText w:val="○"/>
@@ -21741,7 +22003,7 @@
         <w:ind w:left="1440" w:hanging="360"/>
       </w:pPr>
     </w:lvl>
-    <w:lvl w:ilvl="2" w:tplc="991AEE96" w:tentative="1">
+    <w:lvl w:ilvl="2" w:tplc="060E9856" w:tentative="1">
       <w:start w:val="1"/>
       <w:numFmt w:val="bullet"/>
       <w:lvlText w:val="■"/>
@@ -21750,7 +22012,7 @@
         <w:ind w:left="2160" w:hanging="360"/>
       </w:pPr>
     </w:lvl>
-    <w:lvl w:ilvl="3" w:tplc="84FA0952" w:tentative="1">
+    <w:lvl w:ilvl="3" w:tplc="C680C718" w:tentative="1">
       <w:start w:val="1"/>
       <w:numFmt w:val="bullet"/>
       <w:lvlText w:val="●"/>
@@ -21759,7 +22021,7 @@
         <w:ind w:left="2880" w:hanging="360"/>
       </w:pPr>
     </w:lvl>
-    <w:lvl w:ilvl="4" w:tplc="CFAA4DE0" w:tentative="1">
+    <w:lvl w:ilvl="4" w:tplc="9136631E" w:tentative="1">
       <w:start w:val="1"/>
       <w:numFmt w:val="bullet"/>
       <w:lvlText w:val="○"/>
@@ -21768,7 +22030,7 @@
         <w:ind w:left="3600" w:hanging="360"/>
       </w:pPr>
     </w:lvl>
-    <w:lvl w:ilvl="5" w:tplc="1B3AC0B8" w:tentative="1">
+    <w:lvl w:ilvl="5" w:tplc="F716D28E" w:tentative="1">
       <w:start w:val="1"/>
       <w:numFmt w:val="bullet"/>
       <w:lvlText w:val="■"/>
@@ -21777,7 +22039,7 @@
         <w:ind w:left="4320" w:hanging="360"/>
       </w:pPr>
     </w:lvl>
-    <w:lvl w:ilvl="6" w:tplc="DC7AE83C" w:tentative="1">
+    <w:lvl w:ilvl="6" w:tplc="07B8731C" w:tentative="1">
       <w:start w:val="1"/>
       <w:numFmt w:val="bullet"/>
       <w:lvlText w:val="●"/>
@@ -21786,7 +22048,7 @@
         <w:ind w:left="5040" w:hanging="360"/>
       </w:pPr>
     </w:lvl>
-    <w:lvl w:ilvl="7" w:tplc="CDA6E372" w:tentative="1">
+    <w:lvl w:ilvl="7" w:tplc="9AFC640C" w:tentative="1">
       <w:start w:val="1"/>
       <w:numFmt w:val="bullet"/>
       <w:lvlText w:val="●"/>
@@ -21795,7 +22057,7 @@
         <w:ind w:left="5760" w:hanging="360"/>
       </w:pPr>
     </w:lvl>
-    <w:lvl w:ilvl="8" w:tplc="1B528ED4" w:tentative="1">
+    <w:lvl w:ilvl="8" w:tplc="AB602C1C" w:tentative="1">
       <w:start w:val="1"/>
       <w:numFmt w:val="bullet"/>
       <w:lvlText w:val="●"/>
@@ -21805,234 +22067,14 @@
       </w:pPr>
     </w:lvl>
   </w:abstractNum>
-  <w:abstractNum w:abstractNumId="1" w15:restartNumberingAfterBreak="0">
-    <w:nsid w:val="232B60CB"/>
-    <w:multiLevelType w:val="hybridMultilevel"/>
-    <w:tmpl w:val="21562474"/>
-    <w:lvl w:ilvl="0" w:tplc="E3FAA736" w:tentative="1">
-      <w:start w:val="1"/>
-      <w:numFmt w:val="decimal"/>
-      <w:lvlText w:val="%1."/>
-      <w:lvlJc w:val="left"/>
-      <w:pPr>
-        <w:ind w:left="540" w:hanging="320"/>
-      </w:pPr>
-    </w:lvl>
-    <w:lvl w:ilvl="1" w:tplc="6E621E0E">
-      <w:numFmt w:val="decimal"/>
-      <w:lvlText w:val=""/>
-      <w:lvlJc w:val="left"/>
-    </w:lvl>
-    <w:lvl w:ilvl="2" w:tplc="676ACEC4">
-      <w:numFmt w:val="decimal"/>
-      <w:lvlText w:val=""/>
-      <w:lvlJc w:val="left"/>
-    </w:lvl>
-    <w:lvl w:ilvl="3" w:tplc="B7E2D754">
-      <w:numFmt w:val="decimal"/>
-      <w:lvlText w:val=""/>
-      <w:lvlJc w:val="left"/>
-    </w:lvl>
-    <w:lvl w:ilvl="4" w:tplc="36F6C992">
-      <w:numFmt w:val="decimal"/>
-      <w:lvlText w:val=""/>
-      <w:lvlJc w:val="left"/>
-    </w:lvl>
-    <w:lvl w:ilvl="5" w:tplc="5E4E53B2">
-      <w:numFmt w:val="decimal"/>
-      <w:lvlText w:val=""/>
-      <w:lvlJc w:val="left"/>
-    </w:lvl>
-    <w:lvl w:ilvl="6" w:tplc="3DF8CD1A">
-      <w:numFmt w:val="decimal"/>
-      <w:lvlText w:val=""/>
-      <w:lvlJc w:val="left"/>
-    </w:lvl>
-    <w:lvl w:ilvl="7" w:tplc="D67AC4D8">
-      <w:numFmt w:val="decimal"/>
-      <w:lvlText w:val=""/>
-      <w:lvlJc w:val="left"/>
-    </w:lvl>
-    <w:lvl w:ilvl="8" w:tplc="3B382C42">
-      <w:numFmt w:val="decimal"/>
-      <w:lvlText w:val=""/>
-      <w:lvlJc w:val="left"/>
-    </w:lvl>
-  </w:abstractNum>
-  <w:abstractNum w:abstractNumId="2" w15:restartNumberingAfterBreak="0">
-    <w:nsid w:val="3C9861D0"/>
-    <w:multiLevelType w:val="hybridMultilevel"/>
-    <w:tmpl w:val="5992B906"/>
-    <w:lvl w:ilvl="0" w:tplc="B2866098" w:tentative="1">
-      <w:start w:val="1"/>
-      <w:numFmt w:val="decimal"/>
-      <w:lvlText w:val="%1."/>
-      <w:lvlJc w:val="left"/>
-      <w:pPr>
-        <w:ind w:left="540" w:hanging="320"/>
-      </w:pPr>
-    </w:lvl>
-    <w:lvl w:ilvl="1" w:tplc="1E7017A0">
-      <w:numFmt w:val="decimal"/>
-      <w:lvlText w:val=""/>
-      <w:lvlJc w:val="left"/>
-    </w:lvl>
-    <w:lvl w:ilvl="2" w:tplc="988496E4">
-      <w:numFmt w:val="decimal"/>
-      <w:lvlText w:val=""/>
-      <w:lvlJc w:val="left"/>
-    </w:lvl>
-    <w:lvl w:ilvl="3" w:tplc="367EEA1E">
-      <w:numFmt w:val="decimal"/>
-      <w:lvlText w:val=""/>
-      <w:lvlJc w:val="left"/>
-    </w:lvl>
-    <w:lvl w:ilvl="4" w:tplc="4576504A">
-      <w:numFmt w:val="decimal"/>
-      <w:lvlText w:val=""/>
-      <w:lvlJc w:val="left"/>
-    </w:lvl>
-    <w:lvl w:ilvl="5" w:tplc="B7A84506">
-      <w:numFmt w:val="decimal"/>
-      <w:lvlText w:val=""/>
-      <w:lvlJc w:val="left"/>
-    </w:lvl>
-    <w:lvl w:ilvl="6" w:tplc="7BA624A8">
-      <w:numFmt w:val="decimal"/>
-      <w:lvlText w:val=""/>
-      <w:lvlJc w:val="left"/>
-    </w:lvl>
-    <w:lvl w:ilvl="7" w:tplc="94C01522">
-      <w:numFmt w:val="decimal"/>
-      <w:lvlText w:val=""/>
-      <w:lvlJc w:val="left"/>
-    </w:lvl>
-    <w:lvl w:ilvl="8" w:tplc="1B447BCC">
-      <w:numFmt w:val="decimal"/>
-      <w:lvlText w:val=""/>
-      <w:lvlJc w:val="left"/>
-    </w:lvl>
-  </w:abstractNum>
-  <w:abstractNum w:abstractNumId="3" w15:restartNumberingAfterBreak="0">
-    <w:nsid w:val="4FFE17FF"/>
-    <w:multiLevelType w:val="hybridMultilevel"/>
-    <w:tmpl w:val="8D0C69EA"/>
-    <w:lvl w:ilvl="0" w:tplc="C8EA4F8A">
-      <w:start w:val="1"/>
-      <w:numFmt w:val="decimal"/>
-      <w:lvlText w:val="%1."/>
-      <w:lvlJc w:val="left"/>
-      <w:pPr>
-        <w:ind w:left="540" w:hanging="320"/>
-      </w:pPr>
-    </w:lvl>
-    <w:lvl w:ilvl="1" w:tplc="BB4E2926">
-      <w:numFmt w:val="decimal"/>
-      <w:lvlText w:val=""/>
-      <w:lvlJc w:val="left"/>
-    </w:lvl>
-    <w:lvl w:ilvl="2" w:tplc="016846F4">
-      <w:numFmt w:val="decimal"/>
-      <w:lvlText w:val=""/>
-      <w:lvlJc w:val="left"/>
-    </w:lvl>
-    <w:lvl w:ilvl="3" w:tplc="77B490E4">
-      <w:numFmt w:val="decimal"/>
-      <w:lvlText w:val=""/>
-      <w:lvlJc w:val="left"/>
-    </w:lvl>
-    <w:lvl w:ilvl="4" w:tplc="E3CC8D02">
-      <w:numFmt w:val="decimal"/>
-      <w:lvlText w:val=""/>
-      <w:lvlJc w:val="left"/>
-    </w:lvl>
-    <w:lvl w:ilvl="5" w:tplc="316079BA">
-      <w:numFmt w:val="decimal"/>
-      <w:lvlText w:val=""/>
-      <w:lvlJc w:val="left"/>
-    </w:lvl>
-    <w:lvl w:ilvl="6" w:tplc="5E8486AC">
-      <w:numFmt w:val="decimal"/>
-      <w:lvlText w:val=""/>
-      <w:lvlJc w:val="left"/>
-    </w:lvl>
-    <w:lvl w:ilvl="7" w:tplc="F844DECE">
-      <w:numFmt w:val="decimal"/>
-      <w:lvlText w:val=""/>
-      <w:lvlJc w:val="left"/>
-    </w:lvl>
-    <w:lvl w:ilvl="8" w:tplc="381E6490">
-      <w:numFmt w:val="decimal"/>
-      <w:lvlText w:val=""/>
-      <w:lvlJc w:val="left"/>
-    </w:lvl>
-  </w:abstractNum>
-  <w:abstractNum w:abstractNumId="4" w15:restartNumberingAfterBreak="0">
-    <w:nsid w:val="75145750"/>
-    <w:multiLevelType w:val="hybridMultilevel"/>
-    <w:tmpl w:val="A8F658D4"/>
-    <w:lvl w:ilvl="0" w:tplc="1BD08570">
-      <w:start w:val="1"/>
-      <w:numFmt w:val="bullet"/>
-      <w:lvlText w:val="•"/>
-      <w:lvlJc w:val="left"/>
-      <w:pPr>
-        <w:ind w:left="540" w:hanging="270"/>
-      </w:pPr>
-    </w:lvl>
-    <w:lvl w:ilvl="1" w:tplc="C290AE56" w:tentative="1">
-      <w:start w:val="1"/>
-      <w:numFmt w:val="bullet"/>
-      <w:lvlText w:val="–"/>
-      <w:lvlJc w:val="left"/>
-      <w:pPr>
-        <w:ind w:left="1080" w:hanging="270"/>
-      </w:pPr>
-    </w:lvl>
-    <w:lvl w:ilvl="2" w:tplc="93129632">
-      <w:numFmt w:val="decimal"/>
-      <w:lvlText w:val=""/>
-      <w:lvlJc w:val="left"/>
-    </w:lvl>
-    <w:lvl w:ilvl="3" w:tplc="9B885260">
-      <w:numFmt w:val="decimal"/>
-      <w:lvlText w:val=""/>
-      <w:lvlJc w:val="left"/>
-    </w:lvl>
-    <w:lvl w:ilvl="4" w:tplc="A622CF10">
-      <w:numFmt w:val="decimal"/>
-      <w:lvlText w:val=""/>
-      <w:lvlJc w:val="left"/>
-    </w:lvl>
-    <w:lvl w:ilvl="5" w:tplc="3412F046">
-      <w:numFmt w:val="decimal"/>
-      <w:lvlText w:val=""/>
-      <w:lvlJc w:val="left"/>
-    </w:lvl>
-    <w:lvl w:ilvl="6" w:tplc="7348132A">
-      <w:numFmt w:val="decimal"/>
-      <w:lvlText w:val=""/>
-      <w:lvlJc w:val="left"/>
-    </w:lvl>
-    <w:lvl w:ilvl="7" w:tplc="95C08234">
-      <w:numFmt w:val="decimal"/>
-      <w:lvlText w:val=""/>
-      <w:lvlJc w:val="left"/>
-    </w:lvl>
-    <w:lvl w:ilvl="8" w:tplc="A8508CF8">
-      <w:numFmt w:val="decimal"/>
-      <w:lvlText w:val=""/>
-      <w:lvlJc w:val="left"/>
-    </w:lvl>
-  </w:abstractNum>
   <w:num w:numId="1">
-    <w:abstractNumId w:val="0"/>
+    <w:abstractNumId w:val="4"/>
     <w:lvlOverride w:ilvl="0">
       <w:startOverride w:val="1"/>
     </w:lvlOverride>
   </w:num>
   <w:num w:numId="2">
-    <w:abstractNumId w:val="4"/>
+    <w:abstractNumId w:val="2"/>
     <w:lvlOverride w:ilvl="0">
       <w:startOverride w:val="1"/>
     </w:lvlOverride>
@@ -22679,7 +22721,7 @@
     <w:autoRedefine/>
     <w:uiPriority w:val="39"/>
     <w:unhideWhenUsed/>
-    <w:rsid w:val="00285FD9"/>
+    <w:rsid w:val="00E162B7"/>
     <w:pPr>
       <w:spacing w:after="100"/>
     </w:pPr>
@@ -22691,7 +22733,7 @@
     <w:autoRedefine/>
     <w:uiPriority w:val="39"/>
     <w:unhideWhenUsed/>
-    <w:rsid w:val="00285FD9"/>
+    <w:rsid w:val="00E162B7"/>
     <w:pPr>
       <w:spacing w:after="100"/>
       <w:ind w:left="210"/>

</xml_diff>

<commit_message>
Command Center: this week's plan before the high-risk opportunity; greet by first name
- Chapters 4 and 5 swapped: chapter 4 is "What should we do this week?" (the
  four queues); chapter 5 is "What more can we recover from high-risk
  customers?" - extra recovery on top of the plan (604 of 879 still likely to
  pay, Rs 6.4M), with recoverable by product, the accounts worth the most and
  one next step per priority customer.
- Greeting uses the first name, never the email: /api/me builds the name from
  the email when the directory returns an email as the display name
  ("Saurabh Kumar"); the banner says "Good Evening, Saurabh".
- Docs updated for the new chapter order (README, guides, leadership summary,
  figures reference, client demo playbook, Word guide).

Co-Authored-By: Claude Opus 5.5 <noreply@anthropic.com>
</commit_message>
<xml_diff>
--- a/docs/LensS_Collections_Product_and_Demo_Guide.docx
+++ b/docs/LensS_Collections_Product_and_Demo_Guide.docx
@@ -511,7 +511,7 @@
     <w:sdt>
       <w:sdtPr>
         <w:alias w:val="Contents"/>
-        <w:id w:val="-1077440831"/>
+        <w:id w:val="866561815"/>
       </w:sdtPr>
       <w:sdtEndPr/>
       <w:sdtContent>
@@ -538,7 +538,7 @@
           <w:r>
             <w:fldChar w:fldCharType="separate"/>
           </w:r>
-          <w:hyperlink w:anchor="_Toc242180323" w:history="1">
+          <w:hyperlink w:anchor="_Toc242218132" w:history="1">
             <w:r>
               <w:rPr>
                 <w:rStyle w:val="Hyperlink"/>
@@ -562,7 +562,7 @@
               <w:rPr>
                 <w:noProof/>
               </w:rPr>
-              <w:instrText xml:space="preserve"> PAGEREF _Toc242180323 \h </w:instrText>
+              <w:instrText xml:space="preserve"> PAGEREF _Toc242218132 \h </w:instrText>
             </w:r>
             <w:r>
               <w:rPr>
@@ -603,7 +603,7 @@
               <w:szCs w:val="22"/>
             </w:rPr>
           </w:pPr>
-          <w:hyperlink w:anchor="_Toc242180324" w:history="1">
+          <w:hyperlink w:anchor="_Toc242218133" w:history="1">
             <w:r>
               <w:rPr>
                 <w:rStyle w:val="Hyperlink"/>
@@ -627,7 +627,7 @@
               <w:rPr>
                 <w:noProof/>
               </w:rPr>
-              <w:instrText xml:space="preserve"> PAGEREF _Toc242180324 \h </w:instrText>
+              <w:instrText xml:space="preserve"> PAGEREF _Toc242218133 \h </w:instrText>
             </w:r>
             <w:r>
               <w:rPr>
@@ -668,7 +668,7 @@
               <w:szCs w:val="22"/>
             </w:rPr>
           </w:pPr>
-          <w:hyperlink w:anchor="_Toc242180325" w:history="1">
+          <w:hyperlink w:anchor="_Toc242218134" w:history="1">
             <w:r>
               <w:rPr>
                 <w:rStyle w:val="Hyperlink"/>
@@ -692,7 +692,7 @@
               <w:rPr>
                 <w:noProof/>
               </w:rPr>
-              <w:instrText xml:space="preserve"> PAGEREF _Toc242180325 \h </w:instrText>
+              <w:instrText xml:space="preserve"> PAGEREF _Toc242218134 \h </w:instrText>
             </w:r>
             <w:r>
               <w:rPr>
@@ -733,7 +733,7 @@
               <w:szCs w:val="22"/>
             </w:rPr>
           </w:pPr>
-          <w:hyperlink w:anchor="_Toc242180326" w:history="1">
+          <w:hyperlink w:anchor="_Toc242218135" w:history="1">
             <w:r>
               <w:rPr>
                 <w:rStyle w:val="Hyperlink"/>
@@ -757,7 +757,7 @@
               <w:rPr>
                 <w:noProof/>
               </w:rPr>
-              <w:instrText xml:space="preserve"> PAGEREF _Toc242180326 \h </w:instrText>
+              <w:instrText xml:space="preserve"> PAGEREF _Toc242218135 \h </w:instrText>
             </w:r>
             <w:r>
               <w:rPr>
@@ -798,7 +798,7 @@
               <w:szCs w:val="22"/>
             </w:rPr>
           </w:pPr>
-          <w:hyperlink w:anchor="_Toc242180327" w:history="1">
+          <w:hyperlink w:anchor="_Toc242218136" w:history="1">
             <w:r>
               <w:rPr>
                 <w:rStyle w:val="Hyperlink"/>
@@ -822,7 +822,7 @@
               <w:rPr>
                 <w:noProof/>
               </w:rPr>
-              <w:instrText xml:space="preserve"> PAGEREF _Toc242180327 \h </w:instrText>
+              <w:instrText xml:space="preserve"> PAGEREF _Toc242218136 \h </w:instrText>
             </w:r>
             <w:r>
               <w:rPr>
@@ -863,7 +863,7 @@
               <w:szCs w:val="22"/>
             </w:rPr>
           </w:pPr>
-          <w:hyperlink w:anchor="_Toc242180328" w:history="1">
+          <w:hyperlink w:anchor="_Toc242218137" w:history="1">
             <w:r>
               <w:rPr>
                 <w:rStyle w:val="Hyperlink"/>
@@ -887,7 +887,7 @@
               <w:rPr>
                 <w:noProof/>
               </w:rPr>
-              <w:instrText xml:space="preserve"> PAGEREF _Toc242180328 \h </w:instrText>
+              <w:instrText xml:space="preserve"> PAGEREF _Toc242218137 \h </w:instrText>
             </w:r>
             <w:r>
               <w:rPr>
@@ -928,7 +928,7 @@
               <w:szCs w:val="22"/>
             </w:rPr>
           </w:pPr>
-          <w:hyperlink w:anchor="_Toc242180329" w:history="1">
+          <w:hyperlink w:anchor="_Toc242218138" w:history="1">
             <w:r>
               <w:rPr>
                 <w:rStyle w:val="Hyperlink"/>
@@ -952,7 +952,7 @@
               <w:rPr>
                 <w:noProof/>
               </w:rPr>
-              <w:instrText xml:space="preserve"> PAGEREF _Toc242180329 \h </w:instrText>
+              <w:instrText xml:space="preserve"> PAGEREF _Toc242218138 \h </w:instrText>
             </w:r>
             <w:r>
               <w:rPr>
@@ -993,7 +993,7 @@
               <w:szCs w:val="22"/>
             </w:rPr>
           </w:pPr>
-          <w:hyperlink w:anchor="_Toc242180330" w:history="1">
+          <w:hyperlink w:anchor="_Toc242218139" w:history="1">
             <w:r>
               <w:rPr>
                 <w:rStyle w:val="Hyperlink"/>
@@ -1017,7 +1017,7 @@
               <w:rPr>
                 <w:noProof/>
               </w:rPr>
-              <w:instrText xml:space="preserve"> PAGEREF _Toc242180330 \h </w:instrText>
+              <w:instrText xml:space="preserve"> PAGEREF _Toc242218139 \h </w:instrText>
             </w:r>
             <w:r>
               <w:rPr>
@@ -1058,7 +1058,7 @@
               <w:szCs w:val="22"/>
             </w:rPr>
           </w:pPr>
-          <w:hyperlink w:anchor="_Toc242180331" w:history="1">
+          <w:hyperlink w:anchor="_Toc242218140" w:history="1">
             <w:r>
               <w:rPr>
                 <w:rStyle w:val="Hyperlink"/>
@@ -1082,7 +1082,7 @@
               <w:rPr>
                 <w:noProof/>
               </w:rPr>
-              <w:instrText xml:space="preserve"> PAGEREF _Toc242180331 \h </w:instrText>
+              <w:instrText xml:space="preserve"> PAGEREF _Toc242218140 \h </w:instrText>
             </w:r>
             <w:r>
               <w:rPr>
@@ -1123,7 +1123,7 @@
               <w:szCs w:val="22"/>
             </w:rPr>
           </w:pPr>
-          <w:hyperlink w:anchor="_Toc242180332" w:history="1">
+          <w:hyperlink w:anchor="_Toc242218141" w:history="1">
             <w:r>
               <w:rPr>
                 <w:rStyle w:val="Hyperlink"/>
@@ -1147,7 +1147,7 @@
               <w:rPr>
                 <w:noProof/>
               </w:rPr>
-              <w:instrText xml:space="preserve"> PAGEREF _Toc242180332 \h </w:instrText>
+              <w:instrText xml:space="preserve"> PAGEREF _Toc242218141 \h </w:instrText>
             </w:r>
             <w:r>
               <w:rPr>
@@ -1188,7 +1188,7 @@
               <w:szCs w:val="22"/>
             </w:rPr>
           </w:pPr>
-          <w:hyperlink w:anchor="_Toc242180333" w:history="1">
+          <w:hyperlink w:anchor="_Toc242218142" w:history="1">
             <w:r>
               <w:rPr>
                 <w:rStyle w:val="Hyperlink"/>
@@ -1212,7 +1212,7 @@
               <w:rPr>
                 <w:noProof/>
               </w:rPr>
-              <w:instrText xml:space="preserve"> PAGEREF _Toc242180333 \h </w:instrText>
+              <w:instrText xml:space="preserve"> PAGEREF _Toc242218142 \h </w:instrText>
             </w:r>
             <w:r>
               <w:rPr>
@@ -1253,7 +1253,7 @@
               <w:szCs w:val="22"/>
             </w:rPr>
           </w:pPr>
-          <w:hyperlink w:anchor="_Toc242180334" w:history="1">
+          <w:hyperlink w:anchor="_Toc242218143" w:history="1">
             <w:r>
               <w:rPr>
                 <w:rStyle w:val="Hyperlink"/>
@@ -1277,7 +1277,7 @@
               <w:rPr>
                 <w:noProof/>
               </w:rPr>
-              <w:instrText xml:space="preserve"> PAGEREF _Toc242180334 \h </w:instrText>
+              <w:instrText xml:space="preserve"> PAGEREF _Toc242218143 \h </w:instrText>
             </w:r>
             <w:r>
               <w:rPr>
@@ -1318,7 +1318,7 @@
               <w:szCs w:val="22"/>
             </w:rPr>
           </w:pPr>
-          <w:hyperlink w:anchor="_Toc242180335" w:history="1">
+          <w:hyperlink w:anchor="_Toc242218144" w:history="1">
             <w:r>
               <w:rPr>
                 <w:rStyle w:val="Hyperlink"/>
@@ -1342,7 +1342,7 @@
               <w:rPr>
                 <w:noProof/>
               </w:rPr>
-              <w:instrText xml:space="preserve"> PAGEREF _Toc242180335 \h </w:instrText>
+              <w:instrText xml:space="preserve"> PAGEREF _Toc242218144 \h </w:instrText>
             </w:r>
             <w:r>
               <w:rPr>
@@ -1383,7 +1383,7 @@
               <w:szCs w:val="22"/>
             </w:rPr>
           </w:pPr>
-          <w:hyperlink w:anchor="_Toc242180336" w:history="1">
+          <w:hyperlink w:anchor="_Toc242218145" w:history="1">
             <w:r>
               <w:rPr>
                 <w:rStyle w:val="Hyperlink"/>
@@ -1407,7 +1407,7 @@
               <w:rPr>
                 <w:noProof/>
               </w:rPr>
-              <w:instrText xml:space="preserve"> PAGEREF _Toc242180336 \h </w:instrText>
+              <w:instrText xml:space="preserve"> PAGEREF _Toc242218145 \h </w:instrText>
             </w:r>
             <w:r>
               <w:rPr>
@@ -1448,7 +1448,7 @@
               <w:szCs w:val="22"/>
             </w:rPr>
           </w:pPr>
-          <w:hyperlink w:anchor="_Toc242180337" w:history="1">
+          <w:hyperlink w:anchor="_Toc242218146" w:history="1">
             <w:r>
               <w:rPr>
                 <w:rStyle w:val="Hyperlink"/>
@@ -1472,7 +1472,7 @@
               <w:rPr>
                 <w:noProof/>
               </w:rPr>
-              <w:instrText xml:space="preserve"> PAGEREF _Toc242180337 \h </w:instrText>
+              <w:instrText xml:space="preserve"> PAGEREF _Toc242218146 \h </w:instrText>
             </w:r>
             <w:r>
               <w:rPr>
@@ -1513,7 +1513,7 @@
               <w:szCs w:val="22"/>
             </w:rPr>
           </w:pPr>
-          <w:hyperlink w:anchor="_Toc242180338" w:history="1">
+          <w:hyperlink w:anchor="_Toc242218147" w:history="1">
             <w:r>
               <w:rPr>
                 <w:rStyle w:val="Hyperlink"/>
@@ -1537,7 +1537,7 @@
               <w:rPr>
                 <w:noProof/>
               </w:rPr>
-              <w:instrText xml:space="preserve"> PAGEREF _Toc242180338 \h </w:instrText>
+              <w:instrText xml:space="preserve"> PAGEREF _Toc242218147 \h </w:instrText>
             </w:r>
             <w:r>
               <w:rPr>
@@ -1578,7 +1578,7 @@
               <w:szCs w:val="22"/>
             </w:rPr>
           </w:pPr>
-          <w:hyperlink w:anchor="_Toc242180339" w:history="1">
+          <w:hyperlink w:anchor="_Toc242218148" w:history="1">
             <w:r>
               <w:rPr>
                 <w:rStyle w:val="Hyperlink"/>
@@ -1602,7 +1602,7 @@
               <w:rPr>
                 <w:noProof/>
               </w:rPr>
-              <w:instrText xml:space="preserve"> PAGEREF _Toc242180339 \h </w:instrText>
+              <w:instrText xml:space="preserve"> PAGEREF _Toc242218148 \h </w:instrText>
             </w:r>
             <w:r>
               <w:rPr>
@@ -1643,7 +1643,7 @@
               <w:szCs w:val="22"/>
             </w:rPr>
           </w:pPr>
-          <w:hyperlink w:anchor="_Toc242180340" w:history="1">
+          <w:hyperlink w:anchor="_Toc242218149" w:history="1">
             <w:r>
               <w:rPr>
                 <w:rStyle w:val="Hyperlink"/>
@@ -1667,7 +1667,7 @@
               <w:rPr>
                 <w:noProof/>
               </w:rPr>
-              <w:instrText xml:space="preserve"> PAGEREF _Toc242180340 \h </w:instrText>
+              <w:instrText xml:space="preserve"> PAGEREF _Toc242218149 \h </w:instrText>
             </w:r>
             <w:r>
               <w:rPr>
@@ -1708,7 +1708,7 @@
               <w:szCs w:val="22"/>
             </w:rPr>
           </w:pPr>
-          <w:hyperlink w:anchor="_Toc242180341" w:history="1">
+          <w:hyperlink w:anchor="_Toc242218150" w:history="1">
             <w:r>
               <w:rPr>
                 <w:rStyle w:val="Hyperlink"/>
@@ -1732,7 +1732,7 @@
               <w:rPr>
                 <w:noProof/>
               </w:rPr>
-              <w:instrText xml:space="preserve"> PAGEREF _Toc242180341 \h </w:instrText>
+              <w:instrText xml:space="preserve"> PAGEREF _Toc242218150 \h </w:instrText>
             </w:r>
             <w:r>
               <w:rPr>
@@ -1773,7 +1773,7 @@
               <w:szCs w:val="22"/>
             </w:rPr>
           </w:pPr>
-          <w:hyperlink w:anchor="_Toc242180342" w:history="1">
+          <w:hyperlink w:anchor="_Toc242218151" w:history="1">
             <w:r>
               <w:rPr>
                 <w:rStyle w:val="Hyperlink"/>
@@ -1797,7 +1797,7 @@
               <w:rPr>
                 <w:noProof/>
               </w:rPr>
-              <w:instrText xml:space="preserve"> PAGEREF _Toc242180342 \h </w:instrText>
+              <w:instrText xml:space="preserve"> PAGEREF _Toc242218151 \h </w:instrText>
             </w:r>
             <w:r>
               <w:rPr>
@@ -1838,7 +1838,7 @@
               <w:szCs w:val="22"/>
             </w:rPr>
           </w:pPr>
-          <w:hyperlink w:anchor="_Toc242180343" w:history="1">
+          <w:hyperlink w:anchor="_Toc242218152" w:history="1">
             <w:r>
               <w:rPr>
                 <w:rStyle w:val="Hyperlink"/>
@@ -1862,7 +1862,7 @@
               <w:rPr>
                 <w:noProof/>
               </w:rPr>
-              <w:instrText xml:space="preserve"> PAGEREF _Toc242180343 \h </w:instrText>
+              <w:instrText xml:space="preserve"> PAGEREF _Toc242218152 \h </w:instrText>
             </w:r>
             <w:r>
               <w:rPr>
@@ -1903,7 +1903,7 @@
               <w:szCs w:val="22"/>
             </w:rPr>
           </w:pPr>
-          <w:hyperlink w:anchor="_Toc242180344" w:history="1">
+          <w:hyperlink w:anchor="_Toc242218153" w:history="1">
             <w:r>
               <w:rPr>
                 <w:rStyle w:val="Hyperlink"/>
@@ -1927,7 +1927,7 @@
               <w:rPr>
                 <w:noProof/>
               </w:rPr>
-              <w:instrText xml:space="preserve"> PAGEREF _Toc242180344 \h </w:instrText>
+              <w:instrText xml:space="preserve"> PAGEREF _Toc242218153 \h </w:instrText>
             </w:r>
             <w:r>
               <w:rPr>
@@ -1968,7 +1968,7 @@
               <w:szCs w:val="22"/>
             </w:rPr>
           </w:pPr>
-          <w:hyperlink w:anchor="_Toc242180345" w:history="1">
+          <w:hyperlink w:anchor="_Toc242218154" w:history="1">
             <w:r>
               <w:rPr>
                 <w:rStyle w:val="Hyperlink"/>
@@ -1992,7 +1992,7 @@
               <w:rPr>
                 <w:noProof/>
               </w:rPr>
-              <w:instrText xml:space="preserve"> PAGEREF _Toc242180345 \h </w:instrText>
+              <w:instrText xml:space="preserve"> PAGEREF _Toc242218154 \h </w:instrText>
             </w:r>
             <w:r>
               <w:rPr>
@@ -2033,7 +2033,7 @@
               <w:szCs w:val="22"/>
             </w:rPr>
           </w:pPr>
-          <w:hyperlink w:anchor="_Toc242180346" w:history="1">
+          <w:hyperlink w:anchor="_Toc242218155" w:history="1">
             <w:r>
               <w:rPr>
                 <w:rStyle w:val="Hyperlink"/>
@@ -2057,7 +2057,7 @@
               <w:rPr>
                 <w:noProof/>
               </w:rPr>
-              <w:instrText xml:space="preserve"> PAGEREF _Toc242180346 \h </w:instrText>
+              <w:instrText xml:space="preserve"> PAGEREF _Toc242218155 \h </w:instrText>
             </w:r>
             <w:r>
               <w:rPr>
@@ -2098,7 +2098,7 @@
               <w:szCs w:val="22"/>
             </w:rPr>
           </w:pPr>
-          <w:hyperlink w:anchor="_Toc242180347" w:history="1">
+          <w:hyperlink w:anchor="_Toc242218156" w:history="1">
             <w:r>
               <w:rPr>
                 <w:rStyle w:val="Hyperlink"/>
@@ -2122,7 +2122,7 @@
               <w:rPr>
                 <w:noProof/>
               </w:rPr>
-              <w:instrText xml:space="preserve"> PAGEREF _Toc242180347 \h </w:instrText>
+              <w:instrText xml:space="preserve"> PAGEREF _Toc242218156 \h </w:instrText>
             </w:r>
             <w:r>
               <w:rPr>
@@ -2163,7 +2163,7 @@
               <w:szCs w:val="22"/>
             </w:rPr>
           </w:pPr>
-          <w:hyperlink w:anchor="_Toc242180348" w:history="1">
+          <w:hyperlink w:anchor="_Toc242218157" w:history="1">
             <w:r>
               <w:rPr>
                 <w:rStyle w:val="Hyperlink"/>
@@ -2187,7 +2187,7 @@
               <w:rPr>
                 <w:noProof/>
               </w:rPr>
-              <w:instrText xml:space="preserve"> PAGEREF _Toc242180348 \h </w:instrText>
+              <w:instrText xml:space="preserve"> PAGEREF _Toc242218157 \h </w:instrText>
             </w:r>
             <w:r>
               <w:rPr>
@@ -2228,7 +2228,7 @@
               <w:szCs w:val="22"/>
             </w:rPr>
           </w:pPr>
-          <w:hyperlink w:anchor="_Toc242180349" w:history="1">
+          <w:hyperlink w:anchor="_Toc242218158" w:history="1">
             <w:r>
               <w:rPr>
                 <w:rStyle w:val="Hyperlink"/>
@@ -2252,7 +2252,7 @@
               <w:rPr>
                 <w:noProof/>
               </w:rPr>
-              <w:instrText xml:space="preserve"> PAGEREF _Toc242180349 \h </w:instrText>
+              <w:instrText xml:space="preserve"> PAGEREF _Toc242218158 \h </w:instrText>
             </w:r>
             <w:r>
               <w:rPr>
@@ -2293,7 +2293,7 @@
               <w:szCs w:val="22"/>
             </w:rPr>
           </w:pPr>
-          <w:hyperlink w:anchor="_Toc242180350" w:history="1">
+          <w:hyperlink w:anchor="_Toc242218159" w:history="1">
             <w:r>
               <w:rPr>
                 <w:rStyle w:val="Hyperlink"/>
@@ -2317,7 +2317,7 @@
               <w:rPr>
                 <w:noProof/>
               </w:rPr>
-              <w:instrText xml:space="preserve"> PAGEREF _Toc242180350 \h </w:instrText>
+              <w:instrText xml:space="preserve"> PAGEREF _Toc242218159 \h </w:instrText>
             </w:r>
             <w:r>
               <w:rPr>
@@ -2358,7 +2358,7 @@
               <w:szCs w:val="22"/>
             </w:rPr>
           </w:pPr>
-          <w:hyperlink w:anchor="_Toc242180351" w:history="1">
+          <w:hyperlink w:anchor="_Toc242218160" w:history="1">
             <w:r>
               <w:rPr>
                 <w:rStyle w:val="Hyperlink"/>
@@ -2382,7 +2382,7 @@
               <w:rPr>
                 <w:noProof/>
               </w:rPr>
-              <w:instrText xml:space="preserve"> PAGEREF _Toc242180351 \h </w:instrText>
+              <w:instrText xml:space="preserve"> PAGEREF _Toc242218160 \h </w:instrText>
             </w:r>
             <w:r>
               <w:rPr>
@@ -2423,7 +2423,7 @@
               <w:szCs w:val="22"/>
             </w:rPr>
           </w:pPr>
-          <w:hyperlink w:anchor="_Toc242180352" w:history="1">
+          <w:hyperlink w:anchor="_Toc242218161" w:history="1">
             <w:r>
               <w:rPr>
                 <w:rStyle w:val="Hyperlink"/>
@@ -2447,7 +2447,7 @@
               <w:rPr>
                 <w:noProof/>
               </w:rPr>
-              <w:instrText xml:space="preserve"> PAGEREF _Toc242180352 \h </w:instrText>
+              <w:instrText xml:space="preserve"> PAGEREF _Toc242218161 \h </w:instrText>
             </w:r>
             <w:r>
               <w:rPr>
@@ -2488,7 +2488,7 @@
               <w:szCs w:val="22"/>
             </w:rPr>
           </w:pPr>
-          <w:hyperlink w:anchor="_Toc242180353" w:history="1">
+          <w:hyperlink w:anchor="_Toc242218162" w:history="1">
             <w:r>
               <w:rPr>
                 <w:rStyle w:val="Hyperlink"/>
@@ -2512,7 +2512,7 @@
               <w:rPr>
                 <w:noProof/>
               </w:rPr>
-              <w:instrText xml:space="preserve"> PAGEREF _Toc242180353 \h </w:instrText>
+              <w:instrText xml:space="preserve"> PAGEREF _Toc242218162 \h </w:instrText>
             </w:r>
             <w:r>
               <w:rPr>
@@ -2553,7 +2553,7 @@
               <w:szCs w:val="22"/>
             </w:rPr>
           </w:pPr>
-          <w:hyperlink w:anchor="_Toc242180354" w:history="1">
+          <w:hyperlink w:anchor="_Toc242218163" w:history="1">
             <w:r>
               <w:rPr>
                 <w:rStyle w:val="Hyperlink"/>
@@ -2577,7 +2577,7 @@
               <w:rPr>
                 <w:noProof/>
               </w:rPr>
-              <w:instrText xml:space="preserve"> PAGEREF _Toc242180354 \h </w:instrText>
+              <w:instrText xml:space="preserve"> PAGEREF _Toc242218163 \h </w:instrText>
             </w:r>
             <w:r>
               <w:rPr>
@@ -2618,7 +2618,7 @@
               <w:szCs w:val="22"/>
             </w:rPr>
           </w:pPr>
-          <w:hyperlink w:anchor="_Toc242180355" w:history="1">
+          <w:hyperlink w:anchor="_Toc242218164" w:history="1">
             <w:r>
               <w:rPr>
                 <w:rStyle w:val="Hyperlink"/>
@@ -2642,7 +2642,7 @@
               <w:rPr>
                 <w:noProof/>
               </w:rPr>
-              <w:instrText xml:space="preserve"> PAGEREF _Toc242180355 \h </w:instrText>
+              <w:instrText xml:space="preserve"> PAGEREF _Toc242218164 \h </w:instrText>
             </w:r>
             <w:r>
               <w:rPr>
@@ -2683,7 +2683,7 @@
               <w:szCs w:val="22"/>
             </w:rPr>
           </w:pPr>
-          <w:hyperlink w:anchor="_Toc242180356" w:history="1">
+          <w:hyperlink w:anchor="_Toc242218165" w:history="1">
             <w:r>
               <w:rPr>
                 <w:rStyle w:val="Hyperlink"/>
@@ -2707,7 +2707,7 @@
               <w:rPr>
                 <w:noProof/>
               </w:rPr>
-              <w:instrText xml:space="preserve"> PAGEREF _Toc242180356 \h </w:instrText>
+              <w:instrText xml:space="preserve"> PAGEREF _Toc242218165 \h </w:instrText>
             </w:r>
             <w:r>
               <w:rPr>
@@ -2748,7 +2748,7 @@
               <w:szCs w:val="22"/>
             </w:rPr>
           </w:pPr>
-          <w:hyperlink w:anchor="_Toc242180357" w:history="1">
+          <w:hyperlink w:anchor="_Toc242218166" w:history="1">
             <w:r>
               <w:rPr>
                 <w:rStyle w:val="Hyperlink"/>
@@ -2772,7 +2772,7 @@
               <w:rPr>
                 <w:noProof/>
               </w:rPr>
-              <w:instrText xml:space="preserve"> PAGEREF _Toc242180357 \h </w:instrText>
+              <w:instrText xml:space="preserve"> PAGEREF _Toc242218166 \h </w:instrText>
             </w:r>
             <w:r>
               <w:rPr>
@@ -2813,7 +2813,7 @@
               <w:szCs w:val="22"/>
             </w:rPr>
           </w:pPr>
-          <w:hyperlink w:anchor="_Toc242180358" w:history="1">
+          <w:hyperlink w:anchor="_Toc242218167" w:history="1">
             <w:r>
               <w:rPr>
                 <w:rStyle w:val="Hyperlink"/>
@@ -2837,7 +2837,7 @@
               <w:rPr>
                 <w:noProof/>
               </w:rPr>
-              <w:instrText xml:space="preserve"> PAGEREF _Toc242180358 \h </w:instrText>
+              <w:instrText xml:space="preserve"> PAGEREF _Toc242218167 \h </w:instrText>
             </w:r>
             <w:r>
               <w:rPr>
@@ -2878,7 +2878,7 @@
               <w:szCs w:val="22"/>
             </w:rPr>
           </w:pPr>
-          <w:hyperlink w:anchor="_Toc242180359" w:history="1">
+          <w:hyperlink w:anchor="_Toc242218168" w:history="1">
             <w:r>
               <w:rPr>
                 <w:rStyle w:val="Hyperlink"/>
@@ -2902,7 +2902,7 @@
               <w:rPr>
                 <w:noProof/>
               </w:rPr>
-              <w:instrText xml:space="preserve"> PAGEREF _Toc242180359 \h </w:instrText>
+              <w:instrText xml:space="preserve"> PAGEREF _Toc242218168 \h </w:instrText>
             </w:r>
             <w:r>
               <w:rPr>
@@ -2943,7 +2943,7 @@
               <w:szCs w:val="22"/>
             </w:rPr>
           </w:pPr>
-          <w:hyperlink w:anchor="_Toc242180360" w:history="1">
+          <w:hyperlink w:anchor="_Toc242218169" w:history="1">
             <w:r>
               <w:rPr>
                 <w:rStyle w:val="Hyperlink"/>
@@ -2967,7 +2967,7 @@
               <w:rPr>
                 <w:noProof/>
               </w:rPr>
-              <w:instrText xml:space="preserve"> PAGEREF _Toc242180360 \h </w:instrText>
+              <w:instrText xml:space="preserve"> PAGEREF _Toc242218169 \h </w:instrText>
             </w:r>
             <w:r>
               <w:rPr>
@@ -3006,7 +3006,7 @@
         <w:pStyle w:val="Heading1"/>
         <w:pageBreakBefore/>
       </w:pPr>
-      <w:bookmarkStart w:id="0" w:name="_Toc242180323"/>
+      <w:bookmarkStart w:id="0" w:name="_Toc242218132"/>
       <w:r>
         <w:lastRenderedPageBreak/>
         <w:t>1. About this guide</w:t>
@@ -3028,7 +3028,7 @@
       <w:pPr>
         <w:pStyle w:val="Heading2"/>
       </w:pPr>
-      <w:bookmarkStart w:id="1" w:name="_Toc242180324"/>
+      <w:bookmarkStart w:id="1" w:name="_Toc242218133"/>
       <w:r>
         <w:t>How to use it</w:t>
       </w:r>
@@ -3763,7 +3763,7 @@
         <w:pStyle w:val="Heading1"/>
         <w:pageBreakBefore/>
       </w:pPr>
-      <w:bookmarkStart w:id="2" w:name="_Toc242180325"/>
+      <w:bookmarkStart w:id="2" w:name="_Toc242218134"/>
       <w:r>
         <w:lastRenderedPageBreak/>
         <w:t>2. Solution overview</w:t>
@@ -3774,7 +3774,7 @@
       <w:pPr>
         <w:pStyle w:val="Heading2"/>
       </w:pPr>
-      <w:bookmarkStart w:id="3" w:name="_Toc242180326"/>
+      <w:bookmarkStart w:id="3" w:name="_Toc242218135"/>
       <w:r>
         <w:t>The business problem</w:t>
       </w:r>
@@ -3795,7 +3795,7 @@
       <w:pPr>
         <w:pStyle w:val="Heading2"/>
       </w:pPr>
-      <w:bookmarkStart w:id="4" w:name="_Toc242180327"/>
+      <w:bookmarkStart w:id="4" w:name="_Toc242218136"/>
       <w:r>
         <w:t>What LensS does</w:t>
       </w:r>
@@ -4201,7 +4201,7 @@
       <w:pPr>
         <w:pStyle w:val="Heading2"/>
       </w:pPr>
-      <w:bookmarkStart w:id="5" w:name="_Toc242180328"/>
+      <w:bookmarkStart w:id="5" w:name="_Toc242218137"/>
       <w:r>
         <w:t>Use cases in scope</w:t>
       </w:r>
@@ -4643,7 +4643,7 @@
       <w:pPr>
         <w:pStyle w:val="Heading2"/>
       </w:pPr>
-      <w:bookmarkStart w:id="6" w:name="_Toc242180329"/>
+      <w:bookmarkStart w:id="6" w:name="_Toc242218138"/>
       <w:r>
         <w:t>Why it is different</w:t>
       </w:r>
@@ -4761,7 +4761,7 @@
         <w:pStyle w:val="Heading1"/>
         <w:pageBreakBefore/>
       </w:pPr>
-      <w:bookmarkStart w:id="7" w:name="_Toc242180330"/>
+      <w:bookmarkStart w:id="7" w:name="_Toc242218139"/>
       <w:r>
         <w:lastRenderedPageBreak/>
         <w:t>3. Architecture</w:t>
@@ -4792,7 +4792,7 @@
           <w:noProof/>
         </w:rPr>
         <w:drawing>
-          <wp:inline distT="0" distB="0" distL="0" distR="0" wp14:anchorId="4F699A53" wp14:editId="2152455C">
+          <wp:inline distT="0" distB="0" distL="0" distR="0" wp14:anchorId="159A3755" wp14:editId="58496EF3">
             <wp:extent cx="6096000" cy="2809875"/>
             <wp:effectExtent l="0" t="0" r="0" b="0"/>
             <wp:docPr id="1" name="diagram-arch.png" descr="Figure 1. Solution architecture" title="Figure 1. Solution architecture"/>
@@ -4851,7 +4851,7 @@
       <w:pPr>
         <w:pStyle w:val="Heading2"/>
       </w:pPr>
-      <w:bookmarkStart w:id="8" w:name="_Toc242180331"/>
+      <w:bookmarkStart w:id="8" w:name="_Toc242218140"/>
       <w:r>
         <w:t>Components and why they were chosen</w:t>
       </w:r>
@@ -6310,7 +6310,7 @@
       <w:pPr>
         <w:pStyle w:val="Heading2"/>
       </w:pPr>
-      <w:bookmarkStart w:id="9" w:name="_Toc242180332"/>
+      <w:bookmarkStart w:id="9" w:name="_Toc242218141"/>
       <w:r>
         <w:t>Security and access model</w:t>
       </w:r>
@@ -6417,7 +6417,7 @@
         <w:pStyle w:val="Heading1"/>
         <w:pageBreakBefore/>
       </w:pPr>
-      <w:bookmarkStart w:id="10" w:name="_Toc242180333"/>
+      <w:bookmarkStart w:id="10" w:name="_Toc242218142"/>
       <w:r>
         <w:lastRenderedPageBreak/>
         <w:t>4. Data foundation</w:t>
@@ -6428,7 +6428,7 @@
       <w:pPr>
         <w:pStyle w:val="Heading2"/>
       </w:pPr>
-      <w:bookmarkStart w:id="11" w:name="_Toc242180334"/>
+      <w:bookmarkStart w:id="11" w:name="_Toc242218143"/>
       <w:r>
         <w:t>The demo dataset</w:t>
       </w:r>
@@ -7132,7 +7132,7 @@
       <w:pPr>
         <w:pStyle w:val="Heading2"/>
       </w:pPr>
-      <w:bookmarkStart w:id="12" w:name="_Toc242180335"/>
+      <w:bookmarkStart w:id="12" w:name="_Toc242218144"/>
       <w:r>
         <w:t>Layered data design (medallion architecture)</w:t>
       </w:r>
@@ -7822,7 +7822,7 @@
       <w:pPr>
         <w:pStyle w:val="Heading2"/>
       </w:pPr>
-      <w:bookmarkStart w:id="13" w:name="_Toc242180336"/>
+      <w:bookmarkStart w:id="13" w:name="_Toc242218145"/>
       <w:r>
         <w:lastRenderedPageBreak/>
         <w:t>Metric views</w:t>
@@ -8181,7 +8181,7 @@
       <w:pPr>
         <w:pStyle w:val="Heading2"/>
       </w:pPr>
-      <w:bookmarkStart w:id="14" w:name="_Toc242180337"/>
+      <w:bookmarkStart w:id="14" w:name="_Toc242218146"/>
       <w:r>
         <w:t>Certified and Command Center views</w:t>
       </w:r>
@@ -8205,7 +8205,7 @@
       <w:pPr>
         <w:pStyle w:val="Heading2"/>
       </w:pPr>
-      <w:bookmarkStart w:id="15" w:name="_Toc242180338"/>
+      <w:bookmarkStart w:id="15" w:name="_Toc242218147"/>
       <w:r>
         <w:t>Business rules captured as data</w:t>
       </w:r>
@@ -8784,7 +8784,7 @@
         <w:pStyle w:val="Heading1"/>
         <w:pageBreakBefore/>
       </w:pPr>
-      <w:bookmarkStart w:id="16" w:name="_Toc242180339"/>
+      <w:bookmarkStart w:id="16" w:name="_Toc242218148"/>
       <w:r>
         <w:lastRenderedPageBreak/>
         <w:t>5. The AI and its safeguards</w:t>
@@ -8795,7 +8795,7 @@
       <w:pPr>
         <w:pStyle w:val="Heading2"/>
       </w:pPr>
-      <w:bookmarkStart w:id="17" w:name="_Toc242180340"/>
+      <w:bookmarkStart w:id="17" w:name="_Toc242218149"/>
       <w:r>
         <w:t>The LensS query engine (Genie)</w:t>
       </w:r>
@@ -9739,7 +9739,7 @@
       <w:pPr>
         <w:pStyle w:val="Heading2"/>
       </w:pPr>
-      <w:bookmarkStart w:id="18" w:name="_Toc242180341"/>
+      <w:bookmarkStart w:id="18" w:name="_Toc242218150"/>
       <w:r>
         <w:t>How a question is answered</w:t>
       </w:r>
@@ -9755,7 +9755,7 @@
           <w:noProof/>
         </w:rPr>
         <w:drawing>
-          <wp:inline distT="0" distB="0" distL="0" distR="0" wp14:anchorId="6C3BA0C7" wp14:editId="4693E1A3">
+          <wp:inline distT="0" distB="0" distL="0" distR="0" wp14:anchorId="14324D87" wp14:editId="68D4E113">
             <wp:extent cx="6096000" cy="1543050"/>
             <wp:effectExtent l="0" t="0" r="0" b="0"/>
             <wp:docPr id="2" name="diagram-flow.png" descr="Figure 2. How a question is answered" title="Figure 2. How a question is answered"/>
@@ -9814,7 +9814,7 @@
       <w:pPr>
         <w:pStyle w:val="Heading2"/>
       </w:pPr>
-      <w:bookmarkStart w:id="19" w:name="_Toc242180342"/>
+      <w:bookmarkStart w:id="19" w:name="_Toc242218151"/>
       <w:r>
         <w:t>One assistant, wh</w:t>
       </w:r>
@@ -9913,7 +9913,7 @@
       <w:pPr>
         <w:pStyle w:val="Heading2"/>
       </w:pPr>
-      <w:bookmarkStart w:id="20" w:name="_Toc242180343"/>
+      <w:bookmarkStart w:id="20" w:name="_Toc242218152"/>
       <w:r>
         <w:lastRenderedPageBreak/>
         <w:t>Safeguards</w:t>
@@ -10462,7 +10462,7 @@
         <w:pStyle w:val="Heading1"/>
         <w:pageBreakBefore/>
       </w:pPr>
-      <w:bookmarkStart w:id="21" w:name="_Toc242180344"/>
+      <w:bookmarkStart w:id="21" w:name="_Toc242218153"/>
       <w:r>
         <w:lastRenderedPageBreak/>
         <w:t>6. The LensS application</w:t>
@@ -10481,7 +10481,7 @@
       <w:pPr>
         <w:pStyle w:val="Heading2"/>
       </w:pPr>
-      <w:bookmarkStart w:id="22" w:name="_Toc242180345"/>
+      <w:bookmarkStart w:id="22" w:name="_Toc242218154"/>
       <w:r>
         <w:t>6.1 Command Center: one story in five chapters</w:t>
       </w:r>
@@ -10529,7 +10529,7 @@
           <w:noProof/>
         </w:rPr>
         <w:drawing>
-          <wp:inline distT="0" distB="0" distL="0" distR="0" wp14:anchorId="3244010F" wp14:editId="75E963EE">
+          <wp:inline distT="0" distB="0" distL="0" distR="0" wp14:anchorId="49CB761C" wp14:editId="1D7EF2B4">
             <wp:extent cx="5905500" cy="3695700"/>
             <wp:effectExtent l="0" t="0" r="0" b="0"/>
             <wp:docPr id="3" name="cc-1-on-track.png" descr="Figure 3. Chapter 1: the verdict, progress and month-end outlook" title="Figure 3. Chapter 1: the verdict, progress and month-end outlook"/>
@@ -10702,7 +10702,7 @@
           <w:noProof/>
         </w:rPr>
         <w:drawing>
-          <wp:inline distT="0" distB="0" distL="0" distR="0" wp14:anchorId="15AB863E" wp14:editId="7049B7D6">
+          <wp:inline distT="0" distB="0" distL="0" distR="0" wp14:anchorId="2A31B7C3" wp14:editId="50637B8C">
             <wp:extent cx="5905500" cy="3228975"/>
             <wp:effectExtent l="0" t="0" r="0" b="0"/>
             <wp:docPr id="4" name="cc-2-book-health.png" descr="Figure 4. Chapter 2: vital signs and the arrears-stage snapshot" title="Figure 4. Chapter 2: vital signs and the arrears-stage snapshot"/>
@@ -10860,7 +10860,7 @@
           <w:noProof/>
         </w:rPr>
         <w:drawing>
-          <wp:inline distT="0" distB="0" distL="0" distR="0" wp14:anchorId="571E793D" wp14:editId="471DF399">
+          <wp:inline distT="0" distB="0" distL="0" distR="0" wp14:anchorId="13877D2F" wp14:editId="4FDA26F3">
             <wp:extent cx="5905500" cy="3143250"/>
             <wp:effectExtent l="0" t="0" r="0" b="0"/>
             <wp:docPr id="5" name="cc-3-holding-back.png" descr="Figure 5. Chapter 3: five issues ranked by risk and money" title="Figure 5. Chapter 3: five issues ranked by risk and money"/>
@@ -11749,7 +11749,7 @@
         <w:pStyle w:val="Heading3"/>
       </w:pPr>
       <w:r>
-        <w:t>Chapter 4 · Where is the money?</w:t>
+        <w:t>Chapter 4 · What should we do this week?</w:t>
       </w:r>
     </w:p>
     <w:p>
@@ -11762,10 +11762,10 @@
           <w:noProof/>
         </w:rPr>
         <w:drawing>
-          <wp:inline distT="0" distB="0" distL="0" distR="0" wp14:anchorId="631717A3" wp14:editId="07F2A701">
-            <wp:extent cx="5905500" cy="2686050"/>
+          <wp:inline distT="0" distB="0" distL="0" distR="0" wp14:anchorId="7F151EED" wp14:editId="68506474">
+            <wp:extent cx="5905500" cy="1609725"/>
             <wp:effectExtent l="0" t="0" r="0" b="0"/>
-            <wp:docPr id="6" name="cc-4-money.png" descr="Figure 6. Chapter 4: recoverable now, and the priority accounts worth the most" title="Figure 6. Chapter 4: recoverable now, and the priority accounts worth the most"/>
+            <wp:docPr id="6" name="cc-4-this-week.png" descr="Figure 6. Chapter 4: this week’s work queues, most urgent first" title="Figure 6. Chapter 4: this week’s work queues, most urgent first"/>
             <wp:cNvGraphicFramePr>
               <a:graphicFrameLocks xmlns:a="http://schemas.openxmlformats.org/drawingml/2006/main" noChangeAspect="1"/>
             </wp:cNvGraphicFramePr>
@@ -11788,7 +11788,7 @@
                   <pic:spPr bwMode="auto">
                     <a:xfrm>
                       <a:off x="0" y="0"/>
-                      <a:ext cx="5905500" cy="2686050"/>
+                      <a:ext cx="5905500" cy="1609725"/>
                     </a:xfrm>
                     <a:prstGeom prst="rect">
                       <a:avLst/>
@@ -11814,123 +11814,7 @@
           <w:sz w:val="18"/>
           <w:szCs w:val="18"/>
         </w:rPr>
-        <w:t>Figure 6. Chapter 4: recoverable now, and the priority accounts worth the most</w:t>
-      </w:r>
-    </w:p>
-    <w:p>
-      <w:pPr>
-        <w:pStyle w:val="ListParagraph"/>
-        <w:numPr>
-          <w:ilvl w:val="0"/>
-          <w:numId w:val="2"/>
-        </w:numPr>
-        <w:spacing w:after="60" w:line="264" w:lineRule="auto"/>
-      </w:pPr>
-      <w:r>
-        <w:t>₹</w:t>
-      </w:r>
-      <w:r>
-        <w:t>6.4M can be recovered now from 604 priority accounts: high-risk c</w:t>
-      </w:r>
-      <w:r>
-        <w:t>ustomers still likely to pay. Credit Card holds the most (₹2.0M).</w:t>
-      </w:r>
-    </w:p>
-    <w:p>
-      <w:pPr>
-        <w:pStyle w:val="ListParagraph"/>
-        <w:numPr>
-          <w:ilvl w:val="0"/>
-          <w:numId w:val="2"/>
-        </w:numPr>
-        <w:spacing w:after="60" w:line="264" w:lineRule="auto"/>
-      </w:pPr>
-      <w:r>
-        <w:t xml:space="preserve">The 8 priority accounts worth the most, with why they aren't paying and the next step for each; </w:t>
-      </w:r>
-      <w:r>
-        <w:rPr>
-          <w:b/>
-          <w:bCs/>
-        </w:rPr>
-        <w:t>View all 604</w:t>
-      </w:r>
-      <w:r>
-        <w:t>.</w:t>
-      </w:r>
-    </w:p>
-    <w:p>
-      <w:pPr>
-        <w:pStyle w:val="Heading3"/>
-      </w:pPr>
-      <w:r>
-        <w:lastRenderedPageBreak/>
-        <w:t>Chapter 5 · What should we do this week?</w:t>
-      </w:r>
-    </w:p>
-    <w:p>
-      <w:pPr>
-        <w:spacing w:before="80" w:after="40"/>
-        <w:jc w:val="center"/>
-      </w:pPr>
-      <w:r>
-        <w:rPr>
-          <w:noProof/>
-        </w:rPr>
-        <w:drawing>
-          <wp:inline distT="0" distB="0" distL="0" distR="0" wp14:anchorId="02FD7C3A" wp14:editId="51936CA6">
-            <wp:extent cx="5905500" cy="3609975"/>
-            <wp:effectExtent l="0" t="0" r="0" b="0"/>
-            <wp:docPr id="7" name="cc-5-this-week.png" descr="Figure 7. Chapter 5: the work queues and how to handle each priority customer" title="Figure 7. Chapter 5: the work queues and how to handle each priority customer"/>
-            <wp:cNvGraphicFramePr>
-              <a:graphicFrameLocks xmlns:a="http://schemas.openxmlformats.org/drawingml/2006/main" noChangeAspect="1"/>
-            </wp:cNvGraphicFramePr>
-            <a:graphic xmlns:a="http://schemas.openxmlformats.org/drawingml/2006/main">
-              <a:graphicData uri="http://schemas.openxmlformats.org/drawingml/2006/picture">
-                <pic:pic xmlns:pic="http://schemas.openxmlformats.org/drawingml/2006/picture">
-                  <pic:nvPicPr>
-                    <pic:cNvPr id="0" name=""/>
-                    <pic:cNvPicPr>
-                      <a:picLocks noChangeAspect="1" noChangeArrowheads="1"/>
-                    </pic:cNvPicPr>
-                  </pic:nvPicPr>
-                  <pic:blipFill>
-                    <a:blip r:embed="rId13"/>
-                    <a:srcRect/>
-                    <a:stretch>
-                      <a:fillRect/>
-                    </a:stretch>
-                  </pic:blipFill>
-                  <pic:spPr bwMode="auto">
-                    <a:xfrm>
-                      <a:off x="0" y="0"/>
-                      <a:ext cx="5905500" cy="3609975"/>
-                    </a:xfrm>
-                    <a:prstGeom prst="rect">
-                      <a:avLst/>
-                    </a:prstGeom>
-                  </pic:spPr>
-                </pic:pic>
-              </a:graphicData>
-            </a:graphic>
-          </wp:inline>
-        </w:drawing>
-      </w:r>
-    </w:p>
-    <w:p>
-      <w:pPr>
-        <w:spacing w:after="160"/>
-        <w:jc w:val="center"/>
-      </w:pPr>
-      <w:r>
-        <w:rPr>
-          <w:i/>
-          <w:iCs/>
-          <w:color w:val="5B6472"/>
-          <w:sz w:val="18"/>
-          <w:szCs w:val="18"/>
-        </w:rPr>
-        <w:t>Figure 7. Chapter 5: the work queues and how to handle each priority customer</w:t>
+        <w:t>Figure 6. Chapter 4: this week’s work queues, most urgent first</w:t>
       </w:r>
     </w:p>
     <w:tbl>
@@ -12252,7 +12136,7 @@
                 <w:sz w:val="20"/>
                 <w:szCs w:val="20"/>
               </w:rPr>
-              <w:t>610 · ₹27.2M</w:t>
+              <w:t>610 of 1,198 due this week · ₹27.2M</w:t>
             </w:r>
           </w:p>
         </w:tc>
@@ -12405,7 +12289,7 @@
                 <w:sz w:val="20"/>
                 <w:szCs w:val="20"/>
               </w:rPr>
-              <w:t>588 · ₹25.4M</w:t>
+              <w:t>588 of 1,198 · ₹25.4M</w:t>
             </w:r>
           </w:p>
         </w:tc>
@@ -12748,29 +12632,11 @@
     </w:tbl>
     <w:p>
       <w:pPr>
-        <w:spacing w:after="120" w:line="276" w:lineRule="auto"/>
-      </w:pPr>
-      <w:r>
-        <w:rPr>
-          <w:b/>
-          <w:bCs/>
-        </w:rPr>
-        <w:t>How to handle each priority customer:</w:t>
-      </w:r>
-      <w:r>
-        <w:t xml:space="preserve"> one next step per account from the intervention rule in the data pack, checked in order: dispute → dispute resolution (72); vulnerable → hardship</w:t>
-      </w:r>
-      <w:r>
-        <w:t xml:space="preserve"> support (136); broken promise with propensity ≥ 0.35 → immediate follow-up; not reached and prefers a digital channel → digital journey (229); risk ≥ 0.80 and balance ≥ ₹50K → specialist collector (24); otherwise prioritised outreach (143).</w:t>
-      </w:r>
-    </w:p>
-    <w:p>
-      <w:pPr>
         <w:pStyle w:val="Heading3"/>
       </w:pPr>
       <w:r>
         <w:lastRenderedPageBreak/>
-        <w:t>View accounts</w:t>
+        <w:t>Chapter 5 · What more can we recover from high-risk customers?</w:t>
       </w:r>
     </w:p>
     <w:p>
@@ -12783,7 +12649,138 @@
           <w:noProof/>
         </w:rPr>
         <w:drawing>
-          <wp:inline distT="0" distB="0" distL="0" distR="0" wp14:anchorId="1FBC0343" wp14:editId="0AD5DB7D">
+          <wp:inline distT="0" distB="0" distL="0" distR="0" wp14:anchorId="6F2AA7CE" wp14:editId="527478BB">
+            <wp:extent cx="5905500" cy="5000625"/>
+            <wp:effectExtent l="0" t="0" r="0" b="0"/>
+            <wp:docPr id="7" name="cc-5-high-risk.png" descr="Figure 7. Chapter 5: beyond this week, the high-risk customers still worth recovering, and one next step each" title="Figure 7. Chapter 5: beyond this week, the high-risk customers still worth recovering, and one next step each"/>
+            <wp:cNvGraphicFramePr>
+              <a:graphicFrameLocks xmlns:a="http://schemas.openxmlformats.org/drawingml/2006/main" noChangeAspect="1"/>
+            </wp:cNvGraphicFramePr>
+            <a:graphic xmlns:a="http://schemas.openxmlformats.org/drawingml/2006/main">
+              <a:graphicData uri="http://schemas.openxmlformats.org/drawingml/2006/picture">
+                <pic:pic xmlns:pic="http://schemas.openxmlformats.org/drawingml/2006/picture">
+                  <pic:nvPicPr>
+                    <pic:cNvPr id="0" name=""/>
+                    <pic:cNvPicPr>
+                      <a:picLocks noChangeAspect="1" noChangeArrowheads="1"/>
+                    </pic:cNvPicPr>
+                  </pic:nvPicPr>
+                  <pic:blipFill>
+                    <a:blip r:embed="rId13"/>
+                    <a:srcRect/>
+                    <a:stretch>
+                      <a:fillRect/>
+                    </a:stretch>
+                  </pic:blipFill>
+                  <pic:spPr bwMode="auto">
+                    <a:xfrm>
+                      <a:off x="0" y="0"/>
+                      <a:ext cx="5905500" cy="5000625"/>
+                    </a:xfrm>
+                    <a:prstGeom prst="rect">
+                      <a:avLst/>
+                    </a:prstGeom>
+                  </pic:spPr>
+                </pic:pic>
+              </a:graphicData>
+            </a:graphic>
+          </wp:inline>
+        </w:drawing>
+      </w:r>
+    </w:p>
+    <w:p>
+      <w:pPr>
+        <w:spacing w:after="160"/>
+        <w:jc w:val="center"/>
+      </w:pPr>
+      <w:r>
+        <w:rPr>
+          <w:i/>
+          <w:iCs/>
+          <w:color w:val="5B6472"/>
+          <w:sz w:val="18"/>
+          <w:szCs w:val="18"/>
+        </w:rPr>
+        <w:t>Figure 7. Chapter 5: beyond this week, the high-risk customers still worth recovering, and one next step each</w:t>
+      </w:r>
+    </w:p>
+    <w:p>
+      <w:pPr>
+        <w:pStyle w:val="ListParagraph"/>
+        <w:numPr>
+          <w:ilvl w:val="0"/>
+          <w:numId w:val="2"/>
+        </w:numPr>
+        <w:spacing w:after="60" w:line="264" w:lineRule="auto"/>
+      </w:pPr>
+      <w:r>
+        <w:t>Beyond this week’s plan, high-risk customers should not be written off: 604 of th</w:t>
+      </w:r>
+      <w:r>
+        <w:t>e 879 are still likely to pay, and ₹6.4M more can be recovered from them. Credit Card holds the most (₹2.0M).</w:t>
+      </w:r>
+    </w:p>
+    <w:p>
+      <w:pPr>
+        <w:pStyle w:val="ListParagraph"/>
+        <w:numPr>
+          <w:ilvl w:val="0"/>
+          <w:numId w:val="2"/>
+        </w:numPr>
+        <w:spacing w:after="60" w:line="264" w:lineRule="auto"/>
+      </w:pPr>
+      <w:r>
+        <w:t xml:space="preserve">The 8 priority accounts worth the most, with why they aren’t paying and the next step for each; </w:t>
+      </w:r>
+      <w:r>
+        <w:rPr>
+          <w:b/>
+          <w:bCs/>
+        </w:rPr>
+        <w:t>View all 604</w:t>
+      </w:r>
+      <w:r>
+        <w:t>.</w:t>
+      </w:r>
+    </w:p>
+    <w:p>
+      <w:pPr>
+        <w:spacing w:after="120" w:line="276" w:lineRule="auto"/>
+      </w:pPr>
+      <w:r>
+        <w:rPr>
+          <w:b/>
+          <w:bCs/>
+        </w:rPr>
+        <w:t>How to handle each priority customer:</w:t>
+      </w:r>
+      <w:r>
+        <w:t xml:space="preserve"> one next step per account from the intervention rule in the data pack, checked in order: dispute → dispute resolution (72); vulnerable → hardship support (136); broken promise with propensity ≥ 0.35 → immediate follow-</w:t>
+      </w:r>
+      <w:r>
+        <w:t>up; not reached and prefers a digital channel → digital journey (229); risk ≥ 0.80 and balance ≥ ₹50K → specialist collector (24); otherwise prioritised outreach (143).</w:t>
+      </w:r>
+    </w:p>
+    <w:p>
+      <w:pPr>
+        <w:pStyle w:val="Heading3"/>
+      </w:pPr>
+      <w:r>
+        <w:lastRenderedPageBreak/>
+        <w:t>View accounts</w:t>
+      </w:r>
+    </w:p>
+    <w:p>
+      <w:pPr>
+        <w:spacing w:before="80" w:after="40"/>
+        <w:jc w:val="center"/>
+      </w:pPr>
+      <w:r>
+        <w:rPr>
+          <w:noProof/>
+        </w:rPr>
+        <w:drawing>
+          <wp:inline distT="0" distB="0" distL="0" distR="0" wp14:anchorId="5948712D" wp14:editId="4B2AC3FB">
             <wp:extent cx="5905500" cy="3695700"/>
             <wp:effectExtent l="0" t="0" r="0" b="0"/>
             <wp:docPr id="8" name="cc-6-view-accounts.png" descr="Figure 8. Every figure opens its accounts: here, the 610 promises likely to break" title="Figure 8. Every figure opens its accounts: here, the 610 promises likely to break"/>
@@ -12835,7 +12832,17 @@
           <w:sz w:val="18"/>
           <w:szCs w:val="18"/>
         </w:rPr>
-        <w:t>Figure 8. Every figure opens its accounts: here, the 610 promises likely to break</w:t>
+        <w:t>Figure 8. Every figure opens its accounts: here, the 610 promises likel</w:t>
+      </w:r>
+      <w:r>
+        <w:rPr>
+          <w:i/>
+          <w:iCs/>
+          <w:color w:val="5B6472"/>
+          <w:sz w:val="18"/>
+          <w:szCs w:val="18"/>
+        </w:rPr>
+        <w:t>y to break</w:t>
       </w:r>
     </w:p>
     <w:p>
@@ -12873,7 +12880,7 @@
       <w:pPr>
         <w:pStyle w:val="Heading2"/>
       </w:pPr>
-      <w:bookmarkStart w:id="23" w:name="_Toc242180346"/>
+      <w:bookmarkStart w:id="23" w:name="_Toc242218155"/>
       <w:r>
         <w:t>6.2 Explorer</w:t>
       </w:r>
@@ -12889,7 +12896,7 @@
           <w:noProof/>
         </w:rPr>
         <w:drawing>
-          <wp:inline distT="0" distB="0" distL="0" distR="0" wp14:anchorId="4951FC16" wp14:editId="6940C23D">
+          <wp:inline distT="0" distB="0" distL="0" distR="0" wp14:anchorId="42AD5EF5" wp14:editId="1020B0A1">
             <wp:extent cx="5905500" cy="3695700"/>
             <wp:effectExtent l="0" t="0" r="0" b="0"/>
             <wp:docPr id="9" name="xp-1-filtered.png" descr="Figure 9. Explorer filtered to Personal Loan: each KPI compared with the portfolio" title="Figure 9. Explorer filtered to Personal Loan: each KPI compared with the portfolio"/>
@@ -12962,7 +12969,10 @@
         <w:t>Filters:</w:t>
       </w:r>
       <w:r>
-        <w:t xml:space="preserve"> product, arrears stage, region, preferred channel, treatment strategy, non-payment driver, collector team, balance band, vulnerability, last-contact and promise-due dates.</w:t>
+        <w:t xml:space="preserve"> product, arrears stage, region, preferred channel, treatment strategy, non-payment driver, collector team, balance band, vulnerability, l</w:t>
+      </w:r>
+      <w:r>
+        <w:t>ast-contact and promise-due dates.</w:t>
       </w:r>
     </w:p>
     <w:p>
@@ -12982,10 +12992,7 @@
         <w:t>12 KPI tiles</w:t>
       </w:r>
       <w:r>
-        <w:t xml:space="preserve"> for the filtered slice, with the share of the portfolio or the differe</w:t>
-      </w:r>
-      <w:r>
-        <w:t>nce in points, green when better and red when worse. With no filters, the Explorer reconciles exactly to the Command Center.</w:t>
+        <w:t xml:space="preserve"> for the filtered slice, with the share of the portfolio or the difference in points, green when better and red when worse. With no filters, the Explorer reconciles exactly to the Command Center.</w:t>
       </w:r>
     </w:p>
     <w:p>
@@ -13005,7 +13012,10 @@
         <w:t>Workspace:</w:t>
       </w:r>
       <w:r>
-        <w:t xml:space="preserve"> any dimension × measure, as bars (portfolio average marked) or a table; click a bar to filter.</w:t>
+        <w:t xml:space="preserve"> an</w:t>
+      </w:r>
+      <w:r>
+        <w:t>y dimension × measure, as bars (portfolio average marked) or a table; click a bar to filter.</w:t>
       </w:r>
     </w:p>
     <w:p>
@@ -13025,13 +13035,10 @@
         <w:t>Diagnostic panels:</w:t>
       </w:r>
       <w:r>
-        <w:t xml:space="preserve"> achiev</w:t>
-      </w:r>
-      <w:r>
-        <w:t>ement by product, where the shortfall comes from, a product × stage heatmap, non-payment drivers, treatment strategies (observational), the funnel from arrears to payment, channel effectiveness, best channel per stage, regions and collectors. Every item ha</w:t>
-      </w:r>
-      <w:r>
-        <w:t xml:space="preserve">s </w:t>
+        <w:t xml:space="preserve"> achievement by product, where the shortfall comes from, a product × stage heatmap, non-payment drivers, treatment strategies (observational), th</w:t>
+      </w:r>
+      <w:r>
+        <w:t xml:space="preserve">e funnel from arrears to payment, channel effectiveness, best channel per stage, regions and collectors. Every item has </w:t>
       </w:r>
       <w:r>
         <w:rPr>
@@ -13054,7 +13061,7 @@
           <w:noProof/>
         </w:rPr>
         <w:drawing>
-          <wp:inline distT="0" distB="0" distL="0" distR="0" wp14:anchorId="74688DBA" wp14:editId="6A12042A">
+          <wp:inline distT="0" distB="0" distL="0" distR="0" wp14:anchorId="5124B8E0" wp14:editId="08D53F8C">
             <wp:extent cx="5905500" cy="2162175"/>
             <wp:effectExtent l="0" t="0" r="0" b="0"/>
             <wp:docPr id="10" name="xp-2-heatmap.png" descr="Figure 10. Target achievement by product and arrears stage; click a cell to see its accounts" title="Figure 10. Target achievement by product and arrears stage; click a cell to see its accounts"/>
@@ -13119,7 +13126,7 @@
           <w:noProof/>
         </w:rPr>
         <w:drawing>
-          <wp:inline distT="0" distB="0" distL="0" distR="0" wp14:anchorId="5036B92A" wp14:editId="5E6A6E67">
+          <wp:inline distT="0" distB="0" distL="0" distR="0" wp14:anchorId="77F38CFC" wp14:editId="5574A96A">
             <wp:extent cx="3619500" cy="3105150"/>
             <wp:effectExtent l="0" t="0" r="0" b="0"/>
             <wp:docPr id="11" name="xp-3-funnel.png" descr="Figure 11. From arrears to payment, with the accounts at each step" title="Figure 11. From arrears to payment, with the accounts at each step"/>
@@ -13171,7 +13178,17 @@
           <w:sz w:val="18"/>
           <w:szCs w:val="18"/>
         </w:rPr>
-        <w:t>Figure 11. From arrears to payment, with the accounts at each step</w:t>
+        <w:t>Figu</w:t>
+      </w:r>
+      <w:r>
+        <w:rPr>
+          <w:i/>
+          <w:iCs/>
+          <w:color w:val="5B6472"/>
+          <w:sz w:val="18"/>
+          <w:szCs w:val="18"/>
+        </w:rPr>
+        <w:t>re 11. From arrears to payment, with the accounts at each step</w:t>
       </w:r>
     </w:p>
     <w:p>
@@ -13191,17 +13208,14 @@
         <w:t>Accounts behind the numbers:</w:t>
       </w:r>
       <w:r>
-        <w:t xml:space="preserve"> the 500 with the most reco</w:t>
-      </w:r>
-      <w:r>
-        <w:t>very opportunity in the current filters, with search, sort and Export CSV.</w:t>
+        <w:t xml:space="preserve"> the 500 with the most recovery opportunity in the current filters, with search, sort and Export CSV.</w:t>
       </w:r>
     </w:p>
     <w:p>
       <w:pPr>
         <w:pStyle w:val="Heading2"/>
       </w:pPr>
-      <w:bookmarkStart w:id="24" w:name="_Toc242180347"/>
+      <w:bookmarkStart w:id="24" w:name="_Toc242218156"/>
       <w:r>
         <w:lastRenderedPageBreak/>
         <w:t>6.3 Assistant</w:t>
@@ -13218,7 +13232,7 @@
           <w:noProof/>
         </w:rPr>
         <w:drawing>
-          <wp:inline distT="0" distB="0" distL="0" distR="0" wp14:anchorId="341A3FB5" wp14:editId="6E0AD7DF">
+          <wp:inline distT="0" distB="0" distL="0" distR="0" wp14:anchorId="779429BC" wp14:editId="0A121686">
             <wp:extent cx="5905500" cy="3695700"/>
             <wp:effectExtent l="0" t="0" r="0" b="0"/>
             <wp:docPr id="12" name="as-2-answer.png" descr="Figure 12. A quick answer with its chart (Chart / Table / SQL), actions and suggested follow-ups" title="Figure 12. A quick answer with its chart (Chart / Table / SQL), actions and suggested follow-ups"/>
@@ -13270,7 +13284,17 @@
           <w:sz w:val="18"/>
           <w:szCs w:val="18"/>
         </w:rPr>
-        <w:t>Figure 12. A quick answer with its chart (Chart / Table / SQL), actions and suggested follow-ups</w:t>
+        <w:t>Figure 12. A quick answer with its chart (Chart</w:t>
+      </w:r>
+      <w:r>
+        <w:rPr>
+          <w:i/>
+          <w:iCs/>
+          <w:color w:val="5B6472"/>
+          <w:sz w:val="18"/>
+          <w:szCs w:val="18"/>
+        </w:rPr>
+        <w:t xml:space="preserve"> / Table / SQL), actions and suggested follow-ups</w:t>
       </w:r>
     </w:p>
     <w:p>
@@ -13290,10 +13314,7 @@
         <w:t>Modes:</w:t>
       </w:r>
       <w:r>
-        <w:t xml:space="preserve"> Auto (default), Quick answer, Deep analysis. Deep analyses sh</w:t>
-      </w:r>
-      <w:r>
-        <w:t>ow their progress and can run while the user works elsewhere; a notification says when the answer is ready.</w:t>
+        <w:t xml:space="preserve"> Auto (default), Quick answer, Deep analysis. Deep analyses show their progress and can run while the user works elsewhere; a notification says when the answer is ready.</w:t>
       </w:r>
     </w:p>
     <w:p>
@@ -13335,10 +13356,7 @@
         <w:t>Details</w:t>
       </w:r>
       <w:r>
-        <w:t>: the quality score, data sources, safety checks and how the answer was made, including the SQ</w:t>
-      </w:r>
-      <w:r>
-        <w:t>L.</w:t>
+        <w:t>: the quality score, data sources, safety checks and how the answer was made, including the SQL.</w:t>
       </w:r>
     </w:p>
     <w:p>
@@ -13358,7 +13376,10 @@
         <w:t>Help to start:</w:t>
       </w:r>
       <w:r>
-        <w:t xml:space="preserve"> quick-start prompts and a categorised question library (executive, diagnostic, operational, risk and conduct, strategy). Suggested questions are pre-answered after each data refresh, so they return in seconds.</w:t>
+        <w:t xml:space="preserve"> quick-start prompts and a categorised question library (executive, diagnostic, operational, risk and conduct, strategy).</w:t>
+      </w:r>
+      <w:r>
+        <w:t xml:space="preserve"> Suggested questions are pre-answered after each data refresh, so they return in seconds.</w:t>
       </w:r>
     </w:p>
     <w:p>
@@ -13378,17 +13399,14 @@
         <w:t>Conversation:</w:t>
       </w:r>
       <w:r>
-        <w:t xml:space="preserve"> private chat h</w:t>
-      </w:r>
-      <w:r>
-        <w:t>istory per user, named from the first question, with search, rename, delete and PDF export.</w:t>
+        <w:t xml:space="preserve"> private chat history per user, named from the first question, with search, rename, delete and PDF export.</w:t>
       </w:r>
     </w:p>
     <w:p>
       <w:pPr>
         <w:pStyle w:val="Heading2"/>
       </w:pPr>
-      <w:bookmarkStart w:id="25" w:name="_Toc242180348"/>
+      <w:bookmarkStart w:id="25" w:name="_Toc242218157"/>
       <w:r>
         <w:lastRenderedPageBreak/>
         <w:t>6.4 Observability</w:t>
@@ -13405,7 +13423,7 @@
           <w:noProof/>
         </w:rPr>
         <w:drawing>
-          <wp:inline distT="0" distB="0" distL="0" distR="0" wp14:anchorId="31086D0A" wp14:editId="2B4BE92F">
+          <wp:inline distT="0" distB="0" distL="0" distR="0" wp14:anchorId="72F6C4A7" wp14:editId="7FE340C9">
             <wp:extent cx="5905500" cy="3695700"/>
             <wp:effectExtent l="0" t="0" r="0" b="0"/>
             <wp:docPr id="13" name="ob-1-overview.png" descr="Figure 13. Observability: health, headline measures and a governed decision trace" title="Figure 13. Observability: health, headline measures and a governed decision trace"/>
@@ -13470,7 +13488,7 @@
           <w:noProof/>
         </w:rPr>
         <w:drawing>
-          <wp:inline distT="0" distB="0" distL="0" distR="0" wp14:anchorId="1A3D6DAB" wp14:editId="41A4F870">
+          <wp:inline distT="0" distB="0" distL="0" distR="0" wp14:anchorId="4C39649E" wp14:editId="50D5D624">
             <wp:extent cx="5905500" cy="3695700"/>
             <wp:effectExtent l="0" t="0" r="0" b="0"/>
             <wp:docPr id="14" name="ob-2-quality.png" descr="Figure 14. Answer quality and faithfulness" title="Figure 14. Answer quality and faithfulness"/>
@@ -14106,7 +14124,7 @@
         <w:pStyle w:val="Heading1"/>
         <w:pageBreakBefore/>
       </w:pPr>
-      <w:bookmarkStart w:id="26" w:name="_Toc242180349"/>
+      <w:bookmarkStart w:id="26" w:name="_Toc242218158"/>
       <w:r>
         <w:lastRenderedPageBreak/>
         <w:t>7. Deployment and operations</w:t>
@@ -15337,7 +15355,7 @@
         <w:pStyle w:val="Heading1"/>
         <w:pageBreakBefore/>
       </w:pPr>
-      <w:bookmarkStart w:id="27" w:name="_Toc242180350"/>
+      <w:bookmarkStart w:id="27" w:name="_Toc242218159"/>
       <w:r>
         <w:lastRenderedPageBreak/>
         <w:t>8. Before the demo</w:t>
@@ -15348,7 +15366,7 @@
       <w:pPr>
         <w:pStyle w:val="Heading2"/>
       </w:pPr>
-      <w:bookmarkStart w:id="28" w:name="_Toc242180351"/>
+      <w:bookmarkStart w:id="28" w:name="_Toc242218160"/>
       <w:r>
         <w:t>Checklist</w:t>
       </w:r>
@@ -15505,7 +15523,7 @@
       <w:pPr>
         <w:pStyle w:val="Heading2"/>
       </w:pPr>
-      <w:bookmarkStart w:id="29" w:name="_Toc242180352"/>
+      <w:bookmarkStart w:id="29" w:name="_Toc242218161"/>
       <w:r>
         <w:t>Presenter tips</w:t>
       </w:r>
@@ -15558,7 +15576,7 @@
         <w:pStyle w:val="Heading1"/>
         <w:pageBreakBefore/>
       </w:pPr>
-      <w:bookmarkStart w:id="30" w:name="_Toc242180353"/>
+      <w:bookmarkStart w:id="30" w:name="_Toc242218162"/>
       <w:r>
         <w:lastRenderedPageBreak/>
         <w:t>9. Demo script (20 minutes)</w:t>
@@ -16289,7 +16307,7 @@
       <w:pPr>
         <w:pStyle w:val="Heading2"/>
       </w:pPr>
-      <w:bookmarkStart w:id="31" w:name="_Toc242180354"/>
+      <w:bookmarkStart w:id="31" w:name="_Toc242218163"/>
       <w:r>
         <w:t>Scene by scene</w:t>
       </w:r>
@@ -16853,7 +16871,7 @@
                 <w:sz w:val="20"/>
                 <w:szCs w:val="20"/>
               </w:rPr>
-              <w:t>4 · The money</w:t>
+              <w:t>4 · This week</w:t>
             </w:r>
           </w:p>
         </w:tc>
@@ -16882,7 +16900,7 @@
                 <w:sz w:val="20"/>
                 <w:szCs w:val="20"/>
               </w:rPr>
-              <w:t>"₹6.4M recoverable now from 604 priority accounts; here are the eight worth the most."</w:t>
+              <w:t>"Save 610 of this week’s 1,198 promises today, remind the other 588, work 492 high-value accounts, stop 999 reaching 180+."</w:t>
             </w:r>
           </w:p>
         </w:tc>
@@ -16911,7 +16929,7 @@
                 <w:sz w:val="20"/>
                 <w:szCs w:val="20"/>
               </w:rPr>
-              <w:t>Point at the accounts and their next steps</w:t>
+              <w:t>View accounts on Today: the call list</w:t>
             </w:r>
           </w:p>
         </w:tc>
@@ -16948,7 +16966,7 @@
                 <w:sz w:val="20"/>
                 <w:szCs w:val="20"/>
               </w:rPr>
-              <w:t>5 · This week</w:t>
+              <w:t>5 · High-risk</w:t>
             </w:r>
           </w:p>
         </w:tc>
@@ -16977,7 +16995,7 @@
                 <w:sz w:val="20"/>
                 <w:szCs w:val="20"/>
               </w:rPr>
-              <w:t>"Save 610 promises today, remind 588, work 492 high-value accounts, stop 999 reaching 180+, with vulnerable customers supported first."</w:t>
+              <w:t>"Beyond this week, don’t write off high-risk customers: 604 of 879 are still likely to pay, ₹6.4M more. Each gets one next step, vulnerable customers supported first."</w:t>
             </w:r>
           </w:p>
         </w:tc>
@@ -17006,7 +17024,7 @@
                 <w:sz w:val="20"/>
                 <w:szCs w:val="20"/>
               </w:rPr>
-              <w:t>View accounts on Today: the call list</w:t>
+              <w:t>Point at the accounts and How to handle each priority customer</w:t>
             </w:r>
           </w:p>
         </w:tc>
@@ -17072,7 +17090,14 @@
                 <w:sz w:val="20"/>
                 <w:szCs w:val="20"/>
               </w:rPr>
-              <w:t>"The Command Center says what; the Explorer finds where."</w:t>
+              <w:t>"The Command Ce</w:t>
+            </w:r>
+            <w:r>
+              <w:rPr>
+                <w:sz w:val="20"/>
+                <w:szCs w:val="20"/>
+              </w:rPr>
+              <w:t>nter says what; the Explorer finds where."</w:t>
             </w:r>
           </w:p>
         </w:tc>
@@ -17101,14 +17126,7 @@
                 <w:sz w:val="20"/>
                 <w:szCs w:val="20"/>
               </w:rPr>
-              <w:t>Filter Persona</w:t>
-            </w:r>
-            <w:r>
-              <w:rPr>
-                <w:sz w:val="20"/>
-                <w:szCs w:val="20"/>
-              </w:rPr>
-              <w:t>l Loan; click a red heatmap cell; View on "Kept the promise"; Reset</w:t>
+              <w:t>Filter Personal Loan; click a red heatmap cell; View on "Kept the promise"; Reset</w:t>
             </w:r>
           </w:p>
         </w:tc>
@@ -17404,7 +17422,7 @@
       <w:pPr>
         <w:pStyle w:val="Heading2"/>
       </w:pPr>
-      <w:bookmarkStart w:id="32" w:name="_Toc242180355"/>
+      <w:bookmarkStart w:id="32" w:name="_Toc242218164"/>
       <w:r>
         <w:t>Tailor to the room</w:t>
       </w:r>
@@ -18030,7 +18048,7 @@
         <w:pStyle w:val="Heading1"/>
         <w:pageBreakBefore/>
       </w:pPr>
-      <w:bookmarkStart w:id="33" w:name="_Toc242180356"/>
+      <w:bookmarkStart w:id="33" w:name="_Toc242218165"/>
       <w:r>
         <w:lastRenderedPageBreak/>
         <w:t>10. Safe questions</w:t>
@@ -18827,7 +18845,7 @@
         <w:pStyle w:val="Heading1"/>
         <w:pageBreakBefore/>
       </w:pPr>
-      <w:bookmarkStart w:id="34" w:name="_Toc242180357"/>
+      <w:bookmarkStart w:id="34" w:name="_Toc242218166"/>
       <w:r>
         <w:lastRenderedPageBreak/>
         <w:t>11. Demo boundaries</w:t>
@@ -19018,7 +19036,7 @@
         <w:pStyle w:val="Heading1"/>
         <w:pageBreakBefore/>
       </w:pPr>
-      <w:bookmarkStart w:id="35" w:name="_Toc242180358"/>
+      <w:bookmarkStart w:id="35" w:name="_Toc242218167"/>
       <w:r>
         <w:lastRenderedPageBreak/>
         <w:t>12. Questions and answers</w:t>
@@ -19242,7 +19260,7 @@
         <w:pStyle w:val="Heading1"/>
         <w:pageBreakBefore/>
       </w:pPr>
-      <w:bookmarkStart w:id="36" w:name="_Toc242180359"/>
+      <w:bookmarkStart w:id="36" w:name="_Toc242218168"/>
       <w:r>
         <w:lastRenderedPageBreak/>
         <w:t>Appendix A. Key figures (sample data, 15 September 2026)</w:t>
@@ -20472,7 +20490,7 @@
         <w:pStyle w:val="Heading1"/>
         <w:pageBreakBefore/>
       </w:pPr>
-      <w:bookmarkStart w:id="37" w:name="_Toc242180360"/>
+      <w:bookmarkStart w:id="37" w:name="_Toc242218169"/>
       <w:r>
         <w:lastRenderedPageBreak/>
         <w:t>Appendix B. Glossary</w:t>
@@ -21762,10 +21780,10 @@
 <file path=word/numbering.xml><?xml version="1.0" encoding="utf-8"?>
 <w:numbering xmlns:wpc="http://schemas.microsoft.com/office/word/2010/wordprocessingCanvas" xmlns:cx="http://schemas.microsoft.com/office/drawing/2014/chartex" xmlns:cx1="http://schemas.microsoft.com/office/drawing/2015/9/8/chartex" xmlns:cx2="http://schemas.microsoft.com/office/drawing/2015/10/21/chartex" xmlns:cx3="http://schemas.microsoft.com/office/drawing/2016/5/9/chartex" xmlns:cx4="http://schemas.microsoft.com/office/drawing/2016/5/10/chartex" xmlns:cx5="http://schemas.microsoft.com/office/drawing/2016/5/11/chartex" xmlns:cx6="http://schemas.microsoft.com/office/drawing/2016/5/12/chartex" xmlns:cx7="http://schemas.microsoft.com/office/drawing/2016/5/13/chartex" xmlns:cx8="http://schemas.microsoft.com/office/drawing/2016/5/14/chartex" xmlns:mc="http://schemas.openxmlformats.org/markup-compatibility/2006" xmlns:aink="http://schemas.microsoft.com/office/drawing/2016/ink" xmlns:am3d="http://schemas.microsoft.com/office/drawing/2017/model3d" xmlns:o="urn:schemas-microsoft-com:office:office" xmlns:r="http://schemas.openxmlformats.org/officeDocument/2006/relationships" xmlns:m="http://schemas.openxmlformats.org/officeDocument/2006/math" xmlns:v="urn:schemas-microsoft-com:vml" xmlns:wp14="http://schemas.microsoft.com/office/word/2010/wordprocessingDrawing" xmlns:wp="http://schemas.openxmlformats.org/drawingml/2006/wordprocessingDrawing" xmlns:w10="urn:schemas-microsoft-com:office:word" xmlns:w="http://schemas.openxmlformats.org/wordprocessingml/2006/main" xmlns:w14="http://schemas.microsoft.com/office/word/2010/wordml" xmlns:w15="http://schemas.microsoft.com/office/word/2012/wordml" xmlns:w16cex="http://schemas.microsoft.com/office/word/2018/wordml/cex" xmlns:w16cid="http://schemas.microsoft.com/office/word/2016/wordml/cid" xmlns:w16="http://schemas.microsoft.com/office/word/2018/wordml" xmlns:w16sdtdh="http://schemas.microsoft.com/office/word/2020/wordml/sdtdatahash" xmlns:w16se="http://schemas.microsoft.com/office/word/2015/wordml/symex" xmlns:wpg="http://schemas.microsoft.com/office/word/2010/wordprocessingGroup" xmlns:wpi="http://schemas.microsoft.com/office/word/2010/wordprocessingInk" xmlns:wne="http://schemas.microsoft.com/office/word/2006/wordml" xmlns:wps="http://schemas.microsoft.com/office/word/2010/wordprocessingShape" mc:Ignorable="w14 w15 w16se w16cid w16 w16cex w16sdtdh wp14">
   <w:abstractNum w:abstractNumId="0" w15:restartNumberingAfterBreak="0">
-    <w:nsid w:val="217F3889"/>
+    <w:nsid w:val="1CE77F1C"/>
     <w:multiLevelType w:val="hybridMultilevel"/>
-    <w:tmpl w:val="52D8B5D2"/>
-    <w:lvl w:ilvl="0" w:tplc="B480469A" w:tentative="1">
+    <w:tmpl w:val="5BD8DB48"/>
+    <w:lvl w:ilvl="0" w:tplc="E6980430" w:tentative="1">
       <w:start w:val="1"/>
       <w:numFmt w:val="decimal"/>
       <w:lvlText w:val="%1."/>
@@ -21774,52 +21792,52 @@
         <w:ind w:left="540" w:hanging="320"/>
       </w:pPr>
     </w:lvl>
-    <w:lvl w:ilvl="1" w:tplc="F17CDBF6">
+    <w:lvl w:ilvl="1" w:tplc="0AF0DC94">
       <w:numFmt w:val="decimal"/>
       <w:lvlText w:val=""/>
       <w:lvlJc w:val="left"/>
     </w:lvl>
-    <w:lvl w:ilvl="2" w:tplc="EF902E16">
+    <w:lvl w:ilvl="2" w:tplc="D24C54E8">
       <w:numFmt w:val="decimal"/>
       <w:lvlText w:val=""/>
       <w:lvlJc w:val="left"/>
     </w:lvl>
-    <w:lvl w:ilvl="3" w:tplc="709EFBDA">
+    <w:lvl w:ilvl="3" w:tplc="ABB26CF6">
       <w:numFmt w:val="decimal"/>
       <w:lvlText w:val=""/>
       <w:lvlJc w:val="left"/>
     </w:lvl>
-    <w:lvl w:ilvl="4" w:tplc="6B88A1EE">
+    <w:lvl w:ilvl="4" w:tplc="8D1C086A">
       <w:numFmt w:val="decimal"/>
       <w:lvlText w:val=""/>
       <w:lvlJc w:val="left"/>
     </w:lvl>
-    <w:lvl w:ilvl="5" w:tplc="94422EAA">
+    <w:lvl w:ilvl="5" w:tplc="18BE9F1C">
       <w:numFmt w:val="decimal"/>
       <w:lvlText w:val=""/>
       <w:lvlJc w:val="left"/>
     </w:lvl>
-    <w:lvl w:ilvl="6" w:tplc="8AD20176">
+    <w:lvl w:ilvl="6" w:tplc="5B845D3C">
       <w:numFmt w:val="decimal"/>
       <w:lvlText w:val=""/>
       <w:lvlJc w:val="left"/>
     </w:lvl>
-    <w:lvl w:ilvl="7" w:tplc="8ADA62F0">
+    <w:lvl w:ilvl="7" w:tplc="1C9616E6">
       <w:numFmt w:val="decimal"/>
       <w:lvlText w:val=""/>
       <w:lvlJc w:val="left"/>
     </w:lvl>
-    <w:lvl w:ilvl="8" w:tplc="EFA4F23A">
+    <w:lvl w:ilvl="8" w:tplc="FB60254C">
       <w:numFmt w:val="decimal"/>
       <w:lvlText w:val=""/>
       <w:lvlJc w:val="left"/>
     </w:lvl>
   </w:abstractNum>
   <w:abstractNum w:abstractNumId="1" w15:restartNumberingAfterBreak="0">
-    <w:nsid w:val="2B7B5511"/>
+    <w:nsid w:val="252830D5"/>
     <w:multiLevelType w:val="hybridMultilevel"/>
-    <w:tmpl w:val="66B6CB8A"/>
-    <w:lvl w:ilvl="0" w:tplc="1A76613E" w:tentative="1">
+    <w:tmpl w:val="1AE41688"/>
+    <w:lvl w:ilvl="0" w:tplc="B46626B2">
       <w:start w:val="1"/>
       <w:numFmt w:val="decimal"/>
       <w:lvlText w:val="%1."/>
@@ -21828,52 +21846,52 @@
         <w:ind w:left="540" w:hanging="320"/>
       </w:pPr>
     </w:lvl>
-    <w:lvl w:ilvl="1" w:tplc="FE3A9E60">
+    <w:lvl w:ilvl="1" w:tplc="07B02EB2">
       <w:numFmt w:val="decimal"/>
       <w:lvlText w:val=""/>
       <w:lvlJc w:val="left"/>
     </w:lvl>
-    <w:lvl w:ilvl="2" w:tplc="6D224480">
+    <w:lvl w:ilvl="2" w:tplc="AC74914A">
       <w:numFmt w:val="decimal"/>
       <w:lvlText w:val=""/>
       <w:lvlJc w:val="left"/>
     </w:lvl>
-    <w:lvl w:ilvl="3" w:tplc="7766F3C6">
+    <w:lvl w:ilvl="3" w:tplc="66A8C85E">
       <w:numFmt w:val="decimal"/>
       <w:lvlText w:val=""/>
       <w:lvlJc w:val="left"/>
     </w:lvl>
-    <w:lvl w:ilvl="4" w:tplc="7C9CFA64">
+    <w:lvl w:ilvl="4" w:tplc="3BA46258">
       <w:numFmt w:val="decimal"/>
       <w:lvlText w:val=""/>
       <w:lvlJc w:val="left"/>
     </w:lvl>
-    <w:lvl w:ilvl="5" w:tplc="86667252">
+    <w:lvl w:ilvl="5" w:tplc="58B45848">
       <w:numFmt w:val="decimal"/>
       <w:lvlText w:val=""/>
       <w:lvlJc w:val="left"/>
     </w:lvl>
-    <w:lvl w:ilvl="6" w:tplc="4B9C3026">
+    <w:lvl w:ilvl="6" w:tplc="1C94B2C6">
       <w:numFmt w:val="decimal"/>
       <w:lvlText w:val=""/>
       <w:lvlJc w:val="left"/>
     </w:lvl>
-    <w:lvl w:ilvl="7" w:tplc="7AD6FABE">
+    <w:lvl w:ilvl="7" w:tplc="C96CEF68">
       <w:numFmt w:val="decimal"/>
       <w:lvlText w:val=""/>
       <w:lvlJc w:val="left"/>
     </w:lvl>
-    <w:lvl w:ilvl="8" w:tplc="1194AB34">
+    <w:lvl w:ilvl="8" w:tplc="1B6695C6">
       <w:numFmt w:val="decimal"/>
       <w:lvlText w:val=""/>
       <w:lvlJc w:val="left"/>
     </w:lvl>
   </w:abstractNum>
   <w:abstractNum w:abstractNumId="2" w15:restartNumberingAfterBreak="0">
-    <w:nsid w:val="41C26BB1"/>
+    <w:nsid w:val="29804FC2"/>
     <w:multiLevelType w:val="hybridMultilevel"/>
-    <w:tmpl w:val="431875EA"/>
-    <w:lvl w:ilvl="0" w:tplc="18E8BD38">
+    <w:tmpl w:val="1362DC04"/>
+    <w:lvl w:ilvl="0" w:tplc="06B6EB24">
       <w:start w:val="1"/>
       <w:numFmt w:val="bullet"/>
       <w:lvlText w:val="•"/>
@@ -21882,7 +21900,7 @@
         <w:ind w:left="540" w:hanging="270"/>
       </w:pPr>
     </w:lvl>
-    <w:lvl w:ilvl="1" w:tplc="90324BAC" w:tentative="1">
+    <w:lvl w:ilvl="1" w:tplc="4CDADBCE" w:tentative="1">
       <w:start w:val="1"/>
       <w:numFmt w:val="bullet"/>
       <w:lvlText w:val="–"/>
@@ -21891,101 +21909,47 @@
         <w:ind w:left="1080" w:hanging="270"/>
       </w:pPr>
     </w:lvl>
-    <w:lvl w:ilvl="2" w:tplc="5E600A64">
+    <w:lvl w:ilvl="2" w:tplc="FA9E190A">
       <w:numFmt w:val="decimal"/>
       <w:lvlText w:val=""/>
       <w:lvlJc w:val="left"/>
     </w:lvl>
-    <w:lvl w:ilvl="3" w:tplc="F5BCC97C">
+    <w:lvl w:ilvl="3" w:tplc="1DAEEC76">
       <w:numFmt w:val="decimal"/>
       <w:lvlText w:val=""/>
       <w:lvlJc w:val="left"/>
     </w:lvl>
-    <w:lvl w:ilvl="4" w:tplc="4502C5F6">
+    <w:lvl w:ilvl="4" w:tplc="F7D41FCC">
       <w:numFmt w:val="decimal"/>
       <w:lvlText w:val=""/>
       <w:lvlJc w:val="left"/>
     </w:lvl>
-    <w:lvl w:ilvl="5" w:tplc="E19EE590">
+    <w:lvl w:ilvl="5" w:tplc="2796103C">
       <w:numFmt w:val="decimal"/>
       <w:lvlText w:val=""/>
       <w:lvlJc w:val="left"/>
     </w:lvl>
-    <w:lvl w:ilvl="6" w:tplc="57001494">
+    <w:lvl w:ilvl="6" w:tplc="1FCC3988">
       <w:numFmt w:val="decimal"/>
       <w:lvlText w:val=""/>
       <w:lvlJc w:val="left"/>
     </w:lvl>
-    <w:lvl w:ilvl="7" w:tplc="BB34505E">
+    <w:lvl w:ilvl="7" w:tplc="760C4A1C">
       <w:numFmt w:val="decimal"/>
       <w:lvlText w:val=""/>
       <w:lvlJc w:val="left"/>
     </w:lvl>
-    <w:lvl w:ilvl="8" w:tplc="945CFAF0">
+    <w:lvl w:ilvl="8" w:tplc="66961BE6">
       <w:numFmt w:val="decimal"/>
       <w:lvlText w:val=""/>
       <w:lvlJc w:val="left"/>
     </w:lvl>
   </w:abstractNum>
   <w:abstractNum w:abstractNumId="3" w15:restartNumberingAfterBreak="0">
-    <w:nsid w:val="493F2C0D"/>
+    <w:nsid w:val="45382B16"/>
     <w:multiLevelType w:val="hybridMultilevel"/>
-    <w:tmpl w:val="5344CADC"/>
-    <w:lvl w:ilvl="0" w:tplc="FB28B422">
-      <w:start w:val="1"/>
-      <w:numFmt w:val="decimal"/>
-      <w:lvlText w:val="%1."/>
-      <w:lvlJc w:val="left"/>
-      <w:pPr>
-        <w:ind w:left="540" w:hanging="320"/>
-      </w:pPr>
-    </w:lvl>
-    <w:lvl w:ilvl="1" w:tplc="1A42CEFC">
-      <w:numFmt w:val="decimal"/>
-      <w:lvlText w:val=""/>
-      <w:lvlJc w:val="left"/>
-    </w:lvl>
-    <w:lvl w:ilvl="2" w:tplc="472A8F82">
-      <w:numFmt w:val="decimal"/>
-      <w:lvlText w:val=""/>
-      <w:lvlJc w:val="left"/>
-    </w:lvl>
-    <w:lvl w:ilvl="3" w:tplc="0A0CCC56">
-      <w:numFmt w:val="decimal"/>
-      <w:lvlText w:val=""/>
-      <w:lvlJc w:val="left"/>
-    </w:lvl>
-    <w:lvl w:ilvl="4" w:tplc="A8EE548A">
-      <w:numFmt w:val="decimal"/>
-      <w:lvlText w:val=""/>
-      <w:lvlJc w:val="left"/>
-    </w:lvl>
-    <w:lvl w:ilvl="5" w:tplc="BB52D954">
-      <w:numFmt w:val="decimal"/>
-      <w:lvlText w:val=""/>
-      <w:lvlJc w:val="left"/>
-    </w:lvl>
-    <w:lvl w:ilvl="6" w:tplc="EEF6EC40">
-      <w:numFmt w:val="decimal"/>
-      <w:lvlText w:val=""/>
-      <w:lvlJc w:val="left"/>
-    </w:lvl>
-    <w:lvl w:ilvl="7" w:tplc="FF481472">
-      <w:numFmt w:val="decimal"/>
-      <w:lvlText w:val=""/>
-      <w:lvlJc w:val="left"/>
-    </w:lvl>
-    <w:lvl w:ilvl="8" w:tplc="C2BAEEDE">
-      <w:numFmt w:val="decimal"/>
-      <w:lvlText w:val=""/>
-      <w:lvlJc w:val="left"/>
-    </w:lvl>
-  </w:abstractNum>
-  <w:abstractNum w:abstractNumId="4" w15:restartNumberingAfterBreak="0">
-    <w:nsid w:val="7F361213"/>
-    <w:multiLevelType w:val="hybridMultilevel"/>
-    <w:tmpl w:val="47F030CA"/>
-    <w:lvl w:ilvl="0" w:tplc="0E6CA5D0" w:tentative="1">
+    <w:tmpl w:val="384AC316"/>
+    <w:lvl w:ilvl="0" w:tplc="C2E438BE" w:tentative="1">
       <w:start w:val="1"/>
       <w:numFmt w:val="bullet"/>
       <w:lvlText w:val="●"/>
@@ -21994,7 +21958,7 @@
         <w:ind w:left="720" w:hanging="360"/>
       </w:pPr>
     </w:lvl>
-    <w:lvl w:ilvl="1" w:tplc="B308C31E" w:tentative="1">
+    <w:lvl w:ilvl="1" w:tplc="4FEA57FA" w:tentative="1">
       <w:start w:val="1"/>
       <w:numFmt w:val="bullet"/>
       <w:lvlText w:val="○"/>
@@ -22003,7 +21967,7 @@
         <w:ind w:left="1440" w:hanging="360"/>
       </w:pPr>
     </w:lvl>
-    <w:lvl w:ilvl="2" w:tplc="060E9856" w:tentative="1">
+    <w:lvl w:ilvl="2" w:tplc="96C699F8" w:tentative="1">
       <w:start w:val="1"/>
       <w:numFmt w:val="bullet"/>
       <w:lvlText w:val="■"/>
@@ -22012,7 +21976,7 @@
         <w:ind w:left="2160" w:hanging="360"/>
       </w:pPr>
     </w:lvl>
-    <w:lvl w:ilvl="3" w:tplc="C680C718" w:tentative="1">
+    <w:lvl w:ilvl="3" w:tplc="524EFFFC" w:tentative="1">
       <w:start w:val="1"/>
       <w:numFmt w:val="bullet"/>
       <w:lvlText w:val="●"/>
@@ -22021,7 +21985,7 @@
         <w:ind w:left="2880" w:hanging="360"/>
       </w:pPr>
     </w:lvl>
-    <w:lvl w:ilvl="4" w:tplc="9136631E" w:tentative="1">
+    <w:lvl w:ilvl="4" w:tplc="1280F85E" w:tentative="1">
       <w:start w:val="1"/>
       <w:numFmt w:val="bullet"/>
       <w:lvlText w:val="○"/>
@@ -22030,7 +21994,7 @@
         <w:ind w:left="3600" w:hanging="360"/>
       </w:pPr>
     </w:lvl>
-    <w:lvl w:ilvl="5" w:tplc="F716D28E" w:tentative="1">
+    <w:lvl w:ilvl="5" w:tplc="E132D59A" w:tentative="1">
       <w:start w:val="1"/>
       <w:numFmt w:val="bullet"/>
       <w:lvlText w:val="■"/>
@@ -22039,7 +22003,7 @@
         <w:ind w:left="4320" w:hanging="360"/>
       </w:pPr>
     </w:lvl>
-    <w:lvl w:ilvl="6" w:tplc="07B8731C" w:tentative="1">
+    <w:lvl w:ilvl="6" w:tplc="025E14E6" w:tentative="1">
       <w:start w:val="1"/>
       <w:numFmt w:val="bullet"/>
       <w:lvlText w:val="●"/>
@@ -22048,7 +22012,7 @@
         <w:ind w:left="5040" w:hanging="360"/>
       </w:pPr>
     </w:lvl>
-    <w:lvl w:ilvl="7" w:tplc="9AFC640C" w:tentative="1">
+    <w:lvl w:ilvl="7" w:tplc="31A26B20" w:tentative="1">
       <w:start w:val="1"/>
       <w:numFmt w:val="bullet"/>
       <w:lvlText w:val="●"/>
@@ -22057,7 +22021,7 @@
         <w:ind w:left="5760" w:hanging="360"/>
       </w:pPr>
     </w:lvl>
-    <w:lvl w:ilvl="8" w:tplc="AB602C1C" w:tentative="1">
+    <w:lvl w:ilvl="8" w:tplc="22C444BC" w:tentative="1">
       <w:start w:val="1"/>
       <w:numFmt w:val="bullet"/>
       <w:lvlText w:val="●"/>
@@ -22067,8 +22031,62 @@
       </w:pPr>
     </w:lvl>
   </w:abstractNum>
+  <w:abstractNum w:abstractNumId="4" w15:restartNumberingAfterBreak="0">
+    <w:nsid w:val="51C52C58"/>
+    <w:multiLevelType w:val="hybridMultilevel"/>
+    <w:tmpl w:val="C3DEA5F6"/>
+    <w:lvl w:ilvl="0" w:tplc="59ACB6AA" w:tentative="1">
+      <w:start w:val="1"/>
+      <w:numFmt w:val="decimal"/>
+      <w:lvlText w:val="%1."/>
+      <w:lvlJc w:val="left"/>
+      <w:pPr>
+        <w:ind w:left="540" w:hanging="320"/>
+      </w:pPr>
+    </w:lvl>
+    <w:lvl w:ilvl="1" w:tplc="11AEC5B0">
+      <w:numFmt w:val="decimal"/>
+      <w:lvlText w:val=""/>
+      <w:lvlJc w:val="left"/>
+    </w:lvl>
+    <w:lvl w:ilvl="2" w:tplc="973070C4">
+      <w:numFmt w:val="decimal"/>
+      <w:lvlText w:val=""/>
+      <w:lvlJc w:val="left"/>
+    </w:lvl>
+    <w:lvl w:ilvl="3" w:tplc="77F20C0A">
+      <w:numFmt w:val="decimal"/>
+      <w:lvlText w:val=""/>
+      <w:lvlJc w:val="left"/>
+    </w:lvl>
+    <w:lvl w:ilvl="4" w:tplc="2530FA2A">
+      <w:numFmt w:val="decimal"/>
+      <w:lvlText w:val=""/>
+      <w:lvlJc w:val="left"/>
+    </w:lvl>
+    <w:lvl w:ilvl="5" w:tplc="BD12FF06">
+      <w:numFmt w:val="decimal"/>
+      <w:lvlText w:val=""/>
+      <w:lvlJc w:val="left"/>
+    </w:lvl>
+    <w:lvl w:ilvl="6" w:tplc="4274B8B8">
+      <w:numFmt w:val="decimal"/>
+      <w:lvlText w:val=""/>
+      <w:lvlJc w:val="left"/>
+    </w:lvl>
+    <w:lvl w:ilvl="7" w:tplc="0D3AD20A">
+      <w:numFmt w:val="decimal"/>
+      <w:lvlText w:val=""/>
+      <w:lvlJc w:val="left"/>
+    </w:lvl>
+    <w:lvl w:ilvl="8" w:tplc="3EB648A4">
+      <w:numFmt w:val="decimal"/>
+      <w:lvlText w:val=""/>
+      <w:lvlJc w:val="left"/>
+    </w:lvl>
+  </w:abstractNum>
   <w:num w:numId="1">
-    <w:abstractNumId w:val="4"/>
+    <w:abstractNumId w:val="3"/>
     <w:lvlOverride w:ilvl="0">
       <w:startOverride w:val="1"/>
     </w:lvlOverride>
@@ -22080,7 +22098,7 @@
     </w:lvlOverride>
   </w:num>
   <w:num w:numId="3">
-    <w:abstractNumId w:val="3"/>
+    <w:abstractNumId w:val="1"/>
     <w:lvlOverride w:ilvl="0">
       <w:startOverride w:val="1"/>
     </w:lvlOverride>
@@ -22721,7 +22739,7 @@
     <w:autoRedefine/>
     <w:uiPriority w:val="39"/>
     <w:unhideWhenUsed/>
-    <w:rsid w:val="00E162B7"/>
+    <w:rsid w:val="008E0031"/>
     <w:pPr>
       <w:spacing w:after="100"/>
     </w:pPr>
@@ -22733,7 +22751,7 @@
     <w:autoRedefine/>
     <w:uiPriority w:val="39"/>
     <w:unhideWhenUsed/>
-    <w:rsid w:val="00E162B7"/>
+    <w:rsid w:val="008E0031"/>
     <w:pPr>
       <w:spacing w:after="100"/>
       <w:ind w:left="210"/>

</xml_diff>